<commit_message>
Math T5 : reprendre les images de scènes du manuel de référence
Co-authored-by: arena-agent <297053741+arena-agent@users.noreply.github.com>
</commit_message>
<xml_diff>
--- a/manuel-math-t5/Manuel_Mathematiques_T5_UNITE6.docx
+++ b/manuel-math-t5/Manuel_Mathematiques_T5_UNITE6.docx
@@ -666,70 +666,13 @@
     </w:p>
     <w:p>
       <w:pPr>
-        <w:spacing w:after="150" w:before="200"/>
-        <w:jc w:val="left"/>
-      </w:pPr>
-      <w:r>
-        <w:rPr>
-          <w:rFonts w:ascii="Times New Roman" w:cs="Times New Roman" w:eastAsia="Times New Roman" w:hAnsi="Times New Roman"/>
-          <w:b/>
-          <w:bCs/>
-          <w:i w:val="false"/>
-          <w:iCs w:val="false"/>
-          <w:color w:val="2E7D32"/>
-          <w:sz w:val="28"/>
-          <w:szCs w:val="28"/>
-        </w:rPr>
-        <w:t xml:space="preserve">Questions d’enquête et hypothèses</w:t>
-      </w:r>
-    </w:p>
-    <w:p>
-      <w:pPr>
-        <w:spacing w:after="110" w:line="300"/>
-        <w:jc w:val="both"/>
-      </w:pPr>
-      <w:r>
-        <w:rPr>
-          <w:rFonts w:ascii="Times New Roman" w:cs="Times New Roman" w:eastAsia="Times New Roman" w:hAnsi="Times New Roman"/>
-          <w:b w:val="false"/>
-          <w:bCs w:val="false"/>
-          <w:i w:val="false"/>
-          <w:iCs w:val="false"/>
-          <w:color w:val="000000"/>
-          <w:sz w:val="24"/>
-          <w:szCs w:val="24"/>
-        </w:rPr>
-        <w:t xml:space="preserve">Une enquête est une démarche organisée pour répondre à une question en recueillant des informations. La question d’enquête est la question précise à laquelle on veut répondre. L’hypothèse est la réponse que l’on prévoit avant de collecter les données.</w:t>
-      </w:r>
-    </w:p>
-    <w:p>
-      <w:pPr>
-        <w:spacing w:after="110" w:line="300"/>
-        <w:jc w:val="both"/>
-      </w:pPr>
-      <w:r>
-        <w:rPr>
-          <w:rFonts w:ascii="Times New Roman" w:cs="Times New Roman" w:eastAsia="Times New Roman" w:hAnsi="Times New Roman"/>
-          <w:b w:val="false"/>
-          <w:bCs w:val="false"/>
-          <w:i/>
-          <w:iCs/>
-          <w:color w:val="1F4E79"/>
-          <w:sz w:val="24"/>
-          <w:szCs w:val="24"/>
-        </w:rPr>
-        <w:t xml:space="preserve">au lieu de deviner, on demande ; et avant de demander, on écrit son pari — l’enquête dira s’il était bon.</w:t>
-      </w:r>
-    </w:p>
-    <w:p>
-      <w:pPr>
-        <w:spacing w:after="120" w:before="120"/>
+        <w:spacing w:after="120" w:before="100"/>
         <w:jc w:val="center"/>
       </w:pPr>
       <w:r>
         <w:drawing>
           <wp:inline distT="0" distB="0" distL="0" distR="0">
-            <wp:extent cx="4762500" cy="1590675"/>
+            <wp:extent cx="4476750" cy="2438400"/>
             <wp:effectExtent t="0" r="0" b="0" l="0"/>
             <wp:docPr id="1" name=""/>
             <wp:cNvGraphicFramePr>
@@ -754,7 +697,7 @@
                   <pic:spPr bwMode="auto">
                     <a:xfrm>
                       <a:off x="0" y="0"/>
-                      <a:ext cx="4762500" cy="1590675"/>
+                      <a:ext cx="4476750" cy="2438400"/>
                     </a:xfrm>
                     <a:prstGeom prst="rect">
                       <a:avLst/>
@@ -769,159 +712,6 @@
     </w:p>
     <w:p>
       <w:pPr>
-        <w:spacing w:after="130" w:before="100" w:line="300"/>
-        <w:jc w:val="both"/>
-      </w:pPr>
-      <w:r>
-        <w:rPr>
-          <w:rFonts w:ascii="Times New Roman" w:cs="Times New Roman" w:eastAsia="Times New Roman" w:hAnsi="Times New Roman"/>
-          <w:b w:val="false"/>
-          <w:bCs w:val="false"/>
-          <w:i/>
-          <w:iCs/>
-          <w:color w:val="000000"/>
-          <w:sz w:val="24"/>
-          <w:szCs w:val="24"/>
-          <w:u w:val="single"/>
-        </w:rPr>
-        <w:t xml:space="preserve">Exemple :</w:t>
-      </w:r>
-      <w:r>
-        <w:rPr>
-          <w:rFonts w:ascii="Times New Roman" w:cs="Times New Roman" w:eastAsia="Times New Roman" w:hAnsi="Times New Roman"/>
-          <w:b w:val="false"/>
-          <w:bCs w:val="false"/>
-          <w:i w:val="false"/>
-          <w:iCs w:val="false"/>
-          <w:color w:val="000000"/>
-          <w:sz w:val="24"/>
-          <w:szCs w:val="24"/>
-        </w:rPr>
-        <w:t xml:space="preserve"> Question : « quel jour y a-t-il le plus d’absents ? » ; hypothèse : « le lundi » ; collecte : le registre d’appel de la semaine.</w:t>
-      </w:r>
-    </w:p>
-    <w:p>
-      <w:pPr>
-        <w:spacing w:after="55" w:line="300"/>
-        <w:ind w:left="260"/>
-        <w:jc w:val="both"/>
-      </w:pPr>
-      <w:r>
-        <w:rPr>
-          <w:rFonts w:ascii="Times New Roman" w:cs="Times New Roman" w:eastAsia="Times New Roman" w:hAnsi="Times New Roman"/>
-          <w:b w:val="false"/>
-          <w:bCs w:val="false"/>
-          <w:i w:val="false"/>
-          <w:iCs w:val="false"/>
-          <w:color w:val="000000"/>
-          <w:sz w:val="24"/>
-          <w:szCs w:val="24"/>
-        </w:rPr>
-        <w:t xml:space="preserve">1. Formuler une question précise, sur un groupe défini, aux réponses comptables.</w:t>
-      </w:r>
-    </w:p>
-    <w:p>
-      <w:pPr>
-        <w:spacing w:after="55" w:line="300"/>
-        <w:ind w:left="260"/>
-        <w:jc w:val="both"/>
-      </w:pPr>
-      <w:r>
-        <w:rPr>
-          <w:rFonts w:ascii="Times New Roman" w:cs="Times New Roman" w:eastAsia="Times New Roman" w:hAnsi="Times New Roman"/>
-          <w:b w:val="false"/>
-          <w:bCs w:val="false"/>
-          <w:i w:val="false"/>
-          <w:iCs w:val="false"/>
-          <w:color w:val="000000"/>
-          <w:sz w:val="24"/>
-          <w:szCs w:val="24"/>
-        </w:rPr>
-        <w:t xml:space="preserve">2. Écrire l’hypothèse : la réponse que l’on prévoit.</w:t>
-      </w:r>
-    </w:p>
-    <w:p>
-      <w:pPr>
-        <w:spacing w:after="55" w:line="300"/>
-        <w:ind w:left="260"/>
-        <w:jc w:val="both"/>
-      </w:pPr>
-      <w:r>
-        <w:rPr>
-          <w:rFonts w:ascii="Times New Roman" w:cs="Times New Roman" w:eastAsia="Times New Roman" w:hAnsi="Times New Roman"/>
-          <w:b w:val="false"/>
-          <w:bCs w:val="false"/>
-          <w:i w:val="false"/>
-          <w:iCs w:val="false"/>
-          <w:color w:val="000000"/>
-          <w:sz w:val="24"/>
-          <w:szCs w:val="24"/>
-        </w:rPr>
-        <w:t xml:space="preserve">3. Préparer la collecte : qui interroger, quelles réponses possibles, comment noter.</w:t>
-      </w:r>
-    </w:p>
-    <w:p>
-      <w:pPr>
-        <w:shd w:fill="E8F5E9" w:val="clear"/>
-        <w:spacing w:after="110" w:line="300"/>
-        <w:jc w:val="both"/>
-      </w:pPr>
-      <w:r>
-        <w:rPr>
-          <w:rFonts w:ascii="Times New Roman" w:cs="Times New Roman" w:eastAsia="Times New Roman" w:hAnsi="Times New Roman"/>
-          <w:b/>
-          <w:bCs/>
-          <w:i w:val="false"/>
-          <w:iCs w:val="false"/>
-          <w:color w:val="000000"/>
-          <w:sz w:val="24"/>
-          <w:szCs w:val="24"/>
-        </w:rPr>
-        <w:t xml:space="preserve">enquête = question précise + hypothèse + collecte + réponse ; la question définit le groupe interrogé et des réponses comptables ; l’hypothèse est le pari à vérifier.</w:t>
-      </w:r>
-    </w:p>
-    <w:p>
-      <w:pPr>
-        <w:shd w:fill="E3F2FD" w:val="clear"/>
-        <w:spacing w:after="110" w:line="300"/>
-        <w:jc w:val="both"/>
-      </w:pPr>
-      <w:r>
-        <w:rPr>
-          <w:rFonts w:ascii="Times New Roman" w:cs="Times New Roman" w:eastAsia="Times New Roman" w:hAnsi="Times New Roman"/>
-          <w:b w:val="false"/>
-          <w:bCs w:val="false"/>
-          <w:i w:val="false"/>
-          <w:iCs w:val="false"/>
-          <w:color w:val="1F4E79"/>
-          <w:sz w:val="24"/>
-          <w:szCs w:val="24"/>
-        </w:rPr>
-        <w:t xml:space="preserve">Le savais-tu ? La plus grande enquête de Madagascar est le recensement général de la population : en 2018, des milliers d’agents ont visité une à une toutes les maisons du pays pour compter plus de 25 millions d’habitants.</w:t>
-      </w:r>
-    </w:p>
-    <w:p>
-      <w:pPr>
-        <w:shd w:fill="FFF8E1" w:val="clear"/>
-        <w:spacing w:after="110" w:line="300"/>
-        <w:jc w:val="both"/>
-      </w:pPr>
-      <w:r>
-        <w:rPr>
-          <w:rFonts w:ascii="Times New Roman" w:cs="Times New Roman" w:eastAsia="Times New Roman" w:hAnsi="Times New Roman"/>
-          <w:b w:val="false"/>
-          <w:bCs w:val="false"/>
-          <w:i w:val="false"/>
-          <w:iCs w:val="false"/>
-          <w:color w:val="000000"/>
-          <w:sz w:val="24"/>
-          <w:szCs w:val="24"/>
-        </w:rPr>
-        <w:t xml:space="preserve">Attention : Poser une question vague : « le sport, c’est important ? ». Chacun comprend autre chose, les réponses ne se comptent pas, l’enquête ne conclut rien. La question doit appeler des réponses précises et dénombrables.</w:t>
-      </w:r>
-    </w:p>
-    <w:p>
-      <w:pPr>
         <w:spacing w:after="150" w:before="200"/>
         <w:jc w:val="left"/>
       </w:pPr>
@@ -936,7 +726,7 @@
           <w:sz w:val="28"/>
           <w:szCs w:val="28"/>
         </w:rPr>
-        <w:t xml:space="preserve">EXERCICE</w:t>
+        <w:t xml:space="preserve">Questions d’enquête et hypothèses</w:t>
       </w:r>
     </w:p>
     <w:p>
@@ -955,371 +745,7 @@
           <w:sz w:val="24"/>
           <w:szCs w:val="24"/>
         </w:rPr>
-        <w:t xml:space="preserve">1. Bonnes ou mauvaises questions d’enquête ? Justifie. a) « Quel est le fruit préféré des élèves de la classe ? » b) « Les mangues, c’est bien ? » d) « Combien de frères et sœurs a chaque élève de la classe ? » e) « Quel jour de la semaine y a-t-il le plus d’absents dans la classe ? »</w:t>
-      </w:r>
-    </w:p>
-    <w:p>
-      <w:pPr>
-        <w:spacing w:after="110" w:line="300"/>
-        <w:jc w:val="both"/>
-      </w:pPr>
-      <w:r>
-        <w:rPr>
-          <w:rFonts w:ascii="Times New Roman" w:cs="Times New Roman" w:eastAsia="Times New Roman" w:hAnsi="Times New Roman"/>
-          <w:b w:val="false"/>
-          <w:bCs w:val="false"/>
-          <w:i w:val="false"/>
-          <w:iCs w:val="false"/>
-          <w:color w:val="000000"/>
-          <w:sz w:val="24"/>
-          <w:szCs w:val="24"/>
-        </w:rPr>
-        <w:t xml:space="preserve">2. Pour la question « comment les élèves viennent-ils à l’école ? » : a) propose une hypothèse. b) Qui faut-il interroger ? d) Prévois quatre réponses possibles. e) Combien de fois interroger chaque élève ?</w:t>
-      </w:r>
-    </w:p>
-    <w:p>
-      <w:pPr>
-        <w:spacing w:after="110" w:line="300"/>
-        <w:jc w:val="both"/>
-      </w:pPr>
-      <w:r>
-        <w:rPr>
-          <w:rFonts w:ascii="Times New Roman" w:cs="Times New Roman" w:eastAsia="Times New Roman" w:hAnsi="Times New Roman"/>
-          <w:b w:val="false"/>
-          <w:bCs w:val="false"/>
-          <w:i w:val="false"/>
-          <w:iCs w:val="false"/>
-          <w:color w:val="000000"/>
-          <w:sz w:val="24"/>
-          <w:szCs w:val="24"/>
-        </w:rPr>
-        <w:t xml:space="preserve">3. Invente ta propre enquête : a) écris une question précise ; b) écris ton hypothèse ; d) indique le groupe à interroger ; e) explique comment les données diront si ton hypothèse était bonne.</w:t>
-      </w:r>
-    </w:p>
-    <w:p>
-      <w:pPr>
-        <w:spacing w:after="110" w:line="300"/>
-        <w:jc w:val="both"/>
-      </w:pPr>
-      <w:r>
-        <w:rPr>
-          <w:rFonts w:ascii="Times New Roman" w:cs="Times New Roman" w:eastAsia="Times New Roman" w:hAnsi="Times New Roman"/>
-          <w:b w:val="false"/>
-          <w:bCs w:val="false"/>
-          <w:i w:val="false"/>
-          <w:iCs w:val="false"/>
-          <w:color w:val="000000"/>
-          <w:sz w:val="24"/>
-          <w:szCs w:val="24"/>
-        </w:rPr>
-        <w:t xml:space="preserve">4. Vola veut savoir quel sport préfèrent les élèves de son école. a) Écris la question d’enquête. b) Propose quatre réponses possibles. d) Qui faut-il interroger ? e) Propose une hypothèse à vérifier.</w:t>
-      </w:r>
-    </w:p>
-    <w:p>
-      <w:pPr>
-        <w:spacing w:after="110" w:line="300"/>
-        <w:jc w:val="both"/>
-      </w:pPr>
-      <w:r>
-        <w:rPr>
-          <w:rFonts w:ascii="Times New Roman" w:cs="Times New Roman" w:eastAsia="Times New Roman" w:hAnsi="Times New Roman"/>
-          <w:b w:val="false"/>
-          <w:bCs w:val="false"/>
-          <w:i w:val="false"/>
-          <w:iCs w:val="false"/>
-          <w:color w:val="000000"/>
-          <w:sz w:val="24"/>
-          <w:szCs w:val="24"/>
-        </w:rPr>
-        <w:t xml:space="preserve">5. Rasoa, vendeuse de fruits au marché, fait un sondage en questionnant ses clients. a) Cite deux autres façons de réaliser un sondage. b) Comment doit-elle choisir les personnes à interroger ? d) Pourquoi ce choix au hasard est-il important ? e) Si elle n’interrogeait que les enfants, que se passerait-il ?</w:t>
-      </w:r>
-    </w:p>
-    <w:p>
-      <w:pPr>
-        <w:spacing w:after="110" w:line="300"/>
-        <w:jc w:val="both"/>
-      </w:pPr>
-      <w:r>
-        <w:rPr>
-          <w:rFonts w:ascii="Times New Roman" w:cs="Times New Roman" w:eastAsia="Times New Roman" w:hAnsi="Times New Roman"/>
-          <w:b w:val="false"/>
-          <w:bCs w:val="false"/>
-          <w:i w:val="false"/>
-          <w:iCs w:val="false"/>
-          <w:color w:val="000000"/>
-          <w:sz w:val="24"/>
-          <w:szCs w:val="24"/>
-        </w:rPr>
-        <w:t xml:space="preserve">6. Défi CEPE — Une école de 600 élèves veut connaître leur moyen de transport, mais ne peut en interroger que 50. a) Faut-il interroger les élèves d’une seule classe ? Pourquoi ? b) Propose une bonne façon de choisir les 50 élèves. d) Écris la question d’enquête. e) Propose les réponses à cocher.</w:t>
-      </w:r>
-    </w:p>
-    <w:p>
-      <w:pPr>
-        <w:spacing w:after="150" w:before="200"/>
-        <w:jc w:val="left"/>
-      </w:pPr>
-      <w:r>
-        <w:rPr>
-          <w:rFonts w:ascii="Times New Roman" w:cs="Times New Roman" w:eastAsia="Times New Roman" w:hAnsi="Times New Roman"/>
-          <w:b/>
-          <w:bCs/>
-          <w:i w:val="false"/>
-          <w:iCs w:val="false"/>
-          <w:color w:val="2E7D32"/>
-          <w:sz w:val="28"/>
-          <w:szCs w:val="28"/>
-        </w:rPr>
-        <w:t xml:space="preserve">Correction</w:t>
-      </w:r>
-    </w:p>
-    <w:p>
-      <w:pPr>
-        <w:spacing w:after="80"/>
-      </w:pPr>
-      <w:r>
-        <w:rPr>
-          <w:rFonts w:ascii="Times New Roman" w:cs="Times New Roman" w:eastAsia="Times New Roman" w:hAnsi="Times New Roman"/>
-          <w:b/>
-          <w:bCs/>
-          <w:i w:val="false"/>
-          <w:iCs w:val="false"/>
-          <w:color w:val="C2185B"/>
-          <w:sz w:val="24"/>
-          <w:szCs w:val="24"/>
-        </w:rPr>
-        <w:t xml:space="preserve">1. </w:t>
-      </w:r>
-      <w:r>
-        <w:rPr>
-          <w:rFonts w:ascii="Times New Roman" w:cs="Times New Roman" w:eastAsia="Times New Roman" w:hAnsi="Times New Roman"/>
-          <w:b w:val="false"/>
-          <w:bCs w:val="false"/>
-          <w:i w:val="false"/>
-          <w:iCs w:val="false"/>
-          <w:color w:val="000000"/>
-          <w:sz w:val="24"/>
-          <w:szCs w:val="24"/>
-        </w:rPr>
-        <w:t xml:space="preserve">a) bonne : précise, groupe défini, réponses comptables ; b) mauvaise : vague, chacun comprend autre chose ; d) bonne : la réponse de chacun est un nombre ; e) bonne : il suffit de compter les absents jour par jour.</w:t>
-      </w:r>
-    </w:p>
-    <w:p>
-      <w:pPr>
-        <w:spacing w:after="80"/>
-      </w:pPr>
-      <w:r>
-        <w:rPr>
-          <w:rFonts w:ascii="Times New Roman" w:cs="Times New Roman" w:eastAsia="Times New Roman" w:hAnsi="Times New Roman"/>
-          <w:b/>
-          <w:bCs/>
-          <w:i w:val="false"/>
-          <w:iCs w:val="false"/>
-          <w:color w:val="C2185B"/>
-          <w:sz w:val="24"/>
-          <w:szCs w:val="24"/>
-        </w:rPr>
-        <w:t xml:space="preserve">2. </w:t>
-      </w:r>
-      <w:r>
-        <w:rPr>
-          <w:rFonts w:ascii="Times New Roman" w:cs="Times New Roman" w:eastAsia="Times New Roman" w:hAnsi="Times New Roman"/>
-          <w:b w:val="false"/>
-          <w:bCs w:val="false"/>
-          <w:i w:val="false"/>
-          <w:iCs w:val="false"/>
-          <w:color w:val="000000"/>
-          <w:sz w:val="24"/>
-          <w:szCs w:val="24"/>
-        </w:rPr>
-        <w:t xml:space="preserve">a) par exemple « la plupart viennent à pied » ; b) tous les élèves de la classe ; d) à pied, à vélo, en taxi-be, en charrette ; e) une seule fois — sinon les effectifs sont faussés.</w:t>
-      </w:r>
-    </w:p>
-    <w:p>
-      <w:pPr>
-        <w:spacing w:after="80"/>
-      </w:pPr>
-      <w:r>
-        <w:rPr>
-          <w:rFonts w:ascii="Times New Roman" w:cs="Times New Roman" w:eastAsia="Times New Roman" w:hAnsi="Times New Roman"/>
-          <w:b/>
-          <w:bCs/>
-          <w:i w:val="false"/>
-          <w:iCs w:val="false"/>
-          <w:color w:val="C2185B"/>
-          <w:sz w:val="24"/>
-          <w:szCs w:val="24"/>
-        </w:rPr>
-        <w:t xml:space="preserve">3. </w:t>
-      </w:r>
-      <w:r>
-        <w:rPr>
-          <w:rFonts w:ascii="Times New Roman" w:cs="Times New Roman" w:eastAsia="Times New Roman" w:hAnsi="Times New Roman"/>
-          <w:b w:val="false"/>
-          <w:bCs w:val="false"/>
-          <w:i w:val="false"/>
-          <w:iCs w:val="false"/>
-          <w:color w:val="000000"/>
-          <w:sz w:val="24"/>
-          <w:szCs w:val="24"/>
-        </w:rPr>
-        <w:t xml:space="preserve">a) question précise sur un groupe défini ; b) une prédiction claire ; d) par exemple les élèves de la classe ; e) on comptera les réponses : si la réponse la plus fréquente est celle prédite, l’hypothèse était bonne.</w:t>
-      </w:r>
-    </w:p>
-    <w:p>
-      <w:pPr>
-        <w:spacing w:after="80"/>
-      </w:pPr>
-      <w:r>
-        <w:rPr>
-          <w:rFonts w:ascii="Times New Roman" w:cs="Times New Roman" w:eastAsia="Times New Roman" w:hAnsi="Times New Roman"/>
-          <w:b/>
-          <w:bCs/>
-          <w:i w:val="false"/>
-          <w:iCs w:val="false"/>
-          <w:color w:val="C2185B"/>
-          <w:sz w:val="24"/>
-          <w:szCs w:val="24"/>
-        </w:rPr>
-        <w:t xml:space="preserve">4. </w:t>
-      </w:r>
-      <w:r>
-        <w:rPr>
-          <w:rFonts w:ascii="Times New Roman" w:cs="Times New Roman" w:eastAsia="Times New Roman" w:hAnsi="Times New Roman"/>
-          <w:b w:val="false"/>
-          <w:bCs w:val="false"/>
-          <w:i w:val="false"/>
-          <w:iCs w:val="false"/>
-          <w:color w:val="000000"/>
-          <w:sz w:val="24"/>
-          <w:szCs w:val="24"/>
-        </w:rPr>
-        <w:t xml:space="preserve">a) « Quel est ton sport préféré ? » ; b) football, basket, course, danse (par exemple) ; d) les élèves de l’école ; e) par exemple : « Le football sera le sport le plus choisi. »</w:t>
-      </w:r>
-    </w:p>
-    <w:p>
-      <w:pPr>
-        <w:spacing w:after="80"/>
-      </w:pPr>
-      <w:r>
-        <w:rPr>
-          <w:rFonts w:ascii="Times New Roman" w:cs="Times New Roman" w:eastAsia="Times New Roman" w:hAnsi="Times New Roman"/>
-          <w:b/>
-          <w:bCs/>
-          <w:i w:val="false"/>
-          <w:iCs w:val="false"/>
-          <w:color w:val="C2185B"/>
-          <w:sz w:val="24"/>
-          <w:szCs w:val="24"/>
-        </w:rPr>
-        <w:t xml:space="preserve">5. </w:t>
-      </w:r>
-      <w:r>
-        <w:rPr>
-          <w:rFonts w:ascii="Times New Roman" w:cs="Times New Roman" w:eastAsia="Times New Roman" w:hAnsi="Times New Roman"/>
-          <w:b w:val="false"/>
-          <w:bCs w:val="false"/>
-          <w:i w:val="false"/>
-          <w:iCs w:val="false"/>
-          <w:color w:val="000000"/>
-          <w:sz w:val="24"/>
-          <w:szCs w:val="24"/>
-        </w:rPr>
-        <w:t xml:space="preserve">a) un questionnaire distribué dans les maisons, des entrevues dans un lieu public ; b) au hasard ; d) pour que les résultats ne soient pas faussés (biaisés) et restent valables ; e) les réponses pencheraient vers les goûts des enfants : le sondage serait biaisé.</w:t>
-      </w:r>
-    </w:p>
-    <w:p>
-      <w:pPr>
-        <w:spacing w:after="80"/>
-      </w:pPr>
-      <w:r>
-        <w:rPr>
-          <w:rFonts w:ascii="Times New Roman" w:cs="Times New Roman" w:eastAsia="Times New Roman" w:hAnsi="Times New Roman"/>
-          <w:b/>
-          <w:bCs/>
-          <w:i w:val="false"/>
-          <w:iCs w:val="false"/>
-          <w:color w:val="C2185B"/>
-          <w:sz w:val="24"/>
-          <w:szCs w:val="24"/>
-        </w:rPr>
-        <w:t xml:space="preserve">6. </w:t>
-      </w:r>
-      <w:r>
-        <w:rPr>
-          <w:rFonts w:ascii="Times New Roman" w:cs="Times New Roman" w:eastAsia="Times New Roman" w:hAnsi="Times New Roman"/>
-          <w:b w:val="false"/>
-          <w:bCs w:val="false"/>
-          <w:i w:val="false"/>
-          <w:iCs w:val="false"/>
-          <w:color w:val="000000"/>
-          <w:sz w:val="24"/>
-          <w:szCs w:val="24"/>
-        </w:rPr>
-        <w:t xml:space="preserve">a) non : une seule classe ne représente pas toute l’école ; b) tirer au sort des élèves dans toutes les classes ; d) « Comment viens-tu à l’école ? » ; e) à pied, à vélo, en taxi-be, en charrette, autre.</w:t>
-      </w:r>
-    </w:p>
-    <w:p>
-      <w:r>
-        <w:br w:type="page"/>
-      </w:r>
-    </w:p>
-    <w:p>
-      <w:pPr>
-        <w:spacing w:after="150" w:before="200"/>
-        <w:jc w:val="center"/>
-      </w:pPr>
-      <w:bookmarkStart w:name="u6_l2" w:id="3"/>
-      <w:r>
-        <w:rPr>
-          <w:rFonts w:ascii="Times New Roman" w:cs="Times New Roman" w:eastAsia="Times New Roman" w:hAnsi="Times New Roman"/>
-          <w:b/>
-          <w:bCs/>
-          <w:i w:val="false"/>
-          <w:iCs w:val="false"/>
-          <w:color w:val="C00000"/>
-          <w:sz w:val="32"/>
-          <w:szCs w:val="32"/>
-        </w:rPr>
-        <w:t xml:space="preserve">COLLECTER ET ORGANISER : TABLEAUX SIMPLES ET CHRONOLOGIQUES</w:t>
-      </w:r>
-      <w:bookmarkEnd w:id="3"/>
-    </w:p>
-    <w:p>
-      <w:pPr>
-        <w:spacing w:after="150" w:before="200"/>
-        <w:jc w:val="left"/>
-      </w:pPr>
-      <w:r>
-        <w:rPr>
-          <w:rFonts w:ascii="Times New Roman" w:cs="Times New Roman" w:eastAsia="Times New Roman" w:hAnsi="Times New Roman"/>
-          <w:b/>
-          <w:bCs/>
-          <w:i w:val="false"/>
-          <w:iCs w:val="false"/>
-          <w:color w:val="2E7D32"/>
-          <w:sz w:val="28"/>
-          <w:szCs w:val="28"/>
-        </w:rPr>
-        <w:t xml:space="preserve">Collecte et tableaux des effectifs</w:t>
-      </w:r>
-    </w:p>
-    <w:p>
-      <w:pPr>
-        <w:spacing w:after="110" w:line="300"/>
-        <w:jc w:val="both"/>
-      </w:pPr>
-      <w:r>
-        <w:rPr>
-          <w:rFonts w:ascii="Times New Roman" w:cs="Times New Roman" w:eastAsia="Times New Roman" w:hAnsi="Times New Roman"/>
-          <w:b w:val="false"/>
-          <w:bCs w:val="false"/>
-          <w:i w:val="false"/>
-          <w:iCs w:val="false"/>
-          <w:color w:val="000000"/>
-          <w:sz w:val="24"/>
-          <w:szCs w:val="24"/>
-        </w:rPr>
-        <w:t xml:space="preserve">Collecter des données, c’est recueillir les réponses une à une. L’effectif d’une réponse est le nombre de fois où elle apparaît. Le tableau des effectifs range chaque réponse possible avec son effectif ; le tableau chronologique range les données dans l’ordre du temps (jours, semaines, mois).</w:t>
+        <w:t xml:space="preserve">Une enquête est une démarche organisée pour répondre à une question en recueillant des informations. La question d’enquête est la question précise à laquelle on veut répondre. L’hypothèse est la réponse que l’on prévoit avant de collecter les données.</w:t>
       </w:r>
     </w:p>
     <w:p>
@@ -1338,7 +764,7 @@
           <w:sz w:val="24"/>
           <w:szCs w:val="24"/>
         </w:rPr>
-        <w:t xml:space="preserve">chaque réponse devient un bâton dans la bonne ligne ; à la fin, on compte les bâtons de chaque ligne : c’est l’effectif.</w:t>
+        <w:t xml:space="preserve">au lieu de deviner, on demande ; et avant de demander, on écrit son pari — l’enquête dira s’il était bon.</w:t>
       </w:r>
     </w:p>
     <w:p>
@@ -1349,7 +775,7 @@
       <w:r>
         <w:drawing>
           <wp:inline distT="0" distB="0" distL="0" distR="0">
-            <wp:extent cx="4762500" cy="2543175"/>
+            <wp:extent cx="4762500" cy="1590675"/>
             <wp:effectExtent t="0" r="0" b="0" l="0"/>
             <wp:docPr id="2" name=""/>
             <wp:cNvGraphicFramePr>
@@ -1374,7 +800,7 @@
                   <pic:spPr bwMode="auto">
                     <a:xfrm>
                       <a:off x="0" y="0"/>
-                      <a:ext cx="4762500" cy="2543175"/>
+                      <a:ext cx="4762500" cy="1590675"/>
                     </a:xfrm>
                     <a:prstGeom prst="rect">
                       <a:avLst/>
@@ -1417,7 +843,7 @@
           <w:sz w:val="24"/>
           <w:szCs w:val="24"/>
         </w:rPr>
-        <w:t xml:space="preserve"> 15 réponses collectées, effectifs 6, 6 et 3 : contrôle 6 + 6 + 3 = 15 ✓ — aucune réponse perdue.</w:t>
+        <w:t xml:space="preserve"> Question : « quel jour y a-t-il le plus d’absents ? » ; hypothèse : « le lundi » ; collecte : le registre d’appel de la semaine.</w:t>
       </w:r>
     </w:p>
     <w:p>
@@ -1437,7 +863,7 @@
           <w:sz w:val="24"/>
           <w:szCs w:val="24"/>
         </w:rPr>
-        <w:t xml:space="preserve">1. Tracer le tableau : une ligne par réponse possible (ou par période).</w:t>
+        <w:t xml:space="preserve">1. Formuler une question précise, sur un groupe défini, aux réponses comptables.</w:t>
       </w:r>
     </w:p>
     <w:p>
@@ -1457,7 +883,7 @@
           <w:sz w:val="24"/>
           <w:szCs w:val="24"/>
         </w:rPr>
-        <w:t xml:space="preserve">2. À chaque donnée, marquer un bâton dans la bonne ligne, par paquets de 5.</w:t>
+        <w:t xml:space="preserve">2. Écrire l’hypothèse : la réponse que l’on prévoit.</w:t>
       </w:r>
     </w:p>
     <w:p>
@@ -1477,7 +903,7 @@
           <w:sz w:val="24"/>
           <w:szCs w:val="24"/>
         </w:rPr>
-        <w:t xml:space="preserve">3. Écrire les effectifs en chiffres et vérifier : leur somme = le nombre de données.</w:t>
+        <w:t xml:space="preserve">3. Préparer la collecte : qui interroger, quelles réponses possibles, comment noter.</w:t>
       </w:r>
     </w:p>
     <w:p>
@@ -1497,7 +923,7 @@
           <w:sz w:val="24"/>
           <w:szCs w:val="24"/>
         </w:rPr>
-        <w:t xml:space="preserve">un bâton par réponse, paquets de 5 ; effectif = compte d’une ligne ; somme des effectifs = nombre d’interrogés ; tableau chronologique = données dans l’ordre du temps.</w:t>
+        <w:t xml:space="preserve">enquête = question précise + hypothèse + collecte + réponse ; la question définit le groupe interrogé et des réponses comptables ; l’hypothèse est le pari à vérifier.</w:t>
       </w:r>
     </w:p>
     <w:p>
@@ -1517,7 +943,7 @@
           <w:sz w:val="24"/>
           <w:szCs w:val="24"/>
         </w:rPr>
-        <w:t xml:space="preserve">Le savais-tu ? Le plus vieil objet mathématique du monde est un os à bâtons : l’os d’Ishango, trouvé en Afrique près du lac Édouard, porte des entailles groupées vieilles d’environ 20 000 ans.</w:t>
+        <w:t xml:space="preserve">Le savais-tu ? La plus grande enquête de Madagascar est le recensement général de la population : en 2018, des milliers d’agents ont visité une à une toutes les maisons du pays pour compter plus de 25 millions d’habitants.</w:t>
       </w:r>
     </w:p>
     <w:p>
@@ -1537,7 +963,7 @@
           <w:sz w:val="24"/>
           <w:szCs w:val="24"/>
         </w:rPr>
-        <w:t xml:space="preserve">Attention : Noter toutes les réponses en vrac et compter à la fin : on relit dix fois, on se trompe, on perd des réponses. Le bâton se marque AU MOMENT où la réponse arrive — jamais après.</w:t>
+        <w:t xml:space="preserve">Attention : Poser une question vague : « le sport, c’est important ? ». Chacun comprend autre chose, les réponses ne se comptent pas, l’enquête ne conclut rien. La question doit appeler des réponses précises et dénombrables.</w:t>
       </w:r>
     </w:p>
     <w:p>
@@ -1575,7 +1001,7 @@
           <w:sz w:val="24"/>
           <w:szCs w:val="24"/>
         </w:rPr>
-        <w:t xml:space="preserve">1. Voici 15 réponses à « quel est ton animal préféré ? » : zébu, poule, zébu, chien, poule, zébu, poule, chien, zébu, poule, zébu, poule, chien, zébu, poule. a) Dresse le tableau avec les bâtons. b) Quel est l’effectif de « zébu » ? d) Celui de « chien » ? e) Vérifie le total.</w:t>
+        <w:t xml:space="preserve">1. Bonnes ou mauvaises questions d’enquête ? Justifie. a) « Quel est le fruit préféré des élèves de la classe ? » b) « Les mangues, c’est bien ? » d) « Combien de frères et sœurs a chaque élève de la classe ? » e) « Quel jour de la semaine y a-t-il le plus d’absents dans la classe ? »</w:t>
       </w:r>
     </w:p>
     <w:p>
@@ -1594,7 +1020,7 @@
           <w:sz w:val="24"/>
           <w:szCs w:val="24"/>
         </w:rPr>
-        <w:t xml:space="preserve">2. Absents de la semaine : lundi 2, mardi 1, mercredi 0, jeudi 3, vendredi 1. a) Quel jour compte le plus d’absents ? b) Quel jour n’en compte aucun ? d) Combien d’absences dans la semaine ? e) Pourquoi garder les jours dans l’ordre ?</w:t>
+        <w:t xml:space="preserve">2. Pour la question « comment les élèves viennent-ils à l’école ? » : a) propose une hypothèse. b) Qui faut-il interroger ? d) Prévois quatre réponses possibles. e) Combien de fois interroger chaque élève ?</w:t>
       </w:r>
     </w:p>
     <w:p>
@@ -1613,7 +1039,7 @@
           <w:sz w:val="24"/>
           <w:szCs w:val="24"/>
         </w:rPr>
-        <w:t xml:space="preserve">3. L’enquête des fruits donne : mangue 8, banane 6, letchi 7, ananas ?, pour 24 élèves. a) Calcule l’effectif manquant. b) Quel est le fruit le plus choisi ? d) Quel est l’écart entre mangue et banane ? e) Combien d’élèves n’ont pas choisi la mangue ?</w:t>
+        <w:t xml:space="preserve">3. Invente ta propre enquête : a) écris une question précise ; b) écris ton hypothèse ; d) indique le groupe à interroger ; e) explique comment les données diront si ton hypothèse était bonne.</w:t>
       </w:r>
     </w:p>
     <w:p>
@@ -1632,7 +1058,7 @@
           <w:sz w:val="24"/>
           <w:szCs w:val="24"/>
         </w:rPr>
-        <w:t xml:space="preserve">4. Voici dix réponses au sondage « fruit préféré » : mangue, banane, mangue, letchi, banane, mangue, ananas, mangue, letchi, banane. a) Construis le tableau des effectifs. b) Quel est l’effectif de la mangue ? d) Combien de personnes ont répondu ? e) Dans quel ordre peut-on ranger les données du tableau ?</w:t>
+        <w:t xml:space="preserve">4. Vola veut savoir quel sport préfèrent les élèves de son école. a) Écris la question d’enquête. b) Propose quatre réponses possibles. d) Qui faut-il interroger ? e) Propose une hypothèse à vérifier.</w:t>
       </w:r>
     </w:p>
     <w:p>
@@ -1651,7 +1077,7 @@
           <w:sz w:val="24"/>
           <w:szCs w:val="24"/>
         </w:rPr>
-        <w:t xml:space="preserve">5. Températures relevées à Antsirabe : lundi 18° ; mardi 16° ; mercredi 15° ; jeudi 17° ; vendredi 19° ; samedi 21° ; dimanche 20°. a) Quel type de tableau convient ? b) Quel est le jour le plus froid ? d) Quels jours dépassent 18° ? e) Pourquoi faut-il garder l’ordre des jours ?</w:t>
+        <w:t xml:space="preserve">5. Rasoa, vendeuse de fruits au marché, fait un sondage en questionnant ses clients. a) Cite deux autres façons de réaliser un sondage. b) Comment doit-elle choisir les personnes à interroger ? d) Pourquoi ce choix au hasard est-il important ? e) Si elle n’interrogeait que les enfants, que se passerait-il ?</w:t>
       </w:r>
     </w:p>
     <w:p>
@@ -1670,7 +1096,7 @@
           <w:sz w:val="24"/>
           <w:szCs w:val="24"/>
         </w:rPr>
-        <w:t xml:space="preserve">6. Défi CEPE — Au marché, Rasoa a noté les fruits choisis par ses 25 clients : mangues 7 ; fraises 8 ; bananes 4 ; mûres 3 ; pêches 3. a) Vérifie le total des effectifs. b) Quel est le fruit le plus demandé ? d) Quels fruits ont le même effectif ? e) Elle veut commander 50 fruits en respectant ces préférences : combien de fraises doit-elle prévoir ?</w:t>
+        <w:t xml:space="preserve">6. Défi CEPE — Une école de 600 élèves veut connaître leur moyen de transport, mais ne peut en interroger que 50. a) Faut-il interroger les élèves d’une seule classe ? Pourquoi ? b) Propose une bonne façon de choisir les 50 élèves. d) Écris la question d’enquête. e) Propose les réponses à cocher.</w:t>
       </w:r>
     </w:p>
     <w:p>
@@ -1720,7 +1146,7 @@
           <w:sz w:val="24"/>
           <w:szCs w:val="24"/>
         </w:rPr>
-        <w:t xml:space="preserve">a) zébu IIII I, poule IIII I, chien III ; b) 6 ; d) 3 ; e) 6 + 6 + 3 = 15 ✓.</w:t>
+        <w:t xml:space="preserve">a) bonne : précise, groupe défini, réponses comptables ; b) mauvaise : vague, chacun comprend autre chose ; d) bonne : la réponse de chacun est un nombre ; e) bonne : il suffit de compter les absents jour par jour.</w:t>
       </w:r>
     </w:p>
     <w:p>
@@ -1751,7 +1177,7 @@
           <w:sz w:val="24"/>
           <w:szCs w:val="24"/>
         </w:rPr>
-        <w:t xml:space="preserve">a) jeudi (3) ; b) mercredi ; d) 2 + 1 + 0 + 3 + 1 = 7 absences ; e) parce que l’ordre du temps montre l’évolution au fil de la semaine.</w:t>
+        <w:t xml:space="preserve">a) par exemple « la plupart viennent à pied » ; b) tous les élèves de la classe ; d) à pied, à vélo, en taxi-be, en charrette ; e) une seule fois — sinon les effectifs sont faussés.</w:t>
       </w:r>
     </w:p>
     <w:p>
@@ -1782,7 +1208,7 @@
           <w:sz w:val="24"/>
           <w:szCs w:val="24"/>
         </w:rPr>
-        <w:t xml:space="preserve">a) 24 − (8 + 6 + 7) = 24 − 21 = 3 ; b) la mangue ; d) 8 − 6 = 2 ; e) 24 − 8 = 16 élèves.</w:t>
+        <w:t xml:space="preserve">a) question précise sur un groupe défini ; b) une prédiction claire ; d) par exemple les élèves de la classe ; e) on comptera les réponses : si la réponse la plus fréquente est celle prédite, l’hypothèse était bonne.</w:t>
       </w:r>
     </w:p>
     <w:p>
@@ -1813,7 +1239,7 @@
           <w:sz w:val="24"/>
           <w:szCs w:val="24"/>
         </w:rPr>
-        <w:t xml:space="preserve">a) mangue 4 ; banane 3 ; letchi 2 ; ananas 1 ; b) 4 ; d) 10 personnes ; e) par ordre alphabétique ou par effectif décroissant.</w:t>
+        <w:t xml:space="preserve">a) « Quel est ton sport préféré ? » ; b) football, basket, course, danse (par exemple) ; d) les élèves de l’école ; e) par exemple : « Le football sera le sport le plus choisi. »</w:t>
       </w:r>
     </w:p>
     <w:p>
@@ -1844,7 +1270,7 @@
           <w:sz w:val="24"/>
           <w:szCs w:val="24"/>
         </w:rPr>
-        <w:t xml:space="preserve">a) un tableau chronologique ; b) mercredi (15°) ; d) vendredi, samedi et dimanche ; e) pour suivre l’évolution de la température au fil du temps.</w:t>
+        <w:t xml:space="preserve">a) un questionnaire distribué dans les maisons, des entrevues dans un lieu public ; b) au hasard ; d) pour que les résultats ne soient pas faussés (biaisés) et restent valables ; e) les réponses pencheraient vers les goûts des enfants : le sondage serait biaisé.</w:t>
       </w:r>
     </w:p>
     <w:p>
@@ -1875,7 +1301,7 @@
           <w:sz w:val="24"/>
           <w:szCs w:val="24"/>
         </w:rPr>
-        <w:t xml:space="preserve">a) 7 + 8 + 4 + 3 + 3 = 25 : le compte est bon ; b) les fraises ; d) les mûres et les pêches ; e) 8 clients sur 25 choisissent les fraises ; pour 50 fruits (le double), il faut 2 × 8 = 16 fraises.</w:t>
+        <w:t xml:space="preserve">a) non : une seule classe ne représente pas toute l’école ; b) tirer au sort des élèves dans toutes les classes ; d) « Comment viens-tu à l’école ? » ; e) à pied, à vélo, en taxi-be, en charrette, autre.</w:t>
       </w:r>
     </w:p>
     <w:p>
@@ -1888,7 +1314,7 @@
         <w:spacing w:after="150" w:before="200"/>
         <w:jc w:val="center"/>
       </w:pPr>
-      <w:bookmarkStart w:name="u6_l3" w:id="4"/>
+      <w:bookmarkStart w:name="u6_l2" w:id="3"/>
       <w:r>
         <w:rPr>
           <w:rFonts w:ascii="Times New Roman" w:cs="Times New Roman" w:eastAsia="Times New Roman" w:hAnsi="Times New Roman"/>
@@ -1900,76 +1326,19 @@
           <w:sz w:val="32"/>
           <w:szCs w:val="32"/>
         </w:rPr>
-        <w:t xml:space="preserve">DIAGRAMMES EN BARRES ET PICTOGRAMMES</w:t>
-      </w:r>
-      <w:bookmarkEnd w:id="4"/>
-    </w:p>
-    <w:p>
-      <w:pPr>
-        <w:spacing w:after="150" w:before="200"/>
-        <w:jc w:val="left"/>
-      </w:pPr>
-      <w:r>
-        <w:rPr>
-          <w:rFonts w:ascii="Times New Roman" w:cs="Times New Roman" w:eastAsia="Times New Roman" w:hAnsi="Times New Roman"/>
-          <w:b/>
-          <w:bCs/>
-          <w:i w:val="false"/>
-          <w:iCs w:val="false"/>
-          <w:color w:val="2E7D32"/>
-          <w:sz w:val="28"/>
-          <w:szCs w:val="28"/>
-        </w:rPr>
-        <w:t xml:space="preserve">Représentations : barres et pictogrammes</w:t>
-      </w:r>
-    </w:p>
-    <w:p>
-      <w:pPr>
-        <w:spacing w:after="110" w:line="300"/>
-        <w:jc w:val="both"/>
-      </w:pPr>
-      <w:r>
-        <w:rPr>
-          <w:rFonts w:ascii="Times New Roman" w:cs="Times New Roman" w:eastAsia="Times New Roman" w:hAnsi="Times New Roman"/>
-          <w:b w:val="false"/>
-          <w:bCs w:val="false"/>
-          <w:i w:val="false"/>
-          <w:iCs w:val="false"/>
-          <w:color w:val="000000"/>
-          <w:sz w:val="24"/>
-          <w:szCs w:val="24"/>
-        </w:rPr>
-        <w:t xml:space="preserve">Un diagramme en barres représente chaque effectif par une barre : toutes les barres ont la même largeur, et la hauteur de chaque barre est proportionnelle à l’effectif. Un pictogramme représente les effectifs par de petits symboles identiques ; sa légende indique combien d’unités vaut un symbole.</w:t>
-      </w:r>
-    </w:p>
-    <w:p>
-      <w:pPr>
-        <w:spacing w:after="110" w:line="300"/>
-        <w:jc w:val="both"/>
-      </w:pPr>
-      <w:r>
-        <w:rPr>
-          <w:rFonts w:ascii="Times New Roman" w:cs="Times New Roman" w:eastAsia="Times New Roman" w:hAnsi="Times New Roman"/>
-          <w:b w:val="false"/>
-          <w:bCs w:val="false"/>
-          <w:i/>
-          <w:iCs/>
-          <w:color w:val="1F4E79"/>
-          <w:sz w:val="24"/>
-          <w:szCs w:val="24"/>
-        </w:rPr>
-        <w:t xml:space="preserve">le diagramme en barres, c’est le tableau debout : plus l’effectif est grand, plus sa barre monte ; le pictogramme raconte la même chose avec des petits dessins.</w:t>
-      </w:r>
-    </w:p>
-    <w:p>
-      <w:pPr>
-        <w:spacing w:after="120" w:before="120"/>
+        <w:t xml:space="preserve">COLLECTER ET ORGANISER : TABLEAUX SIMPLES ET CHRONOLOGIQUES</w:t>
+      </w:r>
+      <w:bookmarkEnd w:id="3"/>
+    </w:p>
+    <w:p>
+      <w:pPr>
+        <w:spacing w:after="120" w:before="100"/>
         <w:jc w:val="center"/>
       </w:pPr>
       <w:r>
         <w:drawing>
           <wp:inline distT="0" distB="0" distL="0" distR="0">
-            <wp:extent cx="4762500" cy="2324100"/>
+            <wp:extent cx="4476750" cy="2438400"/>
             <wp:effectExtent t="0" r="0" b="0" l="0"/>
             <wp:docPr id="3" name=""/>
             <wp:cNvGraphicFramePr>
@@ -1994,7 +1363,7 @@
                   <pic:spPr bwMode="auto">
                     <a:xfrm>
                       <a:off x="0" y="0"/>
-                      <a:ext cx="4762500" cy="2324100"/>
+                      <a:ext cx="4476750" cy="2438400"/>
                     </a:xfrm>
                     <a:prstGeom prst="rect">
                       <a:avLst/>
@@ -2009,159 +1378,6 @@
     </w:p>
     <w:p>
       <w:pPr>
-        <w:spacing w:after="130" w:before="100" w:line="300"/>
-        <w:jc w:val="both"/>
-      </w:pPr>
-      <w:r>
-        <w:rPr>
-          <w:rFonts w:ascii="Times New Roman" w:cs="Times New Roman" w:eastAsia="Times New Roman" w:hAnsi="Times New Roman"/>
-          <w:b w:val="false"/>
-          <w:bCs w:val="false"/>
-          <w:i/>
-          <w:iCs/>
-          <w:color w:val="000000"/>
-          <w:sz w:val="24"/>
-          <w:szCs w:val="24"/>
-          <w:u w:val="single"/>
-        </w:rPr>
-        <w:t xml:space="preserve">Exemple :</w:t>
-      </w:r>
-      <w:r>
-        <w:rPr>
-          <w:rFonts w:ascii="Times New Roman" w:cs="Times New Roman" w:eastAsia="Times New Roman" w:hAnsi="Times New Roman"/>
-          <w:b w:val="false"/>
-          <w:bCs w:val="false"/>
-          <w:i w:val="false"/>
-          <w:iCs w:val="false"/>
-          <w:color w:val="000000"/>
-          <w:sz w:val="24"/>
-          <w:szCs w:val="24"/>
-        </w:rPr>
-        <w:t xml:space="preserve"> Effectif 14 avec la légende « 1 symbole = 4 » : 14 ÷ 4 = 3 reste 2, donc 3 symboles et un demi-symbole.</w:t>
-      </w:r>
-    </w:p>
-    <w:p>
-      <w:pPr>
-        <w:spacing w:after="55" w:line="300"/>
-        <w:ind w:left="260"/>
-        <w:jc w:val="both"/>
-      </w:pPr>
-      <w:r>
-        <w:rPr>
-          <w:rFonts w:ascii="Times New Roman" w:cs="Times New Roman" w:eastAsia="Times New Roman" w:hAnsi="Times New Roman"/>
-          <w:b w:val="false"/>
-          <w:bCs w:val="false"/>
-          <w:i w:val="false"/>
-          <w:iCs w:val="false"/>
-          <w:color w:val="000000"/>
-          <w:sz w:val="24"/>
-          <w:szCs w:val="24"/>
-        </w:rPr>
-        <w:t xml:space="preserve">1. Choisir l’échelle : 1 carreau (ou 1 symbole) = combien d’unités ?</w:t>
-      </w:r>
-    </w:p>
-    <w:p>
-      <w:pPr>
-        <w:spacing w:after="55" w:line="300"/>
-        <w:ind w:left="260"/>
-        <w:jc w:val="both"/>
-      </w:pPr>
-      <w:r>
-        <w:rPr>
-          <w:rFonts w:ascii="Times New Roman" w:cs="Times New Roman" w:eastAsia="Times New Roman" w:hAnsi="Times New Roman"/>
-          <w:b w:val="false"/>
-          <w:bCs w:val="false"/>
-          <w:i w:val="false"/>
-          <w:iCs w:val="false"/>
-          <w:color w:val="000000"/>
-          <w:sz w:val="24"/>
-          <w:szCs w:val="24"/>
-        </w:rPr>
-        <w:t xml:space="preserve">2. Tracer une barre (ou une rangée de symboles) par réponse, à la bonne hauteur.</w:t>
-      </w:r>
-    </w:p>
-    <w:p>
-      <w:pPr>
-        <w:spacing w:after="55" w:line="300"/>
-        <w:ind w:left="260"/>
-        <w:jc w:val="both"/>
-      </w:pPr>
-      <w:r>
-        <w:rPr>
-          <w:rFonts w:ascii="Times New Roman" w:cs="Times New Roman" w:eastAsia="Times New Roman" w:hAnsi="Times New Roman"/>
-          <w:b w:val="false"/>
-          <w:bCs w:val="false"/>
-          <w:i w:val="false"/>
-          <w:iCs w:val="false"/>
-          <w:color w:val="000000"/>
-          <w:sz w:val="24"/>
-          <w:szCs w:val="24"/>
-        </w:rPr>
-        <w:t xml:space="preserve">3. Étiqueter : noms, effectifs, et la légende du pictogramme.</w:t>
-      </w:r>
-    </w:p>
-    <w:p>
-      <w:pPr>
-        <w:shd w:fill="E8F5E9" w:val="clear"/>
-        <w:spacing w:after="110" w:line="300"/>
-        <w:jc w:val="both"/>
-      </w:pPr>
-      <w:r>
-        <w:rPr>
-          <w:rFonts w:ascii="Times New Roman" w:cs="Times New Roman" w:eastAsia="Times New Roman" w:hAnsi="Times New Roman"/>
-          <w:b/>
-          <w:bCs/>
-          <w:i w:val="false"/>
-          <w:iCs w:val="false"/>
-          <w:color w:val="000000"/>
-          <w:sz w:val="24"/>
-          <w:szCs w:val="24"/>
-        </w:rPr>
-        <w:t xml:space="preserve">barres : même largeur, échelle régulière partant de zéro, hauteur proportionnelle à l’effectif ; pictogramme : symboles identiques + légende obligatoire ; demi-symbole permis.</w:t>
-      </w:r>
-    </w:p>
-    <w:p>
-      <w:pPr>
-        <w:shd w:fill="E3F2FD" w:val="clear"/>
-        <w:spacing w:after="110" w:line="300"/>
-        <w:jc w:val="both"/>
-      </w:pPr>
-      <w:r>
-        <w:rPr>
-          <w:rFonts w:ascii="Times New Roman" w:cs="Times New Roman" w:eastAsia="Times New Roman" w:hAnsi="Times New Roman"/>
-          <w:b w:val="false"/>
-          <w:bCs w:val="false"/>
-          <w:i w:val="false"/>
-          <w:iCs w:val="false"/>
-          <w:color w:val="1F4E79"/>
-          <w:sz w:val="24"/>
-          <w:szCs w:val="24"/>
-        </w:rPr>
-        <w:t xml:space="preserve">Le savais-tu ? Le diagramme en barres a un inventeur : l’Écossais William Playfair, en 1786.</w:t>
-      </w:r>
-    </w:p>
-    <w:p>
-      <w:pPr>
-        <w:shd w:fill="FFF8E1" w:val="clear"/>
-        <w:spacing w:after="110" w:line="300"/>
-        <w:jc w:val="both"/>
-      </w:pPr>
-      <w:r>
-        <w:rPr>
-          <w:rFonts w:ascii="Times New Roman" w:cs="Times New Roman" w:eastAsia="Times New Roman" w:hAnsi="Times New Roman"/>
-          <w:b w:val="false"/>
-          <w:bCs w:val="false"/>
-          <w:i w:val="false"/>
-          <w:iCs w:val="false"/>
-          <w:color w:val="000000"/>
-          <w:sz w:val="24"/>
-          <w:szCs w:val="24"/>
-        </w:rPr>
-        <w:t xml:space="preserve">Attention : Dessiner des barres de largeurs différentes : la barre large paraît plus importante même si elle est moins haute, et le lecteur est trompé. La largeur ne change JAMAIS ; seule la hauteur parle.</w:t>
-      </w:r>
-    </w:p>
-    <w:p>
-      <w:pPr>
         <w:spacing w:after="150" w:before="200"/>
         <w:jc w:val="left"/>
       </w:pPr>
@@ -2176,7 +1392,7 @@
           <w:sz w:val="28"/>
           <w:szCs w:val="28"/>
         </w:rPr>
-        <w:t xml:space="preserve">EXERCICE</w:t>
+        <w:t xml:space="preserve">Collecte et tableaux des effectifs</w:t>
       </w:r>
     </w:p>
     <w:p>
@@ -2195,371 +1411,7 @@
           <w:sz w:val="24"/>
           <w:szCs w:val="24"/>
         </w:rPr>
-        <w:t xml:space="preserve">1. Avec les effectifs mangue 8, banane 6, letchi 7, ananas 3 et l’échelle 1 carreau = 1 élève : a) hauteur de la barre « mangue » ? b) Hauteur de la barre « banane » ? d) Quelle barre est la plus haute ? e) Trace le diagramme complet sur papier quadrillé.</w:t>
-      </w:r>
-    </w:p>
-    <w:p>
-      <w:pPr>
-        <w:spacing w:after="110" w:line="300"/>
-        <w:jc w:val="both"/>
-      </w:pPr>
-      <w:r>
-        <w:rPr>
-          <w:rFonts w:ascii="Times New Roman" w:cs="Times New Roman" w:eastAsia="Times New Roman" w:hAnsi="Times New Roman"/>
-          <w:b w:val="false"/>
-          <w:bCs w:val="false"/>
-          <w:i w:val="false"/>
-          <w:iCs w:val="false"/>
-          <w:color w:val="000000"/>
-          <w:sz w:val="24"/>
-          <w:szCs w:val="24"/>
-        </w:rPr>
-        <w:t xml:space="preserve">2. Pictogramme avec la légende « 1 rond = 2 élèves » : a) combien de ronds pour la mangue (8) ? b) Pour la banane (6) ? d) Pour le letchi (7) ? e) Pourquoi la légende est-elle indispensable ?</w:t>
-      </w:r>
-    </w:p>
-    <w:p>
-      <w:pPr>
-        <w:spacing w:after="110" w:line="300"/>
-        <w:jc w:val="both"/>
-      </w:pPr>
-      <w:r>
-        <w:rPr>
-          <w:rFonts w:ascii="Times New Roman" w:cs="Times New Roman" w:eastAsia="Times New Roman" w:hAnsi="Times New Roman"/>
-          <w:b w:val="false"/>
-          <w:bCs w:val="false"/>
-          <w:i w:val="false"/>
-          <w:iCs w:val="false"/>
-          <w:color w:val="000000"/>
-          <w:sz w:val="24"/>
-          <w:szCs w:val="24"/>
-        </w:rPr>
-        <w:t xml:space="preserve">3. Livres lus pendant les vacances : Hanta 5, Rivo 3, Soa 6, Naly 2. a) Qui a lu le plus ? b) Qui a lu le moins ? d) Combien de livres en tout ? e) Trace le diagramme en barres (1 carreau = 1 livre).</w:t>
-      </w:r>
-    </w:p>
-    <w:p>
-      <w:pPr>
-        <w:spacing w:after="110" w:line="300"/>
-        <w:jc w:val="both"/>
-      </w:pPr>
-      <w:r>
-        <w:rPr>
-          <w:rFonts w:ascii="Times New Roman" w:cs="Times New Roman" w:eastAsia="Times New Roman" w:hAnsi="Times New Roman"/>
-          <w:b w:val="false"/>
-          <w:bCs w:val="false"/>
-          <w:i w:val="false"/>
-          <w:iCs w:val="false"/>
-          <w:color w:val="000000"/>
-          <w:sz w:val="24"/>
-          <w:szCs w:val="24"/>
-        </w:rPr>
-        <w:t xml:space="preserve">4. Un diagramme en barres donne les inscriptions aux activités : football 12 ; basket 8 ; course 6 ; danse 4. a) Quelle barre est la plus haute ? b) Combien d’élèves inscrits en tout ? d) Combien d’inscrits de plus au football qu’en danse ? e) Avec un pictogramme où un dessin vaut 2 élèves, combien de dessins pour le basket ?</w:t>
-      </w:r>
-    </w:p>
-    <w:p>
-      <w:pPr>
-        <w:spacing w:after="110" w:line="300"/>
-        <w:jc w:val="both"/>
-      </w:pPr>
-      <w:r>
-        <w:rPr>
-          <w:rFonts w:ascii="Times New Roman" w:cs="Times New Roman" w:eastAsia="Times New Roman" w:hAnsi="Times New Roman"/>
-          <w:b w:val="false"/>
-          <w:bCs w:val="false"/>
-          <w:i w:val="false"/>
-          <w:iCs w:val="false"/>
-          <w:color w:val="000000"/>
-          <w:sz w:val="24"/>
-          <w:szCs w:val="24"/>
-        </w:rPr>
-        <w:t xml:space="preserve">5. On veut construire un diagramme en barres pour les récoltes : riz 9 sacs ; maïs 6 ; manioc 12 ; patate douce 3. a) Que représente l’axe vertical ? b) Quelle sera la barre la plus haute ? d) Si l’axe est gradué de 3 en 3, à combien de graduations monte la barre du maïs ? e) Construis le diagramme sur ton cahier.</w:t>
-      </w:r>
-    </w:p>
-    <w:p>
-      <w:pPr>
-        <w:spacing w:after="110" w:line="300"/>
-        <w:jc w:val="both"/>
-      </w:pPr>
-      <w:r>
-        <w:rPr>
-          <w:rFonts w:ascii="Times New Roman" w:cs="Times New Roman" w:eastAsia="Times New Roman" w:hAnsi="Times New Roman"/>
-          <w:b w:val="false"/>
-          <w:bCs w:val="false"/>
-          <w:i w:val="false"/>
-          <w:iCs w:val="false"/>
-          <w:color w:val="000000"/>
-          <w:sz w:val="24"/>
-          <w:szCs w:val="24"/>
-        </w:rPr>
-        <w:t xml:space="preserve">6. Défi CEPE — Un pictogramme montre les zébus de quatre villages ; chaque dessin vaut 10 zébus. Village A : 4 dessins ; village B : 6 dessins ; village D : 3 dessins et demi ; village E : 2 dessins. a) Combien de zébus au village A ? b) Au village D ? d) Combien en tout ? e) Que représente le demi-dessin ?</w:t>
-      </w:r>
-    </w:p>
-    <w:p>
-      <w:pPr>
-        <w:spacing w:after="150" w:before="200"/>
-        <w:jc w:val="left"/>
-      </w:pPr>
-      <w:r>
-        <w:rPr>
-          <w:rFonts w:ascii="Times New Roman" w:cs="Times New Roman" w:eastAsia="Times New Roman" w:hAnsi="Times New Roman"/>
-          <w:b/>
-          <w:bCs/>
-          <w:i w:val="false"/>
-          <w:iCs w:val="false"/>
-          <w:color w:val="2E7D32"/>
-          <w:sz w:val="28"/>
-          <w:szCs w:val="28"/>
-        </w:rPr>
-        <w:t xml:space="preserve">Correction</w:t>
-      </w:r>
-    </w:p>
-    <w:p>
-      <w:pPr>
-        <w:spacing w:after="80"/>
-      </w:pPr>
-      <w:r>
-        <w:rPr>
-          <w:rFonts w:ascii="Times New Roman" w:cs="Times New Roman" w:eastAsia="Times New Roman" w:hAnsi="Times New Roman"/>
-          <w:b/>
-          <w:bCs/>
-          <w:i w:val="false"/>
-          <w:iCs w:val="false"/>
-          <w:color w:val="C2185B"/>
-          <w:sz w:val="24"/>
-          <w:szCs w:val="24"/>
-        </w:rPr>
-        <w:t xml:space="preserve">1. </w:t>
-      </w:r>
-      <w:r>
-        <w:rPr>
-          <w:rFonts w:ascii="Times New Roman" w:cs="Times New Roman" w:eastAsia="Times New Roman" w:hAnsi="Times New Roman"/>
-          <w:b w:val="false"/>
-          <w:bCs w:val="false"/>
-          <w:i w:val="false"/>
-          <w:iCs w:val="false"/>
-          <w:color w:val="000000"/>
-          <w:sz w:val="24"/>
-          <w:szCs w:val="24"/>
-        </w:rPr>
-        <w:t xml:space="preserve">a) 8 carreaux ; b) 6 carreaux ; d) la mangue ; e) quatre barres de même largeur, hauteurs 8, 6, 7, 3, noms dessous et effectifs au sommet.</w:t>
-      </w:r>
-    </w:p>
-    <w:p>
-      <w:pPr>
-        <w:spacing w:after="80"/>
-      </w:pPr>
-      <w:r>
-        <w:rPr>
-          <w:rFonts w:ascii="Times New Roman" w:cs="Times New Roman" w:eastAsia="Times New Roman" w:hAnsi="Times New Roman"/>
-          <w:b/>
-          <w:bCs/>
-          <w:i w:val="false"/>
-          <w:iCs w:val="false"/>
-          <w:color w:val="C2185B"/>
-          <w:sz w:val="24"/>
-          <w:szCs w:val="24"/>
-        </w:rPr>
-        <w:t xml:space="preserve">2. </w:t>
-      </w:r>
-      <w:r>
-        <w:rPr>
-          <w:rFonts w:ascii="Times New Roman" w:cs="Times New Roman" w:eastAsia="Times New Roman" w:hAnsi="Times New Roman"/>
-          <w:b w:val="false"/>
-          <w:bCs w:val="false"/>
-          <w:i w:val="false"/>
-          <w:iCs w:val="false"/>
-          <w:color w:val="000000"/>
-          <w:sz w:val="24"/>
-          <w:szCs w:val="24"/>
-        </w:rPr>
-        <w:t xml:space="preserve">a) 8 ÷ 2 = 4 ronds ; b) 3 ronds ; d) 3 ronds et demi ; e) sans elle, on ignore la valeur d’un symbole : le pictogramme devient illisible.</w:t>
-      </w:r>
-    </w:p>
-    <w:p>
-      <w:pPr>
-        <w:spacing w:after="80"/>
-      </w:pPr>
-      <w:r>
-        <w:rPr>
-          <w:rFonts w:ascii="Times New Roman" w:cs="Times New Roman" w:eastAsia="Times New Roman" w:hAnsi="Times New Roman"/>
-          <w:b/>
-          <w:bCs/>
-          <w:i w:val="false"/>
-          <w:iCs w:val="false"/>
-          <w:color w:val="C2185B"/>
-          <w:sz w:val="24"/>
-          <w:szCs w:val="24"/>
-        </w:rPr>
-        <w:t xml:space="preserve">3. </w:t>
-      </w:r>
-      <w:r>
-        <w:rPr>
-          <w:rFonts w:ascii="Times New Roman" w:cs="Times New Roman" w:eastAsia="Times New Roman" w:hAnsi="Times New Roman"/>
-          <w:b w:val="false"/>
-          <w:bCs w:val="false"/>
-          <w:i w:val="false"/>
-          <w:iCs w:val="false"/>
-          <w:color w:val="000000"/>
-          <w:sz w:val="24"/>
-          <w:szCs w:val="24"/>
-        </w:rPr>
-        <w:t xml:space="preserve">a) Soa (6) ; b) Naly (2) ; d) 5 + 3 + 6 + 2 = 16 livres ; e) barres de hauteurs 5, 3, 6, 2 avec la même largeur.</w:t>
-      </w:r>
-    </w:p>
-    <w:p>
-      <w:pPr>
-        <w:spacing w:after="80"/>
-      </w:pPr>
-      <w:r>
-        <w:rPr>
-          <w:rFonts w:ascii="Times New Roman" w:cs="Times New Roman" w:eastAsia="Times New Roman" w:hAnsi="Times New Roman"/>
-          <w:b/>
-          <w:bCs/>
-          <w:i w:val="false"/>
-          <w:iCs w:val="false"/>
-          <w:color w:val="C2185B"/>
-          <w:sz w:val="24"/>
-          <w:szCs w:val="24"/>
-        </w:rPr>
-        <w:t xml:space="preserve">4. </w:t>
-      </w:r>
-      <w:r>
-        <w:rPr>
-          <w:rFonts w:ascii="Times New Roman" w:cs="Times New Roman" w:eastAsia="Times New Roman" w:hAnsi="Times New Roman"/>
-          <w:b w:val="false"/>
-          <w:bCs w:val="false"/>
-          <w:i w:val="false"/>
-          <w:iCs w:val="false"/>
-          <w:color w:val="000000"/>
-          <w:sz w:val="24"/>
-          <w:szCs w:val="24"/>
-        </w:rPr>
-        <w:t xml:space="preserve">a) celle du football ; b) 12 + 8 + 6 + 4 = 30 élèves ; d) 12 − 4 = 8 ; e) 8 ÷ 2 = 4 dessins.</w:t>
-      </w:r>
-    </w:p>
-    <w:p>
-      <w:pPr>
-        <w:spacing w:after="80"/>
-      </w:pPr>
-      <w:r>
-        <w:rPr>
-          <w:rFonts w:ascii="Times New Roman" w:cs="Times New Roman" w:eastAsia="Times New Roman" w:hAnsi="Times New Roman"/>
-          <w:b/>
-          <w:bCs/>
-          <w:i w:val="false"/>
-          <w:iCs w:val="false"/>
-          <w:color w:val="C2185B"/>
-          <w:sz w:val="24"/>
-          <w:szCs w:val="24"/>
-        </w:rPr>
-        <w:t xml:space="preserve">5. </w:t>
-      </w:r>
-      <w:r>
-        <w:rPr>
-          <w:rFonts w:ascii="Times New Roman" w:cs="Times New Roman" w:eastAsia="Times New Roman" w:hAnsi="Times New Roman"/>
-          <w:b w:val="false"/>
-          <w:bCs w:val="false"/>
-          <w:i w:val="false"/>
-          <w:iCs w:val="false"/>
-          <w:color w:val="000000"/>
-          <w:sz w:val="24"/>
-          <w:szCs w:val="24"/>
-        </w:rPr>
-        <w:t xml:space="preserve">a) le nombre de sacs ; b) celle du manioc (12) ; d) 2 graduations (6 = 2 × 3) ; e) quatre barres de hauteurs 9, 6, 12 et 3.</w:t>
-      </w:r>
-    </w:p>
-    <w:p>
-      <w:pPr>
-        <w:spacing w:after="80"/>
-      </w:pPr>
-      <w:r>
-        <w:rPr>
-          <w:rFonts w:ascii="Times New Roman" w:cs="Times New Roman" w:eastAsia="Times New Roman" w:hAnsi="Times New Roman"/>
-          <w:b/>
-          <w:bCs/>
-          <w:i w:val="false"/>
-          <w:iCs w:val="false"/>
-          <w:color w:val="C2185B"/>
-          <w:sz w:val="24"/>
-          <w:szCs w:val="24"/>
-        </w:rPr>
-        <w:t xml:space="preserve">6. </w:t>
-      </w:r>
-      <w:r>
-        <w:rPr>
-          <w:rFonts w:ascii="Times New Roman" w:cs="Times New Roman" w:eastAsia="Times New Roman" w:hAnsi="Times New Roman"/>
-          <w:b w:val="false"/>
-          <w:bCs w:val="false"/>
-          <w:i w:val="false"/>
-          <w:iCs w:val="false"/>
-          <w:color w:val="000000"/>
-          <w:sz w:val="24"/>
-          <w:szCs w:val="24"/>
-        </w:rPr>
-        <w:t xml:space="preserve">a) 4 × 10 = 40 zébus ; b) 35 zébus ; d) 40 + 60 + 35 + 20 = 155 zébus ; e) la moitié de 10, soit 5 zébus.</w:t>
-      </w:r>
-    </w:p>
-    <w:p>
-      <w:r>
-        <w:br w:type="page"/>
-      </w:r>
-    </w:p>
-    <w:p>
-      <w:pPr>
-        <w:spacing w:after="150" w:before="200"/>
-        <w:jc w:val="center"/>
-      </w:pPr>
-      <w:bookmarkStart w:name="u6_l4" w:id="5"/>
-      <w:r>
-        <w:rPr>
-          <w:rFonts w:ascii="Times New Roman" w:cs="Times New Roman" w:eastAsia="Times New Roman" w:hAnsi="Times New Roman"/>
-          <w:b/>
-          <w:bCs/>
-          <w:i w:val="false"/>
-          <w:iCs w:val="false"/>
-          <w:color w:val="C00000"/>
-          <w:sz w:val="32"/>
-          <w:szCs w:val="32"/>
-        </w:rPr>
-        <w:t xml:space="preserve">INTERPRÉTER DES DONNÉES</w:t>
-      </w:r>
-      <w:bookmarkEnd w:id="5"/>
-    </w:p>
-    <w:p>
-      <w:pPr>
-        <w:spacing w:after="150" w:before="200"/>
-        <w:jc w:val="left"/>
-      </w:pPr>
-      <w:r>
-        <w:rPr>
-          <w:rFonts w:ascii="Times New Roman" w:cs="Times New Roman" w:eastAsia="Times New Roman" w:hAnsi="Times New Roman"/>
-          <w:b/>
-          <w:bCs/>
-          <w:i w:val="false"/>
-          <w:iCs w:val="false"/>
-          <w:color w:val="2E7D32"/>
-          <w:sz w:val="28"/>
-          <w:szCs w:val="28"/>
-        </w:rPr>
-        <w:t xml:space="preserve">Lecture et interprétation de données</w:t>
-      </w:r>
-    </w:p>
-    <w:p>
-      <w:pPr>
-        <w:spacing w:after="110" w:line="300"/>
-        <w:jc w:val="both"/>
-      </w:pPr>
-      <w:r>
-        <w:rPr>
-          <w:rFonts w:ascii="Times New Roman" w:cs="Times New Roman" w:eastAsia="Times New Roman" w:hAnsi="Times New Roman"/>
-          <w:b w:val="false"/>
-          <w:bCs w:val="false"/>
-          <w:i w:val="false"/>
-          <w:iCs w:val="false"/>
-          <w:color w:val="000000"/>
-          <w:sz w:val="24"/>
-          <w:szCs w:val="24"/>
-        </w:rPr>
-        <w:t xml:space="preserve">Interpréter des données, c’est en tirer des informations et des conclusions : lire des valeurs, comparer les effectifs, calculer des totaux et des écarts, répondre à la question d’enquête et dire si l’hypothèse de départ était bonne.</w:t>
+        <w:t xml:space="preserve">Collecter des données, c’est recueillir les réponses une à une. L’effectif d’une réponse est le nombre de fois où elle apparaît. Le tableau des effectifs range chaque réponse possible avec son effectif ; le tableau chronologique range les données dans l’ordre du temps (jours, semaines, mois).</w:t>
       </w:r>
     </w:p>
     <w:p>
@@ -2578,7 +1430,7 @@
           <w:sz w:val="24"/>
           <w:szCs w:val="24"/>
         </w:rPr>
-        <w:t xml:space="preserve">le tableau et le diagramme sont des témoins : interpréter, c’est les interroger — qui est premier ? de combien ? et alors, que décide-t-on ?</w:t>
+        <w:t xml:space="preserve">chaque réponse devient un bâton dans la bonne ligne ; à la fin, on compte les bâtons de chaque ligne : c’est l’effectif.</w:t>
       </w:r>
     </w:p>
     <w:p>
@@ -2589,7 +1441,7 @@
       <w:r>
         <w:drawing>
           <wp:inline distT="0" distB="0" distL="0" distR="0">
-            <wp:extent cx="4762500" cy="2143125"/>
+            <wp:extent cx="4762500" cy="2543175"/>
             <wp:effectExtent t="0" r="0" b="0" l="0"/>
             <wp:docPr id="4" name=""/>
             <wp:cNvGraphicFramePr>
@@ -2614,7 +1466,7 @@
                   <pic:spPr bwMode="auto">
                     <a:xfrm>
                       <a:off x="0" y="0"/>
-                      <a:ext cx="4762500" cy="2143125"/>
+                      <a:ext cx="4762500" cy="2543175"/>
                     </a:xfrm>
                     <a:prstGeom prst="rect">
                       <a:avLst/>
@@ -2657,7 +1509,7 @@
           <w:sz w:val="24"/>
           <w:szCs w:val="24"/>
         </w:rPr>
-        <w:t xml:space="preserve"> Ventes : lundi 12, mardi 9, mercredi 15 → le meilleur jour est mercredi ; écart avec mardi : 15 − 9 = 6 ; total 36.</w:t>
+        <w:t xml:space="preserve"> 15 réponses collectées, effectifs 6, 6 et 3 : contrôle 6 + 6 + 3 = 15 ✓ — aucune réponse perdue.</w:t>
       </w:r>
     </w:p>
     <w:p>
@@ -2677,7 +1529,7 @@
           <w:sz w:val="24"/>
           <w:szCs w:val="24"/>
         </w:rPr>
-        <w:t xml:space="preserve">1. Lire les valeurs demandées directement sur le tableau ou les barres.</w:t>
+        <w:t xml:space="preserve">1. Tracer le tableau : une ligne par réponse possible (ou par période).</w:t>
       </w:r>
     </w:p>
     <w:p>
@@ -2697,7 +1549,7 @@
           <w:sz w:val="24"/>
           <w:szCs w:val="24"/>
         </w:rPr>
-        <w:t xml:space="preserve">2. Comparer : plus grand, plus petit, écarts, et calculer le total.</w:t>
+        <w:t xml:space="preserve">2. À chaque donnée, marquer un bâton dans la bonne ligne, par paquets de 5.</w:t>
       </w:r>
     </w:p>
     <w:p>
@@ -2717,7 +1569,7 @@
           <w:sz w:val="24"/>
           <w:szCs w:val="24"/>
         </w:rPr>
-        <w:t xml:space="preserve">3. Conclure : répondre à la question d’enquête et juger l’hypothèse — après avoir vérifié que le diagramme est honnête.</w:t>
+        <w:t xml:space="preserve">3. Écrire les effectifs en chiffres et vérifier : leur somme = le nombre de données.</w:t>
       </w:r>
     </w:p>
     <w:p>
@@ -2737,7 +1589,7 @@
           <w:sz w:val="24"/>
           <w:szCs w:val="24"/>
         </w:rPr>
-        <w:t xml:space="preserve">quatre gestes : lire une valeur, comparer (écarts), totaliser, conclure sur l’hypothèse ; et l’œil critique vérifie axe, largeurs, légende avant de croire l’image.</w:t>
+        <w:t xml:space="preserve">un bâton par réponse, paquets de 5 ; effectif = compte d’une ligne ; somme des effectifs = nombre d’interrogés ; tableau chronologique = données dans l’ordre du temps.</w:t>
       </w:r>
     </w:p>
     <w:p>
@@ -2757,7 +1609,7 @@
           <w:sz w:val="24"/>
           <w:szCs w:val="24"/>
         </w:rPr>
-        <w:t xml:space="preserve">Le savais-tu ? Les prévisions météo que tu entends à la radio sont de l’interprétation de données géante : des millions de mesures de température, de vent et de pression, collectées par des stations et des satellites, sont comparées aux situations passées pour conclure « demain, pluie sur les hautes terres ».</w:t>
+        <w:t xml:space="preserve">Le savais-tu ? Le plus vieil objet mathématique du monde est un os à bâtons : l’os d’Ishango, trouvé en Afrique près du lac Édouard, porte des entailles groupées vieilles d’environ 20 000 ans.</w:t>
       </w:r>
     </w:p>
     <w:p>
@@ -2777,7 +1629,7 @@
           <w:sz w:val="24"/>
           <w:szCs w:val="24"/>
         </w:rPr>
-        <w:t xml:space="preserve">Attention : Confondre « voir » et « conclure » : annoncer « la banane a perdu » sans citer les nombres. Une interprétation s’appuie toujours sur des valeurs lues et des calculs — sinon ce n’est qu’une opinion de plus.</w:t>
+        <w:t xml:space="preserve">Attention : Noter toutes les réponses en vrac et compter à la fin : on relit dix fois, on se trompe, on perd des réponses. Le bâton se marque AU MOMENT où la réponse arrive — jamais après.</w:t>
       </w:r>
     </w:p>
     <w:p>
@@ -2815,7 +1667,7 @@
           <w:sz w:val="24"/>
           <w:szCs w:val="24"/>
         </w:rPr>
-        <w:t xml:space="preserve">1. Sacs de riz vendus : lundi 12, mardi 9, mercredi 15, jeudi 9, vendredi 18. a) Quel est le meilleur jour ? b) Quels jours sont à égalité ? d) Combien de sacs dans la semaine ? e) Quel est l’écart entre le meilleur et le moins bon jour ?</w:t>
+        <w:t xml:space="preserve">1. Voici 15 réponses à « quel est ton animal préféré ? » : zébu, poule, zébu, chien, poule, zébu, poule, chien, zébu, poule, zébu, poule, chien, zébu, poule. a) Dresse le tableau avec les bâtons. b) Quel est l’effectif de « zébu » ? d) Celui de « chien » ? e) Vérifie le total.</w:t>
       </w:r>
     </w:p>
     <w:p>
@@ -2834,7 +1686,7 @@
           <w:sz w:val="24"/>
           <w:szCs w:val="24"/>
         </w:rPr>
-        <w:t xml:space="preserve">2. Retour sur l’enquête des fruits (mangue 8, banane 6, letchi 7, ananas 3). L’hypothèse de Soa était « la banane sera première ». a) Qui est premier d’après les données ? b) L’hypothèse était-elle bonne ? d) Combien d’élèves ont choisi les deux fruits les moins populaires ? e) Quelle décision prendre pour la fête ?</w:t>
+        <w:t xml:space="preserve">2. Absents de la semaine : lundi 2, mardi 1, mercredi 0, jeudi 3, vendredi 1. a) Quel jour compte le plus d’absents ? b) Quel jour n’en compte aucun ? d) Combien d’absences dans la semaine ? e) Pourquoi garder les jours dans l’ordre ?</w:t>
       </w:r>
     </w:p>
     <w:p>
@@ -2853,7 +1705,7 @@
           <w:sz w:val="24"/>
           <w:szCs w:val="24"/>
         </w:rPr>
-        <w:t xml:space="preserve">3. Esprit critique. Un vendeur affiche un diagramme dont l’axe commence à 9 : sa barre de 12 paraît immense face à celle de 10. a) Que faut-il toujours vérifier sur l’axe ? b) Que doivent avoir en commun toutes les barres ? d) Quel est l’écart réel entre 12 et 10 ? e) Pourquoi dit-on que la pensée critique protège le lecteur ?</w:t>
+        <w:t xml:space="preserve">3. L’enquête des fruits donne : mangue 8, banane 6, letchi 7, ananas ?, pour 24 élèves. a) Calcule l’effectif manquant. b) Quel est le fruit le plus choisi ? d) Quel est l’écart entre mangue et banane ? e) Combien d’élèves n’ont pas choisi la mangue ?</w:t>
       </w:r>
     </w:p>
     <w:p>
@@ -2872,7 +1724,7 @@
           <w:sz w:val="24"/>
           <w:szCs w:val="24"/>
         </w:rPr>
-        <w:t xml:space="preserve">4. Un diagramme donne le temps de lecture quotidien de 25 élèves : de 0 à 20 min : 5 élèves ; de 20 à 40 min : 4 ; de 40 à 60 min : 2 ; de 60 à 80 min : 9 ; de 80 à 100 min : 4 ; de 100 à 120 min : 1. a) Combien d’élèves lisent de 20 à 40 min ? b) Combien lisent plus d’une heure ? d) Vérifie que le total fait bien 25. e) Peut-on affirmer que certains élèves lisent plus de deux heures ?</w:t>
+        <w:t xml:space="preserve">4. Voici dix réponses au sondage « fruit préféré » : mangue, banane, mangue, letchi, banane, mangue, ananas, mangue, letchi, banane. a) Construis le tableau des effectifs. b) Quel est l’effectif de la mangue ? d) Combien de personnes ont répondu ? e) Dans quel ordre peut-on ranger les données du tableau ?</w:t>
       </w:r>
     </w:p>
     <w:p>
@@ -2891,7 +1743,7 @@
           <w:sz w:val="24"/>
           <w:szCs w:val="24"/>
         </w:rPr>
-        <w:t xml:space="preserve">5. Bols de soupe vendus par une gargote : lundi 30 ; mardi 25 ; mercredi 35 ; jeudi 20 ; vendredi 40 ; samedi 60 ; dimanche 55. a) Quel est le meilleur jour ? b) Le moins bon ? d) Quel est le total de la semaine ? e) Combien de bols de plus le samedi que le jeudi ?</w:t>
+        <w:t xml:space="preserve">5. Températures relevées à Antsirabe : lundi 18° ; mardi 16° ; mercredi 15° ; jeudi 17° ; vendredi 19° ; samedi 21° ; dimanche 20°. a) Quel type de tableau convient ? b) Quel est le jour le plus froid ? d) Quels jours dépassent 18° ? e) Pourquoi faut-il garder l’ordre des jours ?</w:t>
       </w:r>
     </w:p>
     <w:p>
@@ -2910,7 +1762,7 @@
           <w:sz w:val="24"/>
           <w:szCs w:val="24"/>
         </w:rPr>
-        <w:t xml:space="preserve">6. Défi CEPE — Pluies relevées à Mahajanga (en mm) : janvier 450 ; février 400 ; mars 200 ; juin 5 ; juillet 2 ; décembre 380. a) Quel est le mois le plus arrosé ? b) Quels mois du tableau appartiennent à la saison sèche ? d) Compare les pluies de janvier et de mars. e) Quelle conclusion tires-tu sur le climat de la ville ?</w:t>
+        <w:t xml:space="preserve">6. Défi CEPE — Au marché, Rasoa a noté les fruits choisis par ses 25 clients : mangues 7 ; fraises 8 ; bananes 4 ; mûres 3 ; pêches 3. a) Vérifie le total des effectifs. b) Quel est le fruit le plus demandé ? d) Quels fruits ont le même effectif ? e) Elle veut commander 50 fruits en respectant ces préférences : combien de fraises doit-elle prévoir ?</w:t>
       </w:r>
     </w:p>
     <w:p>
@@ -2960,7 +1812,7 @@
           <w:sz w:val="24"/>
           <w:szCs w:val="24"/>
         </w:rPr>
-        <w:t xml:space="preserve">a) vendredi (18) ; b) mardi et jeudi (9) ; d) 12 + 9 + 15 + 9 + 18 = 63 sacs ; e) 18 − 9 = 9 sacs.</w:t>
+        <w:t xml:space="preserve">a) zébu IIII I, poule IIII I, chien III ; b) 6 ; d) 3 ; e) 6 + 6 + 3 = 15 ✓.</w:t>
       </w:r>
     </w:p>
     <w:p>
@@ -2991,7 +1843,7 @@
           <w:sz w:val="24"/>
           <w:szCs w:val="24"/>
         </w:rPr>
-        <w:t xml:space="preserve">a) la mangue (8) ; b) non : la banane est troisième (6) ; d) ananas 3 + banane 6 = 9 élèves ; e) acheter surtout des mangues — les données décident.</w:t>
+        <w:t xml:space="preserve">a) jeudi (3) ; b) mercredi ; d) 2 + 1 + 0 + 3 + 1 = 7 absences ; e) parce que l’ordre du temps montre l’évolution au fil de la semaine.</w:t>
       </w:r>
     </w:p>
     <w:p>
@@ -3022,7 +1874,7 @@
           <w:sz w:val="24"/>
           <w:szCs w:val="24"/>
         </w:rPr>
-        <w:t xml:space="preserve">a) qu’il part de zéro ; b) la même largeur ; d) 12 − 10 = 2 seulement ; e) parce qu’elle fait vérifier l’image avant d’y croire : axe, largeurs, légende.</w:t>
+        <w:t xml:space="preserve">a) 24 − (8 + 6 + 7) = 24 − 21 = 3 ; b) la mangue ; d) 8 − 6 = 2 ; e) 24 − 8 = 16 élèves.</w:t>
       </w:r>
     </w:p>
     <w:p>
@@ -3053,7 +1905,7 @@
           <w:sz w:val="24"/>
           <w:szCs w:val="24"/>
         </w:rPr>
-        <w:t xml:space="preserve">a) 4 élèves ; b) 9 + 4 + 1 = 14 élèves ; d) 5 + 4 + 2 + 9 + 4 + 1 = 25 : c’est juste ; e) non : le diagramme s’arrête à 120 min, il ne donne aucune information au-delà.</w:t>
+        <w:t xml:space="preserve">a) mangue 4 ; banane 3 ; letchi 2 ; ananas 1 ; b) 4 ; d) 10 personnes ; e) par ordre alphabétique ou par effectif décroissant.</w:t>
       </w:r>
     </w:p>
     <w:p>
@@ -3084,7 +1936,7 @@
           <w:sz w:val="24"/>
           <w:szCs w:val="24"/>
         </w:rPr>
-        <w:t xml:space="preserve">a) samedi (60 bols) ; b) jeudi (20 bols) ; d) 30 + 25 + 35 + 20 + 40 + 60 + 55 = 265 bols ; e) 60 − 20 = 40 bols.</w:t>
+        <w:t xml:space="preserve">a) un tableau chronologique ; b) mercredi (15°) ; d) vendredi, samedi et dimanche ; e) pour suivre l’évolution de la température au fil du temps.</w:t>
       </w:r>
     </w:p>
     <w:p>
@@ -3115,7 +1967,7 @@
           <w:sz w:val="24"/>
           <w:szCs w:val="24"/>
         </w:rPr>
-        <w:t xml:space="preserve">a) janvier (450 mm) ; b) juin et juillet ; d) 450 mm contre 200 mm : plus du double ; e) il pleut beaucoup pendant l’été (décembre à mars) et presque pas en hiver : saison des pluies et saison sèche bien marquées.</w:t>
+        <w:t xml:space="preserve">a) 7 + 8 + 4 + 3 + 3 = 25 : le compte est bon ; b) les fraises ; d) les mûres et les pêches ; e) 8 clients sur 25 choisissent les fraises ; pour 50 fruits (le double), il faut 2 × 8 = 16 fraises.</w:t>
       </w:r>
     </w:p>
     <w:p>
@@ -3128,7 +1980,7 @@
         <w:spacing w:after="150" w:before="200"/>
         <w:jc w:val="center"/>
       </w:pPr>
-      <w:bookmarkStart w:name="u6_l5" w:id="6"/>
+      <w:bookmarkStart w:name="u6_l3" w:id="4"/>
       <w:r>
         <w:rPr>
           <w:rFonts w:ascii="Times New Roman" w:cs="Times New Roman" w:eastAsia="Times New Roman" w:hAnsi="Times New Roman"/>
@@ -3140,76 +1992,19 @@
           <w:sz w:val="32"/>
           <w:szCs w:val="32"/>
         </w:rPr>
-        <w:t xml:space="preserve">EXPÉRIENCES ALÉATOIRES ET TABLEAUX DE DÉNOMBREMENT</w:t>
-      </w:r>
-      <w:bookmarkEnd w:id="6"/>
-    </w:p>
-    <w:p>
-      <w:pPr>
-        <w:spacing w:after="150" w:before="200"/>
-        <w:jc w:val="left"/>
-      </w:pPr>
-      <w:r>
-        <w:rPr>
-          <w:rFonts w:ascii="Times New Roman" w:cs="Times New Roman" w:eastAsia="Times New Roman" w:hAnsi="Times New Roman"/>
-          <w:b/>
-          <w:bCs/>
-          <w:i w:val="false"/>
-          <w:iCs w:val="false"/>
-          <w:color w:val="2E7D32"/>
-          <w:sz w:val="28"/>
-          <w:szCs w:val="28"/>
-        </w:rPr>
-        <w:t xml:space="preserve">Expériences aléatoires : dés, pièces, jetons</w:t>
-      </w:r>
-    </w:p>
-    <w:p>
-      <w:pPr>
-        <w:spacing w:after="110" w:line="300"/>
-        <w:jc w:val="both"/>
-      </w:pPr>
-      <w:r>
-        <w:rPr>
-          <w:rFonts w:ascii="Times New Roman" w:cs="Times New Roman" w:eastAsia="Times New Roman" w:hAnsi="Times New Roman"/>
-          <w:b w:val="false"/>
-          <w:bCs w:val="false"/>
-          <w:i w:val="false"/>
-          <w:iCs w:val="false"/>
-          <w:color w:val="000000"/>
-          <w:sz w:val="24"/>
-          <w:szCs w:val="24"/>
-        </w:rPr>
-        <w:t xml:space="preserve">Une expérience aléatoire est une expérience dont le résultat ne peut pas être prévu à l’avance, même si l’on connaît la liste de tous les résultats possibles. Le tableau de dénombrement enregistre, par des bâtons puis des effectifs, le nombre de fois où chaque résultat est apparu.</w:t>
-      </w:r>
-    </w:p>
-    <w:p>
-      <w:pPr>
-        <w:spacing w:after="110" w:line="300"/>
-        <w:jc w:val="both"/>
-      </w:pPr>
-      <w:r>
-        <w:rPr>
-          <w:rFonts w:ascii="Times New Roman" w:cs="Times New Roman" w:eastAsia="Times New Roman" w:hAnsi="Times New Roman"/>
-          <w:b w:val="false"/>
-          <w:bCs w:val="false"/>
-          <w:i/>
-          <w:iCs/>
-          <w:color w:val="1F4E79"/>
-          <w:sz w:val="24"/>
-          <w:szCs w:val="24"/>
-        </w:rPr>
-        <w:t xml:space="preserve">on ne sait jamais CE QUI va sortir, mais on sait tout ce qui PEUT sortir — et on compte fidèlement ce qui EST sorti.</w:t>
-      </w:r>
-    </w:p>
-    <w:p>
-      <w:pPr>
-        <w:spacing w:after="120" w:before="120"/>
+        <w:t xml:space="preserve">DIAGRAMMES EN BARRES ET PICTOGRAMMES</w:t>
+      </w:r>
+      <w:bookmarkEnd w:id="4"/>
+    </w:p>
+    <w:p>
+      <w:pPr>
+        <w:spacing w:after="120" w:before="100"/>
         <w:jc w:val="center"/>
       </w:pPr>
       <w:r>
         <w:drawing>
           <wp:inline distT="0" distB="0" distL="0" distR="0">
-            <wp:extent cx="4762500" cy="1819275"/>
+            <wp:extent cx="4476750" cy="2438400"/>
             <wp:effectExtent t="0" r="0" b="0" l="0"/>
             <wp:docPr id="5" name=""/>
             <wp:cNvGraphicFramePr>
@@ -3234,7 +2029,7 @@
                   <pic:spPr bwMode="auto">
                     <a:xfrm>
                       <a:off x="0" y="0"/>
-                      <a:ext cx="4762500" cy="1819275"/>
+                      <a:ext cx="4476750" cy="2438400"/>
                     </a:xfrm>
                     <a:prstGeom prst="rect">
                       <a:avLst/>
@@ -3249,159 +2044,6 @@
     </w:p>
     <w:p>
       <w:pPr>
-        <w:spacing w:after="130" w:before="100" w:line="300"/>
-        <w:jc w:val="both"/>
-      </w:pPr>
-      <w:r>
-        <w:rPr>
-          <w:rFonts w:ascii="Times New Roman" w:cs="Times New Roman" w:eastAsia="Times New Roman" w:hAnsi="Times New Roman"/>
-          <w:b w:val="false"/>
-          <w:bCs w:val="false"/>
-          <w:i/>
-          <w:iCs/>
-          <w:color w:val="000000"/>
-          <w:sz w:val="24"/>
-          <w:szCs w:val="24"/>
-          <w:u w:val="single"/>
-        </w:rPr>
-        <w:t xml:space="preserve">Exemple :</w:t>
-      </w:r>
-      <w:r>
-        <w:rPr>
-          <w:rFonts w:ascii="Times New Roman" w:cs="Times New Roman" w:eastAsia="Times New Roman" w:hAnsi="Times New Roman"/>
-          <w:b w:val="false"/>
-          <w:bCs w:val="false"/>
-          <w:i w:val="false"/>
-          <w:iCs w:val="false"/>
-          <w:color w:val="000000"/>
-          <w:sz w:val="24"/>
-          <w:szCs w:val="24"/>
-        </w:rPr>
-        <w:t xml:space="preserve"> Pièce lancée 20 fois : pile IIII IIII I (11), face IIII IIII (9) ; contrôle 11 + 9 = 20 ✓.</w:t>
-      </w:r>
-    </w:p>
-    <w:p>
-      <w:pPr>
-        <w:spacing w:after="55" w:line="300"/>
-        <w:ind w:left="260"/>
-        <w:jc w:val="both"/>
-      </w:pPr>
-      <w:r>
-        <w:rPr>
-          <w:rFonts w:ascii="Times New Roman" w:cs="Times New Roman" w:eastAsia="Times New Roman" w:hAnsi="Times New Roman"/>
-          <w:b w:val="false"/>
-          <w:bCs w:val="false"/>
-          <w:i w:val="false"/>
-          <w:iCs w:val="false"/>
-          <w:color w:val="000000"/>
-          <w:sz w:val="24"/>
-          <w:szCs w:val="24"/>
-        </w:rPr>
-        <w:t xml:space="preserve">1. Lister tous les résultats possibles : une ligne de tableau chacun.</w:t>
-      </w:r>
-    </w:p>
-    <w:p>
-      <w:pPr>
-        <w:spacing w:after="55" w:line="300"/>
-        <w:ind w:left="260"/>
-        <w:jc w:val="both"/>
-      </w:pPr>
-      <w:r>
-        <w:rPr>
-          <w:rFonts w:ascii="Times New Roman" w:cs="Times New Roman" w:eastAsia="Times New Roman" w:hAnsi="Times New Roman"/>
-          <w:b w:val="false"/>
-          <w:bCs w:val="false"/>
-          <w:i w:val="false"/>
-          <w:iCs w:val="false"/>
-          <w:color w:val="000000"/>
-          <w:sz w:val="24"/>
-          <w:szCs w:val="24"/>
-        </w:rPr>
-        <w:t xml:space="preserve">2. Réaliser les essais et marquer un bâton par résultat, au fur et à mesure.</w:t>
-      </w:r>
-    </w:p>
-    <w:p>
-      <w:pPr>
-        <w:spacing w:after="55" w:line="300"/>
-        <w:ind w:left="260"/>
-        <w:jc w:val="both"/>
-      </w:pPr>
-      <w:r>
-        <w:rPr>
-          <w:rFonts w:ascii="Times New Roman" w:cs="Times New Roman" w:eastAsia="Times New Roman" w:hAnsi="Times New Roman"/>
-          <w:b w:val="false"/>
-          <w:bCs w:val="false"/>
-          <w:i w:val="false"/>
-          <w:iCs w:val="false"/>
-          <w:color w:val="000000"/>
-          <w:sz w:val="24"/>
-          <w:szCs w:val="24"/>
-        </w:rPr>
-        <w:t xml:space="preserve">3. Écrire les effectifs et contrôler : leur somme = le nombre d’essais.</w:t>
-      </w:r>
-    </w:p>
-    <w:p>
-      <w:pPr>
-        <w:shd w:fill="E8F5E9" w:val="clear"/>
-        <w:spacing w:after="110" w:line="300"/>
-        <w:jc w:val="both"/>
-      </w:pPr>
-      <w:r>
-        <w:rPr>
-          <w:rFonts w:ascii="Times New Roman" w:cs="Times New Roman" w:eastAsia="Times New Roman" w:hAnsi="Times New Roman"/>
-          <w:b/>
-          <w:bCs/>
-          <w:i w:val="false"/>
-          <w:iCs w:val="false"/>
-          <w:color w:val="000000"/>
-          <w:sz w:val="24"/>
-          <w:szCs w:val="24"/>
-        </w:rPr>
-        <w:t xml:space="preserve">aléatoire = résultat imprévisible, possibles connus ; dé (6), pièce (2), jetons (couleurs) ; tableau de dénombrement + contrôle : somme des effectifs = nombre d’essais.</w:t>
-      </w:r>
-    </w:p>
-    <w:p>
-      <w:pPr>
-        <w:shd w:fill="E3F2FD" w:val="clear"/>
-        <w:spacing w:after="110" w:line="300"/>
-        <w:jc w:val="both"/>
-      </w:pPr>
-      <w:r>
-        <w:rPr>
-          <w:rFonts w:ascii="Times New Roman" w:cs="Times New Roman" w:eastAsia="Times New Roman" w:hAnsi="Times New Roman"/>
-          <w:b w:val="false"/>
-          <w:bCs w:val="false"/>
-          <w:i w:val="false"/>
-          <w:iCs w:val="false"/>
-          <w:color w:val="1F4E79"/>
-          <w:sz w:val="24"/>
-          <w:szCs w:val="24"/>
-        </w:rPr>
-        <w:t xml:space="preserve">Le savais-tu ? Les dés sont parmi les plus vieux jouets de l’humanité : on en a retrouvé en Mésopotamie et en Égypte vieux de 5 000 ans, souvent taillés dans des osselets de zébu ou de mouton — l’astragale.</w:t>
-      </w:r>
-    </w:p>
-    <w:p>
-      <w:pPr>
-        <w:shd w:fill="FFF8E1" w:val="clear"/>
-        <w:spacing w:after="110" w:line="300"/>
-        <w:jc w:val="both"/>
-      </w:pPr>
-      <w:r>
-        <w:rPr>
-          <w:rFonts w:ascii="Times New Roman" w:cs="Times New Roman" w:eastAsia="Times New Roman" w:hAnsi="Times New Roman"/>
-          <w:b w:val="false"/>
-          <w:bCs w:val="false"/>
-          <w:i w:val="false"/>
-          <w:iCs w:val="false"/>
-          <w:color w:val="000000"/>
-          <w:sz w:val="24"/>
-          <w:szCs w:val="24"/>
-        </w:rPr>
-        <w:t xml:space="preserve">Attention : Croire que le hasard a de la mémoire : « le 6 n’est pas sorti depuis longtemps, il va forcément sortir ». Faux ! Le dé ne se souvient de rien : chaque lancer repart de zéro.</w:t>
-      </w:r>
-    </w:p>
-    <w:p>
-      <w:pPr>
         <w:spacing w:after="150" w:before="200"/>
         <w:jc w:val="left"/>
       </w:pPr>
@@ -3416,7 +2058,7 @@
           <w:sz w:val="28"/>
           <w:szCs w:val="28"/>
         </w:rPr>
-        <w:t xml:space="preserve">EXERCICE</w:t>
+        <w:t xml:space="preserve">Représentations : barres et pictogrammes</w:t>
       </w:r>
     </w:p>
     <w:p>
@@ -3435,371 +2077,7 @@
           <w:sz w:val="24"/>
           <w:szCs w:val="24"/>
         </w:rPr>
-        <w:t xml:space="preserve">1. Expérience aléatoire ou non ? Justifie. a) Lancer un dé. b) Mesurer la longueur de la table avec une règle. d) Tirer un jeton d’un sac sans regarder. e) Se demander si le soleil se lèvera demain.</w:t>
-      </w:r>
-    </w:p>
-    <w:p>
-      <w:pPr>
-        <w:spacing w:after="110" w:line="300"/>
-        <w:jc w:val="both"/>
-      </w:pPr>
-      <w:r>
-        <w:rPr>
-          <w:rFonts w:ascii="Times New Roman" w:cs="Times New Roman" w:eastAsia="Times New Roman" w:hAnsi="Times New Roman"/>
-          <w:b w:val="false"/>
-          <w:bCs w:val="false"/>
-          <w:i w:val="false"/>
-          <w:iCs w:val="false"/>
-          <w:color w:val="000000"/>
-          <w:sz w:val="24"/>
-          <w:szCs w:val="24"/>
-        </w:rPr>
-        <w:t xml:space="preserve">2. Dé lancé 30 fois : face 1 → 4 fois, face 2 → 6, face 3 → 5, face 4 → 7, face 5 → 3, face 6 → 5. a) Quelle face est la plus sortie ? b) La moins sortie ? d) Calcule la somme des effectifs. e) À quoi cette somme doit-elle être égale ?</w:t>
-      </w:r>
-    </w:p>
-    <w:p>
-      <w:pPr>
-        <w:spacing w:after="110" w:line="300"/>
-        <w:jc w:val="both"/>
-      </w:pPr>
-      <w:r>
-        <w:rPr>
-          <w:rFonts w:ascii="Times New Roman" w:cs="Times New Roman" w:eastAsia="Times New Roman" w:hAnsi="Times New Roman"/>
-          <w:b w:val="false"/>
-          <w:bCs w:val="false"/>
-          <w:i w:val="false"/>
-          <w:iCs w:val="false"/>
-          <w:color w:val="000000"/>
-          <w:sz w:val="24"/>
-          <w:szCs w:val="24"/>
-        </w:rPr>
-        <w:t xml:space="preserve">3. Pièce lancée 50 fois : pile 27 fois, face 23 fois. a) Quel est l’effectif de pile ? b) Celui de face ? d) Vérifie le contrôle du tableau. e) Les deux résultats sortent-ils à peu près aussi souvent ?</w:t>
-      </w:r>
-    </w:p>
-    <w:p>
-      <w:pPr>
-        <w:spacing w:after="110" w:line="300"/>
-        <w:jc w:val="both"/>
-      </w:pPr>
-      <w:r>
-        <w:rPr>
-          <w:rFonts w:ascii="Times New Roman" w:cs="Times New Roman" w:eastAsia="Times New Roman" w:hAnsi="Times New Roman"/>
-          <w:b w:val="false"/>
-          <w:bCs w:val="false"/>
-          <w:i w:val="false"/>
-          <w:iCs w:val="false"/>
-          <w:color w:val="000000"/>
-          <w:sz w:val="24"/>
-          <w:szCs w:val="24"/>
-        </w:rPr>
-        <w:t xml:space="preserve">4. On lance un dé à six faces. a) Cite toutes les issues possibles. b) Combien y en a-t-il ? d) L’issue « 7 » est-elle possible ? e) Toutes les issues ont-elles la même chance de sortir ?</w:t>
-      </w:r>
-    </w:p>
-    <w:p>
-      <w:pPr>
-        <w:spacing w:after="110" w:line="300"/>
-        <w:jc w:val="both"/>
-      </w:pPr>
-      <w:r>
-        <w:rPr>
-          <w:rFonts w:ascii="Times New Roman" w:cs="Times New Roman" w:eastAsia="Times New Roman" w:hAnsi="Times New Roman"/>
-          <w:b w:val="false"/>
-          <w:bCs w:val="false"/>
-          <w:i w:val="false"/>
-          <w:iCs w:val="false"/>
-          <w:color w:val="000000"/>
-          <w:sz w:val="24"/>
-          <w:szCs w:val="24"/>
-        </w:rPr>
-        <w:t xml:space="preserve">5. Un sac contient 3 boules rouges, 2 boules bleues et 1 boule jaune ; on tire une boule au hasard. a) Quelles sont les issues possibles ? b) Combien de boules en tout ? d) Quelle couleur a le plus de chances de sortir ? e) Dresse le tableau de dénombrement des boules.</w:t>
-      </w:r>
-    </w:p>
-    <w:p>
-      <w:pPr>
-        <w:spacing w:after="110" w:line="300"/>
-        <w:jc w:val="both"/>
-      </w:pPr>
-      <w:r>
-        <w:rPr>
-          <w:rFonts w:ascii="Times New Roman" w:cs="Times New Roman" w:eastAsia="Times New Roman" w:hAnsi="Times New Roman"/>
-          <w:b w:val="false"/>
-          <w:bCs w:val="false"/>
-          <w:i w:val="false"/>
-          <w:iCs w:val="false"/>
-          <w:color w:val="000000"/>
-          <w:sz w:val="24"/>
-          <w:szCs w:val="24"/>
-        </w:rPr>
-        <w:t xml:space="preserve">6. Défi CEPE — On lance deux pièces de monnaie en même temps (P pour pile, F pour face). a) Liste toutes les issues possibles. b) Combien y en a-t-il ? d) Combien d’issues donnent exactement un pile ? e) « Deux piles » et « deux faces » ont-ils la même chance ?</w:t>
-      </w:r>
-    </w:p>
-    <w:p>
-      <w:pPr>
-        <w:spacing w:after="150" w:before="200"/>
-        <w:jc w:val="left"/>
-      </w:pPr>
-      <w:r>
-        <w:rPr>
-          <w:rFonts w:ascii="Times New Roman" w:cs="Times New Roman" w:eastAsia="Times New Roman" w:hAnsi="Times New Roman"/>
-          <w:b/>
-          <w:bCs/>
-          <w:i w:val="false"/>
-          <w:iCs w:val="false"/>
-          <w:color w:val="2E7D32"/>
-          <w:sz w:val="28"/>
-          <w:szCs w:val="28"/>
-        </w:rPr>
-        <w:t xml:space="preserve">Correction</w:t>
-      </w:r>
-    </w:p>
-    <w:p>
-      <w:pPr>
-        <w:spacing w:after="80"/>
-      </w:pPr>
-      <w:r>
-        <w:rPr>
-          <w:rFonts w:ascii="Times New Roman" w:cs="Times New Roman" w:eastAsia="Times New Roman" w:hAnsi="Times New Roman"/>
-          <w:b/>
-          <w:bCs/>
-          <w:i w:val="false"/>
-          <w:iCs w:val="false"/>
-          <w:color w:val="C2185B"/>
-          <w:sz w:val="24"/>
-          <w:szCs w:val="24"/>
-        </w:rPr>
-        <w:t xml:space="preserve">1. </w:t>
-      </w:r>
-      <w:r>
-        <w:rPr>
-          <w:rFonts w:ascii="Times New Roman" w:cs="Times New Roman" w:eastAsia="Times New Roman" w:hAnsi="Times New Roman"/>
-          <w:b w:val="false"/>
-          <w:bCs w:val="false"/>
-          <w:i w:val="false"/>
-          <w:iCs w:val="false"/>
-          <w:color w:val="000000"/>
-          <w:sz w:val="24"/>
-          <w:szCs w:val="24"/>
-        </w:rPr>
-        <w:t xml:space="preserve">a) oui : résultat imprévisible parmi six possibles ; b) non : le résultat se mesure, il n’y a pas de hasard ; d) oui : couleur imprévisible parmi les couleurs du sac ; e) non : le résultat est certain.</w:t>
-      </w:r>
-    </w:p>
-    <w:p>
-      <w:pPr>
-        <w:spacing w:after="80"/>
-      </w:pPr>
-      <w:r>
-        <w:rPr>
-          <w:rFonts w:ascii="Times New Roman" w:cs="Times New Roman" w:eastAsia="Times New Roman" w:hAnsi="Times New Roman"/>
-          <w:b/>
-          <w:bCs/>
-          <w:i w:val="false"/>
-          <w:iCs w:val="false"/>
-          <w:color w:val="C2185B"/>
-          <w:sz w:val="24"/>
-          <w:szCs w:val="24"/>
-        </w:rPr>
-        <w:t xml:space="preserve">2. </w:t>
-      </w:r>
-      <w:r>
-        <w:rPr>
-          <w:rFonts w:ascii="Times New Roman" w:cs="Times New Roman" w:eastAsia="Times New Roman" w:hAnsi="Times New Roman"/>
-          <w:b w:val="false"/>
-          <w:bCs w:val="false"/>
-          <w:i w:val="false"/>
-          <w:iCs w:val="false"/>
-          <w:color w:val="000000"/>
-          <w:sz w:val="24"/>
-          <w:szCs w:val="24"/>
-        </w:rPr>
-        <w:t xml:space="preserve">a) la face 4 (7 fois) ; b) la face 5 (3 fois) ; d) 4 + 6 + 5 + 7 + 3 + 5 = 30 ; e) au nombre de lancers : 30 ✓.</w:t>
-      </w:r>
-    </w:p>
-    <w:p>
-      <w:pPr>
-        <w:spacing w:after="80"/>
-      </w:pPr>
-      <w:r>
-        <w:rPr>
-          <w:rFonts w:ascii="Times New Roman" w:cs="Times New Roman" w:eastAsia="Times New Roman" w:hAnsi="Times New Roman"/>
-          <w:b/>
-          <w:bCs/>
-          <w:i w:val="false"/>
-          <w:iCs w:val="false"/>
-          <w:color w:val="C2185B"/>
-          <w:sz w:val="24"/>
-          <w:szCs w:val="24"/>
-        </w:rPr>
-        <w:t xml:space="preserve">3. </w:t>
-      </w:r>
-      <w:r>
-        <w:rPr>
-          <w:rFonts w:ascii="Times New Roman" w:cs="Times New Roman" w:eastAsia="Times New Roman" w:hAnsi="Times New Roman"/>
-          <w:b w:val="false"/>
-          <w:bCs w:val="false"/>
-          <w:i w:val="false"/>
-          <w:iCs w:val="false"/>
-          <w:color w:val="000000"/>
-          <w:sz w:val="24"/>
-          <w:szCs w:val="24"/>
-        </w:rPr>
-        <w:t xml:space="preserve">a) 27 ; b) 23 ; d) 27 + 23 = 50 ✓ ; e) oui : presque moitié-moitié, 27 contre 23.</w:t>
-      </w:r>
-    </w:p>
-    <w:p>
-      <w:pPr>
-        <w:spacing w:after="80"/>
-      </w:pPr>
-      <w:r>
-        <w:rPr>
-          <w:rFonts w:ascii="Times New Roman" w:cs="Times New Roman" w:eastAsia="Times New Roman" w:hAnsi="Times New Roman"/>
-          <w:b/>
-          <w:bCs/>
-          <w:i w:val="false"/>
-          <w:iCs w:val="false"/>
-          <w:color w:val="C2185B"/>
-          <w:sz w:val="24"/>
-          <w:szCs w:val="24"/>
-        </w:rPr>
-        <w:t xml:space="preserve">4. </w:t>
-      </w:r>
-      <w:r>
-        <w:rPr>
-          <w:rFonts w:ascii="Times New Roman" w:cs="Times New Roman" w:eastAsia="Times New Roman" w:hAnsi="Times New Roman"/>
-          <w:b w:val="false"/>
-          <w:bCs w:val="false"/>
-          <w:i w:val="false"/>
-          <w:iCs w:val="false"/>
-          <w:color w:val="000000"/>
-          <w:sz w:val="24"/>
-          <w:szCs w:val="24"/>
-        </w:rPr>
-        <w:t xml:space="preserve">a) 1, 2, 3, 4, 5 et 6 ; b) 6 issues ; d) non : elle n’existe pas sur le dé ; e) oui, si le dé est équilibré : c’est l’équiprobabilité.</w:t>
-      </w:r>
-    </w:p>
-    <w:p>
-      <w:pPr>
-        <w:spacing w:after="80"/>
-      </w:pPr>
-      <w:r>
-        <w:rPr>
-          <w:rFonts w:ascii="Times New Roman" w:cs="Times New Roman" w:eastAsia="Times New Roman" w:hAnsi="Times New Roman"/>
-          <w:b/>
-          <w:bCs/>
-          <w:i w:val="false"/>
-          <w:iCs w:val="false"/>
-          <w:color w:val="C2185B"/>
-          <w:sz w:val="24"/>
-          <w:szCs w:val="24"/>
-        </w:rPr>
-        <w:t xml:space="preserve">5. </w:t>
-      </w:r>
-      <w:r>
-        <w:rPr>
-          <w:rFonts w:ascii="Times New Roman" w:cs="Times New Roman" w:eastAsia="Times New Roman" w:hAnsi="Times New Roman"/>
-          <w:b w:val="false"/>
-          <w:bCs w:val="false"/>
-          <w:i w:val="false"/>
-          <w:iCs w:val="false"/>
-          <w:color w:val="000000"/>
-          <w:sz w:val="24"/>
-          <w:szCs w:val="24"/>
-        </w:rPr>
-        <w:t xml:space="preserve">a) rouge, bleu, jaune ; b) 3 + 2 + 1 = 6 boules ; d) le rouge : 3 boules sur 6 ; e) tableau : rouge 3 ; bleu 2 ; jaune 1.</w:t>
-      </w:r>
-    </w:p>
-    <w:p>
-      <w:pPr>
-        <w:spacing w:after="80"/>
-      </w:pPr>
-      <w:r>
-        <w:rPr>
-          <w:rFonts w:ascii="Times New Roman" w:cs="Times New Roman" w:eastAsia="Times New Roman" w:hAnsi="Times New Roman"/>
-          <w:b/>
-          <w:bCs/>
-          <w:i w:val="false"/>
-          <w:iCs w:val="false"/>
-          <w:color w:val="C2185B"/>
-          <w:sz w:val="24"/>
-          <w:szCs w:val="24"/>
-        </w:rPr>
-        <w:t xml:space="preserve">6. </w:t>
-      </w:r>
-      <w:r>
-        <w:rPr>
-          <w:rFonts w:ascii="Times New Roman" w:cs="Times New Roman" w:eastAsia="Times New Roman" w:hAnsi="Times New Roman"/>
-          <w:b w:val="false"/>
-          <w:bCs w:val="false"/>
-          <w:i w:val="false"/>
-          <w:iCs w:val="false"/>
-          <w:color w:val="000000"/>
-          <w:sz w:val="24"/>
-          <w:szCs w:val="24"/>
-        </w:rPr>
-        <w:t xml:space="preserve">a) PP, PF, FP, FF ; b) 4 issues ; d) 2 issues : PF et FP ; e) oui : une chance sur quatre chacune.</w:t>
-      </w:r>
-    </w:p>
-    <w:p>
-      <w:r>
-        <w:br w:type="page"/>
-      </w:r>
-    </w:p>
-    <w:p>
-      <w:pPr>
-        <w:spacing w:after="150" w:before="200"/>
-        <w:jc w:val="center"/>
-      </w:pPr>
-      <w:bookmarkStart w:name="u6_l6" w:id="7"/>
-      <w:r>
-        <w:rPr>
-          <w:rFonts w:ascii="Times New Roman" w:cs="Times New Roman" w:eastAsia="Times New Roman" w:hAnsi="Times New Roman"/>
-          <w:b/>
-          <w:bCs/>
-          <w:i w:val="false"/>
-          <w:iCs w:val="false"/>
-          <w:color w:val="C00000"/>
-          <w:sz w:val="32"/>
-          <w:szCs w:val="32"/>
-        </w:rPr>
-        <w:t xml:space="preserve">LA PROBABILITÉ EXPÉRIMENTALE</w:t>
-      </w:r>
-      <w:bookmarkEnd w:id="7"/>
-    </w:p>
-    <w:p>
-      <w:pPr>
-        <w:spacing w:after="150" w:before="200"/>
-        <w:jc w:val="left"/>
-      </w:pPr>
-      <w:r>
-        <w:rPr>
-          <w:rFonts w:ascii="Times New Roman" w:cs="Times New Roman" w:eastAsia="Times New Roman" w:hAnsi="Times New Roman"/>
-          <w:b/>
-          <w:bCs/>
-          <w:i w:val="false"/>
-          <w:iCs w:val="false"/>
-          <w:color w:val="2E7D32"/>
-          <w:sz w:val="28"/>
-          <w:szCs w:val="28"/>
-        </w:rPr>
-        <w:t xml:space="preserve">Fréquences et probabilité expérimentale</w:t>
-      </w:r>
-    </w:p>
-    <w:p>
-      <w:pPr>
-        <w:spacing w:after="110" w:line="300"/>
-        <w:jc w:val="both"/>
-      </w:pPr>
-      <w:r>
-        <w:rPr>
-          <w:rFonts w:ascii="Times New Roman" w:cs="Times New Roman" w:eastAsia="Times New Roman" w:hAnsi="Times New Roman"/>
-          <w:b w:val="false"/>
-          <w:bCs w:val="false"/>
-          <w:i w:val="false"/>
-          <w:iCs w:val="false"/>
-          <w:color w:val="000000"/>
-          <w:sz w:val="24"/>
-          <w:szCs w:val="24"/>
-        </w:rPr>
-        <w:t xml:space="preserve">La fréquence d’un résultat est le quotient de son effectif par le nombre total d’essais. La probabilité expérimentale d’un résultat est sa fréquence observée sur un grand nombre d’essais : elle estime la chance que ce résultat se produise.</w:t>
+        <w:t xml:space="preserve">Un diagramme en barres représente chaque effectif par une barre : toutes les barres ont la même largeur, et la hauteur de chaque barre est proportionnelle à l’effectif. Un pictogramme représente les effectifs par de petits symboles identiques ; sa légende indique combien d’unités vaut un symbole.</w:t>
       </w:r>
     </w:p>
     <w:p>
@@ -3818,7 +2096,7 @@
           <w:sz w:val="24"/>
           <w:szCs w:val="24"/>
         </w:rPr>
-        <w:t xml:space="preserve">la fréquence répond à « quelle part des essais a donné ce résultat ? » — et cette part, mesurée longtemps, devient la meilleure prédiction du futur.</w:t>
+        <w:t xml:space="preserve">le diagramme en barres, c’est le tableau debout : plus l’effectif est grand, plus sa barre monte ; le pictogramme raconte la même chose avec des petits dessins.</w:t>
       </w:r>
     </w:p>
     <w:p>
@@ -3829,7 +2107,7 @@
       <w:r>
         <w:drawing>
           <wp:inline distT="0" distB="0" distL="0" distR="0">
-            <wp:extent cx="4762500" cy="2476500"/>
+            <wp:extent cx="4762500" cy="2324100"/>
             <wp:effectExtent t="0" r="0" b="0" l="0"/>
             <wp:docPr id="6" name=""/>
             <wp:cNvGraphicFramePr>
@@ -3846,6 +2124,2004 @@
                   </pic:nvPicPr>
                   <pic:blipFill>
                     <a:blip r:embed="rId14" cstate="none"/>
+                    <a:srcRect/>
+                    <a:stretch>
+                      <a:fillRect/>
+                    </a:stretch>
+                  </pic:blipFill>
+                  <pic:spPr bwMode="auto">
+                    <a:xfrm>
+                      <a:off x="0" y="0"/>
+                      <a:ext cx="4762500" cy="2324100"/>
+                    </a:xfrm>
+                    <a:prstGeom prst="rect">
+                      <a:avLst/>
+                    </a:prstGeom>
+                  </pic:spPr>
+                </pic:pic>
+              </a:graphicData>
+            </a:graphic>
+          </wp:inline>
+        </w:drawing>
+      </w:r>
+    </w:p>
+    <w:p>
+      <w:pPr>
+        <w:spacing w:after="130" w:before="100" w:line="300"/>
+        <w:jc w:val="both"/>
+      </w:pPr>
+      <w:r>
+        <w:rPr>
+          <w:rFonts w:ascii="Times New Roman" w:cs="Times New Roman" w:eastAsia="Times New Roman" w:hAnsi="Times New Roman"/>
+          <w:b w:val="false"/>
+          <w:bCs w:val="false"/>
+          <w:i/>
+          <w:iCs/>
+          <w:color w:val="000000"/>
+          <w:sz w:val="24"/>
+          <w:szCs w:val="24"/>
+          <w:u w:val="single"/>
+        </w:rPr>
+        <w:t xml:space="preserve">Exemple :</w:t>
+      </w:r>
+      <w:r>
+        <w:rPr>
+          <w:rFonts w:ascii="Times New Roman" w:cs="Times New Roman" w:eastAsia="Times New Roman" w:hAnsi="Times New Roman"/>
+          <w:b w:val="false"/>
+          <w:bCs w:val="false"/>
+          <w:i w:val="false"/>
+          <w:iCs w:val="false"/>
+          <w:color w:val="000000"/>
+          <w:sz w:val="24"/>
+          <w:szCs w:val="24"/>
+        </w:rPr>
+        <w:t xml:space="preserve"> Effectif 14 avec la légende « 1 symbole = 4 » : 14 ÷ 4 = 3 reste 2, donc 3 symboles et un demi-symbole.</w:t>
+      </w:r>
+    </w:p>
+    <w:p>
+      <w:pPr>
+        <w:spacing w:after="55" w:line="300"/>
+        <w:ind w:left="260"/>
+        <w:jc w:val="both"/>
+      </w:pPr>
+      <w:r>
+        <w:rPr>
+          <w:rFonts w:ascii="Times New Roman" w:cs="Times New Roman" w:eastAsia="Times New Roman" w:hAnsi="Times New Roman"/>
+          <w:b w:val="false"/>
+          <w:bCs w:val="false"/>
+          <w:i w:val="false"/>
+          <w:iCs w:val="false"/>
+          <w:color w:val="000000"/>
+          <w:sz w:val="24"/>
+          <w:szCs w:val="24"/>
+        </w:rPr>
+        <w:t xml:space="preserve">1. Choisir l’échelle : 1 carreau (ou 1 symbole) = combien d’unités ?</w:t>
+      </w:r>
+    </w:p>
+    <w:p>
+      <w:pPr>
+        <w:spacing w:after="55" w:line="300"/>
+        <w:ind w:left="260"/>
+        <w:jc w:val="both"/>
+      </w:pPr>
+      <w:r>
+        <w:rPr>
+          <w:rFonts w:ascii="Times New Roman" w:cs="Times New Roman" w:eastAsia="Times New Roman" w:hAnsi="Times New Roman"/>
+          <w:b w:val="false"/>
+          <w:bCs w:val="false"/>
+          <w:i w:val="false"/>
+          <w:iCs w:val="false"/>
+          <w:color w:val="000000"/>
+          <w:sz w:val="24"/>
+          <w:szCs w:val="24"/>
+        </w:rPr>
+        <w:t xml:space="preserve">2. Tracer une barre (ou une rangée de symboles) par réponse, à la bonne hauteur.</w:t>
+      </w:r>
+    </w:p>
+    <w:p>
+      <w:pPr>
+        <w:spacing w:after="55" w:line="300"/>
+        <w:ind w:left="260"/>
+        <w:jc w:val="both"/>
+      </w:pPr>
+      <w:r>
+        <w:rPr>
+          <w:rFonts w:ascii="Times New Roman" w:cs="Times New Roman" w:eastAsia="Times New Roman" w:hAnsi="Times New Roman"/>
+          <w:b w:val="false"/>
+          <w:bCs w:val="false"/>
+          <w:i w:val="false"/>
+          <w:iCs w:val="false"/>
+          <w:color w:val="000000"/>
+          <w:sz w:val="24"/>
+          <w:szCs w:val="24"/>
+        </w:rPr>
+        <w:t xml:space="preserve">3. Étiqueter : noms, effectifs, et la légende du pictogramme.</w:t>
+      </w:r>
+    </w:p>
+    <w:p>
+      <w:pPr>
+        <w:shd w:fill="E8F5E9" w:val="clear"/>
+        <w:spacing w:after="110" w:line="300"/>
+        <w:jc w:val="both"/>
+      </w:pPr>
+      <w:r>
+        <w:rPr>
+          <w:rFonts w:ascii="Times New Roman" w:cs="Times New Roman" w:eastAsia="Times New Roman" w:hAnsi="Times New Roman"/>
+          <w:b/>
+          <w:bCs/>
+          <w:i w:val="false"/>
+          <w:iCs w:val="false"/>
+          <w:color w:val="000000"/>
+          <w:sz w:val="24"/>
+          <w:szCs w:val="24"/>
+        </w:rPr>
+        <w:t xml:space="preserve">barres : même largeur, échelle régulière partant de zéro, hauteur proportionnelle à l’effectif ; pictogramme : symboles identiques + légende obligatoire ; demi-symbole permis.</w:t>
+      </w:r>
+    </w:p>
+    <w:p>
+      <w:pPr>
+        <w:shd w:fill="E3F2FD" w:val="clear"/>
+        <w:spacing w:after="110" w:line="300"/>
+        <w:jc w:val="both"/>
+      </w:pPr>
+      <w:r>
+        <w:rPr>
+          <w:rFonts w:ascii="Times New Roman" w:cs="Times New Roman" w:eastAsia="Times New Roman" w:hAnsi="Times New Roman"/>
+          <w:b w:val="false"/>
+          <w:bCs w:val="false"/>
+          <w:i w:val="false"/>
+          <w:iCs w:val="false"/>
+          <w:color w:val="1F4E79"/>
+          <w:sz w:val="24"/>
+          <w:szCs w:val="24"/>
+        </w:rPr>
+        <w:t xml:space="preserve">Le savais-tu ? Le diagramme en barres a un inventeur : l’Écossais William Playfair, en 1786.</w:t>
+      </w:r>
+    </w:p>
+    <w:p>
+      <w:pPr>
+        <w:shd w:fill="FFF8E1" w:val="clear"/>
+        <w:spacing w:after="110" w:line="300"/>
+        <w:jc w:val="both"/>
+      </w:pPr>
+      <w:r>
+        <w:rPr>
+          <w:rFonts w:ascii="Times New Roman" w:cs="Times New Roman" w:eastAsia="Times New Roman" w:hAnsi="Times New Roman"/>
+          <w:b w:val="false"/>
+          <w:bCs w:val="false"/>
+          <w:i w:val="false"/>
+          <w:iCs w:val="false"/>
+          <w:color w:val="000000"/>
+          <w:sz w:val="24"/>
+          <w:szCs w:val="24"/>
+        </w:rPr>
+        <w:t xml:space="preserve">Attention : Dessiner des barres de largeurs différentes : la barre large paraît plus importante même si elle est moins haute, et le lecteur est trompé. La largeur ne change JAMAIS ; seule la hauteur parle.</w:t>
+      </w:r>
+    </w:p>
+    <w:p>
+      <w:pPr>
+        <w:spacing w:after="150" w:before="200"/>
+        <w:jc w:val="left"/>
+      </w:pPr>
+      <w:r>
+        <w:rPr>
+          <w:rFonts w:ascii="Times New Roman" w:cs="Times New Roman" w:eastAsia="Times New Roman" w:hAnsi="Times New Roman"/>
+          <w:b/>
+          <w:bCs/>
+          <w:i w:val="false"/>
+          <w:iCs w:val="false"/>
+          <w:color w:val="2E7D32"/>
+          <w:sz w:val="28"/>
+          <w:szCs w:val="28"/>
+        </w:rPr>
+        <w:t xml:space="preserve">EXERCICE</w:t>
+      </w:r>
+    </w:p>
+    <w:p>
+      <w:pPr>
+        <w:spacing w:after="110" w:line="300"/>
+        <w:jc w:val="both"/>
+      </w:pPr>
+      <w:r>
+        <w:rPr>
+          <w:rFonts w:ascii="Times New Roman" w:cs="Times New Roman" w:eastAsia="Times New Roman" w:hAnsi="Times New Roman"/>
+          <w:b w:val="false"/>
+          <w:bCs w:val="false"/>
+          <w:i w:val="false"/>
+          <w:iCs w:val="false"/>
+          <w:color w:val="000000"/>
+          <w:sz w:val="24"/>
+          <w:szCs w:val="24"/>
+        </w:rPr>
+        <w:t xml:space="preserve">1. Avec les effectifs mangue 8, banane 6, letchi 7, ananas 3 et l’échelle 1 carreau = 1 élève : a) hauteur de la barre « mangue » ? b) Hauteur de la barre « banane » ? d) Quelle barre est la plus haute ? e) Trace le diagramme complet sur papier quadrillé.</w:t>
+      </w:r>
+    </w:p>
+    <w:p>
+      <w:pPr>
+        <w:spacing w:after="110" w:line="300"/>
+        <w:jc w:val="both"/>
+      </w:pPr>
+      <w:r>
+        <w:rPr>
+          <w:rFonts w:ascii="Times New Roman" w:cs="Times New Roman" w:eastAsia="Times New Roman" w:hAnsi="Times New Roman"/>
+          <w:b w:val="false"/>
+          <w:bCs w:val="false"/>
+          <w:i w:val="false"/>
+          <w:iCs w:val="false"/>
+          <w:color w:val="000000"/>
+          <w:sz w:val="24"/>
+          <w:szCs w:val="24"/>
+        </w:rPr>
+        <w:t xml:space="preserve">2. Pictogramme avec la légende « 1 rond = 2 élèves » : a) combien de ronds pour la mangue (8) ? b) Pour la banane (6) ? d) Pour le letchi (7) ? e) Pourquoi la légende est-elle indispensable ?</w:t>
+      </w:r>
+    </w:p>
+    <w:p>
+      <w:pPr>
+        <w:spacing w:after="110" w:line="300"/>
+        <w:jc w:val="both"/>
+      </w:pPr>
+      <w:r>
+        <w:rPr>
+          <w:rFonts w:ascii="Times New Roman" w:cs="Times New Roman" w:eastAsia="Times New Roman" w:hAnsi="Times New Roman"/>
+          <w:b w:val="false"/>
+          <w:bCs w:val="false"/>
+          <w:i w:val="false"/>
+          <w:iCs w:val="false"/>
+          <w:color w:val="000000"/>
+          <w:sz w:val="24"/>
+          <w:szCs w:val="24"/>
+        </w:rPr>
+        <w:t xml:space="preserve">3. Livres lus pendant les vacances : Hanta 5, Rivo 3, Soa 6, Naly 2. a) Qui a lu le plus ? b) Qui a lu le moins ? d) Combien de livres en tout ? e) Trace le diagramme en barres (1 carreau = 1 livre).</w:t>
+      </w:r>
+    </w:p>
+    <w:p>
+      <w:pPr>
+        <w:spacing w:after="110" w:line="300"/>
+        <w:jc w:val="both"/>
+      </w:pPr>
+      <w:r>
+        <w:rPr>
+          <w:rFonts w:ascii="Times New Roman" w:cs="Times New Roman" w:eastAsia="Times New Roman" w:hAnsi="Times New Roman"/>
+          <w:b w:val="false"/>
+          <w:bCs w:val="false"/>
+          <w:i w:val="false"/>
+          <w:iCs w:val="false"/>
+          <w:color w:val="000000"/>
+          <w:sz w:val="24"/>
+          <w:szCs w:val="24"/>
+        </w:rPr>
+        <w:t xml:space="preserve">4. Un diagramme en barres donne les inscriptions aux activités : football 12 ; basket 8 ; course 6 ; danse 4. a) Quelle barre est la plus haute ? b) Combien d’élèves inscrits en tout ? d) Combien d’inscrits de plus au football qu’en danse ? e) Avec un pictogramme où un dessin vaut 2 élèves, combien de dessins pour le basket ?</w:t>
+      </w:r>
+    </w:p>
+    <w:p>
+      <w:pPr>
+        <w:spacing w:after="110" w:line="300"/>
+        <w:jc w:val="both"/>
+      </w:pPr>
+      <w:r>
+        <w:rPr>
+          <w:rFonts w:ascii="Times New Roman" w:cs="Times New Roman" w:eastAsia="Times New Roman" w:hAnsi="Times New Roman"/>
+          <w:b w:val="false"/>
+          <w:bCs w:val="false"/>
+          <w:i w:val="false"/>
+          <w:iCs w:val="false"/>
+          <w:color w:val="000000"/>
+          <w:sz w:val="24"/>
+          <w:szCs w:val="24"/>
+        </w:rPr>
+        <w:t xml:space="preserve">5. On veut construire un diagramme en barres pour les récoltes : riz 9 sacs ; maïs 6 ; manioc 12 ; patate douce 3. a) Que représente l’axe vertical ? b) Quelle sera la barre la plus haute ? d) Si l’axe est gradué de 3 en 3, à combien de graduations monte la barre du maïs ? e) Construis le diagramme sur ton cahier.</w:t>
+      </w:r>
+    </w:p>
+    <w:p>
+      <w:pPr>
+        <w:spacing w:after="110" w:line="300"/>
+        <w:jc w:val="both"/>
+      </w:pPr>
+      <w:r>
+        <w:rPr>
+          <w:rFonts w:ascii="Times New Roman" w:cs="Times New Roman" w:eastAsia="Times New Roman" w:hAnsi="Times New Roman"/>
+          <w:b w:val="false"/>
+          <w:bCs w:val="false"/>
+          <w:i w:val="false"/>
+          <w:iCs w:val="false"/>
+          <w:color w:val="000000"/>
+          <w:sz w:val="24"/>
+          <w:szCs w:val="24"/>
+        </w:rPr>
+        <w:t xml:space="preserve">6. Défi CEPE — Un pictogramme montre les zébus de quatre villages ; chaque dessin vaut 10 zébus. Village A : 4 dessins ; village B : 6 dessins ; village D : 3 dessins et demi ; village E : 2 dessins. a) Combien de zébus au village A ? b) Au village D ? d) Combien en tout ? e) Que représente le demi-dessin ?</w:t>
+      </w:r>
+    </w:p>
+    <w:p>
+      <w:pPr>
+        <w:spacing w:after="150" w:before="200"/>
+        <w:jc w:val="left"/>
+      </w:pPr>
+      <w:r>
+        <w:rPr>
+          <w:rFonts w:ascii="Times New Roman" w:cs="Times New Roman" w:eastAsia="Times New Roman" w:hAnsi="Times New Roman"/>
+          <w:b/>
+          <w:bCs/>
+          <w:i w:val="false"/>
+          <w:iCs w:val="false"/>
+          <w:color w:val="2E7D32"/>
+          <w:sz w:val="28"/>
+          <w:szCs w:val="28"/>
+        </w:rPr>
+        <w:t xml:space="preserve">Correction</w:t>
+      </w:r>
+    </w:p>
+    <w:p>
+      <w:pPr>
+        <w:spacing w:after="80"/>
+      </w:pPr>
+      <w:r>
+        <w:rPr>
+          <w:rFonts w:ascii="Times New Roman" w:cs="Times New Roman" w:eastAsia="Times New Roman" w:hAnsi="Times New Roman"/>
+          <w:b/>
+          <w:bCs/>
+          <w:i w:val="false"/>
+          <w:iCs w:val="false"/>
+          <w:color w:val="C2185B"/>
+          <w:sz w:val="24"/>
+          <w:szCs w:val="24"/>
+        </w:rPr>
+        <w:t xml:space="preserve">1. </w:t>
+      </w:r>
+      <w:r>
+        <w:rPr>
+          <w:rFonts w:ascii="Times New Roman" w:cs="Times New Roman" w:eastAsia="Times New Roman" w:hAnsi="Times New Roman"/>
+          <w:b w:val="false"/>
+          <w:bCs w:val="false"/>
+          <w:i w:val="false"/>
+          <w:iCs w:val="false"/>
+          <w:color w:val="000000"/>
+          <w:sz w:val="24"/>
+          <w:szCs w:val="24"/>
+        </w:rPr>
+        <w:t xml:space="preserve">a) 8 carreaux ; b) 6 carreaux ; d) la mangue ; e) quatre barres de même largeur, hauteurs 8, 6, 7, 3, noms dessous et effectifs au sommet.</w:t>
+      </w:r>
+    </w:p>
+    <w:p>
+      <w:pPr>
+        <w:spacing w:after="80"/>
+      </w:pPr>
+      <w:r>
+        <w:rPr>
+          <w:rFonts w:ascii="Times New Roman" w:cs="Times New Roman" w:eastAsia="Times New Roman" w:hAnsi="Times New Roman"/>
+          <w:b/>
+          <w:bCs/>
+          <w:i w:val="false"/>
+          <w:iCs w:val="false"/>
+          <w:color w:val="C2185B"/>
+          <w:sz w:val="24"/>
+          <w:szCs w:val="24"/>
+        </w:rPr>
+        <w:t xml:space="preserve">2. </w:t>
+      </w:r>
+      <w:r>
+        <w:rPr>
+          <w:rFonts w:ascii="Times New Roman" w:cs="Times New Roman" w:eastAsia="Times New Roman" w:hAnsi="Times New Roman"/>
+          <w:b w:val="false"/>
+          <w:bCs w:val="false"/>
+          <w:i w:val="false"/>
+          <w:iCs w:val="false"/>
+          <w:color w:val="000000"/>
+          <w:sz w:val="24"/>
+          <w:szCs w:val="24"/>
+        </w:rPr>
+        <w:t xml:space="preserve">a) 8 ÷ 2 = 4 ronds ; b) 3 ronds ; d) 3 ronds et demi ; e) sans elle, on ignore la valeur d’un symbole : le pictogramme devient illisible.</w:t>
+      </w:r>
+    </w:p>
+    <w:p>
+      <w:pPr>
+        <w:spacing w:after="80"/>
+      </w:pPr>
+      <w:r>
+        <w:rPr>
+          <w:rFonts w:ascii="Times New Roman" w:cs="Times New Roman" w:eastAsia="Times New Roman" w:hAnsi="Times New Roman"/>
+          <w:b/>
+          <w:bCs/>
+          <w:i w:val="false"/>
+          <w:iCs w:val="false"/>
+          <w:color w:val="C2185B"/>
+          <w:sz w:val="24"/>
+          <w:szCs w:val="24"/>
+        </w:rPr>
+        <w:t xml:space="preserve">3. </w:t>
+      </w:r>
+      <w:r>
+        <w:rPr>
+          <w:rFonts w:ascii="Times New Roman" w:cs="Times New Roman" w:eastAsia="Times New Roman" w:hAnsi="Times New Roman"/>
+          <w:b w:val="false"/>
+          <w:bCs w:val="false"/>
+          <w:i w:val="false"/>
+          <w:iCs w:val="false"/>
+          <w:color w:val="000000"/>
+          <w:sz w:val="24"/>
+          <w:szCs w:val="24"/>
+        </w:rPr>
+        <w:t xml:space="preserve">a) Soa (6) ; b) Naly (2) ; d) 5 + 3 + 6 + 2 = 16 livres ; e) barres de hauteurs 5, 3, 6, 2 avec la même largeur.</w:t>
+      </w:r>
+    </w:p>
+    <w:p>
+      <w:pPr>
+        <w:spacing w:after="80"/>
+      </w:pPr>
+      <w:r>
+        <w:rPr>
+          <w:rFonts w:ascii="Times New Roman" w:cs="Times New Roman" w:eastAsia="Times New Roman" w:hAnsi="Times New Roman"/>
+          <w:b/>
+          <w:bCs/>
+          <w:i w:val="false"/>
+          <w:iCs w:val="false"/>
+          <w:color w:val="C2185B"/>
+          <w:sz w:val="24"/>
+          <w:szCs w:val="24"/>
+        </w:rPr>
+        <w:t xml:space="preserve">4. </w:t>
+      </w:r>
+      <w:r>
+        <w:rPr>
+          <w:rFonts w:ascii="Times New Roman" w:cs="Times New Roman" w:eastAsia="Times New Roman" w:hAnsi="Times New Roman"/>
+          <w:b w:val="false"/>
+          <w:bCs w:val="false"/>
+          <w:i w:val="false"/>
+          <w:iCs w:val="false"/>
+          <w:color w:val="000000"/>
+          <w:sz w:val="24"/>
+          <w:szCs w:val="24"/>
+        </w:rPr>
+        <w:t xml:space="preserve">a) celle du football ; b) 12 + 8 + 6 + 4 = 30 élèves ; d) 12 − 4 = 8 ; e) 8 ÷ 2 = 4 dessins.</w:t>
+      </w:r>
+    </w:p>
+    <w:p>
+      <w:pPr>
+        <w:spacing w:after="80"/>
+      </w:pPr>
+      <w:r>
+        <w:rPr>
+          <w:rFonts w:ascii="Times New Roman" w:cs="Times New Roman" w:eastAsia="Times New Roman" w:hAnsi="Times New Roman"/>
+          <w:b/>
+          <w:bCs/>
+          <w:i w:val="false"/>
+          <w:iCs w:val="false"/>
+          <w:color w:val="C2185B"/>
+          <w:sz w:val="24"/>
+          <w:szCs w:val="24"/>
+        </w:rPr>
+        <w:t xml:space="preserve">5. </w:t>
+      </w:r>
+      <w:r>
+        <w:rPr>
+          <w:rFonts w:ascii="Times New Roman" w:cs="Times New Roman" w:eastAsia="Times New Roman" w:hAnsi="Times New Roman"/>
+          <w:b w:val="false"/>
+          <w:bCs w:val="false"/>
+          <w:i w:val="false"/>
+          <w:iCs w:val="false"/>
+          <w:color w:val="000000"/>
+          <w:sz w:val="24"/>
+          <w:szCs w:val="24"/>
+        </w:rPr>
+        <w:t xml:space="preserve">a) le nombre de sacs ; b) celle du manioc (12) ; d) 2 graduations (6 = 2 × 3) ; e) quatre barres de hauteurs 9, 6, 12 et 3.</w:t>
+      </w:r>
+    </w:p>
+    <w:p>
+      <w:pPr>
+        <w:spacing w:after="80"/>
+      </w:pPr>
+      <w:r>
+        <w:rPr>
+          <w:rFonts w:ascii="Times New Roman" w:cs="Times New Roman" w:eastAsia="Times New Roman" w:hAnsi="Times New Roman"/>
+          <w:b/>
+          <w:bCs/>
+          <w:i w:val="false"/>
+          <w:iCs w:val="false"/>
+          <w:color w:val="C2185B"/>
+          <w:sz w:val="24"/>
+          <w:szCs w:val="24"/>
+        </w:rPr>
+        <w:t xml:space="preserve">6. </w:t>
+      </w:r>
+      <w:r>
+        <w:rPr>
+          <w:rFonts w:ascii="Times New Roman" w:cs="Times New Roman" w:eastAsia="Times New Roman" w:hAnsi="Times New Roman"/>
+          <w:b w:val="false"/>
+          <w:bCs w:val="false"/>
+          <w:i w:val="false"/>
+          <w:iCs w:val="false"/>
+          <w:color w:val="000000"/>
+          <w:sz w:val="24"/>
+          <w:szCs w:val="24"/>
+        </w:rPr>
+        <w:t xml:space="preserve">a) 4 × 10 = 40 zébus ; b) 35 zébus ; d) 40 + 60 + 35 + 20 = 155 zébus ; e) la moitié de 10, soit 5 zébus.</w:t>
+      </w:r>
+    </w:p>
+    <w:p>
+      <w:r>
+        <w:br w:type="page"/>
+      </w:r>
+    </w:p>
+    <w:p>
+      <w:pPr>
+        <w:spacing w:after="150" w:before="200"/>
+        <w:jc w:val="center"/>
+      </w:pPr>
+      <w:bookmarkStart w:name="u6_l4" w:id="5"/>
+      <w:r>
+        <w:rPr>
+          <w:rFonts w:ascii="Times New Roman" w:cs="Times New Roman" w:eastAsia="Times New Roman" w:hAnsi="Times New Roman"/>
+          <w:b/>
+          <w:bCs/>
+          <w:i w:val="false"/>
+          <w:iCs w:val="false"/>
+          <w:color w:val="C00000"/>
+          <w:sz w:val="32"/>
+          <w:szCs w:val="32"/>
+        </w:rPr>
+        <w:t xml:space="preserve">INTERPRÉTER DES DONNÉES</w:t>
+      </w:r>
+      <w:bookmarkEnd w:id="5"/>
+    </w:p>
+    <w:p>
+      <w:pPr>
+        <w:spacing w:after="120" w:before="100"/>
+        <w:jc w:val="center"/>
+      </w:pPr>
+      <w:r>
+        <w:drawing>
+          <wp:inline distT="0" distB="0" distL="0" distR="0">
+            <wp:extent cx="4476750" cy="2438400"/>
+            <wp:effectExtent t="0" r="0" b="0" l="0"/>
+            <wp:docPr id="7" name=""/>
+            <wp:cNvGraphicFramePr>
+              <a:graphicFrameLocks xmlns:a="http://schemas.openxmlformats.org/drawingml/2006/main" noChangeAspect="1"/>
+            </wp:cNvGraphicFramePr>
+            <a:graphic xmlns:a="http://schemas.openxmlformats.org/drawingml/2006/main">
+              <a:graphicData uri="http://schemas.openxmlformats.org/drawingml/2006/picture">
+                <pic:pic xmlns:pic="http://schemas.openxmlformats.org/drawingml/2006/picture">
+                  <pic:nvPicPr>
+                    <pic:cNvPr id="0" name="" descr=""/>
+                    <pic:cNvPicPr>
+                      <a:picLocks noChangeAspect="1" noChangeArrowheads="1"/>
+                    </pic:cNvPicPr>
+                  </pic:nvPicPr>
+                  <pic:blipFill>
+                    <a:blip r:embed="rId15" cstate="none"/>
+                    <a:srcRect/>
+                    <a:stretch>
+                      <a:fillRect/>
+                    </a:stretch>
+                  </pic:blipFill>
+                  <pic:spPr bwMode="auto">
+                    <a:xfrm>
+                      <a:off x="0" y="0"/>
+                      <a:ext cx="4476750" cy="2438400"/>
+                    </a:xfrm>
+                    <a:prstGeom prst="rect">
+                      <a:avLst/>
+                    </a:prstGeom>
+                  </pic:spPr>
+                </pic:pic>
+              </a:graphicData>
+            </a:graphic>
+          </wp:inline>
+        </w:drawing>
+      </w:r>
+    </w:p>
+    <w:p>
+      <w:pPr>
+        <w:spacing w:after="150" w:before="200"/>
+        <w:jc w:val="left"/>
+      </w:pPr>
+      <w:r>
+        <w:rPr>
+          <w:rFonts w:ascii="Times New Roman" w:cs="Times New Roman" w:eastAsia="Times New Roman" w:hAnsi="Times New Roman"/>
+          <w:b/>
+          <w:bCs/>
+          <w:i w:val="false"/>
+          <w:iCs w:val="false"/>
+          <w:color w:val="2E7D32"/>
+          <w:sz w:val="28"/>
+          <w:szCs w:val="28"/>
+        </w:rPr>
+        <w:t xml:space="preserve">Lecture et interprétation de données</w:t>
+      </w:r>
+    </w:p>
+    <w:p>
+      <w:pPr>
+        <w:spacing w:after="110" w:line="300"/>
+        <w:jc w:val="both"/>
+      </w:pPr>
+      <w:r>
+        <w:rPr>
+          <w:rFonts w:ascii="Times New Roman" w:cs="Times New Roman" w:eastAsia="Times New Roman" w:hAnsi="Times New Roman"/>
+          <w:b w:val="false"/>
+          <w:bCs w:val="false"/>
+          <w:i w:val="false"/>
+          <w:iCs w:val="false"/>
+          <w:color w:val="000000"/>
+          <w:sz w:val="24"/>
+          <w:szCs w:val="24"/>
+        </w:rPr>
+        <w:t xml:space="preserve">Interpréter des données, c’est en tirer des informations et des conclusions : lire des valeurs, comparer les effectifs, calculer des totaux et des écarts, répondre à la question d’enquête et dire si l’hypothèse de départ était bonne.</w:t>
+      </w:r>
+    </w:p>
+    <w:p>
+      <w:pPr>
+        <w:spacing w:after="110" w:line="300"/>
+        <w:jc w:val="both"/>
+      </w:pPr>
+      <w:r>
+        <w:rPr>
+          <w:rFonts w:ascii="Times New Roman" w:cs="Times New Roman" w:eastAsia="Times New Roman" w:hAnsi="Times New Roman"/>
+          <w:b w:val="false"/>
+          <w:bCs w:val="false"/>
+          <w:i/>
+          <w:iCs/>
+          <w:color w:val="1F4E79"/>
+          <w:sz w:val="24"/>
+          <w:szCs w:val="24"/>
+        </w:rPr>
+        <w:t xml:space="preserve">le tableau et le diagramme sont des témoins : interpréter, c’est les interroger — qui est premier ? de combien ? et alors, que décide-t-on ?</w:t>
+      </w:r>
+    </w:p>
+    <w:p>
+      <w:pPr>
+        <w:spacing w:after="120" w:before="120"/>
+        <w:jc w:val="center"/>
+      </w:pPr>
+      <w:r>
+        <w:drawing>
+          <wp:inline distT="0" distB="0" distL="0" distR="0">
+            <wp:extent cx="4762500" cy="2143125"/>
+            <wp:effectExtent t="0" r="0" b="0" l="0"/>
+            <wp:docPr id="8" name=""/>
+            <wp:cNvGraphicFramePr>
+              <a:graphicFrameLocks xmlns:a="http://schemas.openxmlformats.org/drawingml/2006/main" noChangeAspect="1"/>
+            </wp:cNvGraphicFramePr>
+            <a:graphic xmlns:a="http://schemas.openxmlformats.org/drawingml/2006/main">
+              <a:graphicData uri="http://schemas.openxmlformats.org/drawingml/2006/picture">
+                <pic:pic xmlns:pic="http://schemas.openxmlformats.org/drawingml/2006/picture">
+                  <pic:nvPicPr>
+                    <pic:cNvPr id="0" name="" descr=""/>
+                    <pic:cNvPicPr>
+                      <a:picLocks noChangeAspect="1" noChangeArrowheads="1"/>
+                    </pic:cNvPicPr>
+                  </pic:nvPicPr>
+                  <pic:blipFill>
+                    <a:blip r:embed="rId16" cstate="none"/>
+                    <a:srcRect/>
+                    <a:stretch>
+                      <a:fillRect/>
+                    </a:stretch>
+                  </pic:blipFill>
+                  <pic:spPr bwMode="auto">
+                    <a:xfrm>
+                      <a:off x="0" y="0"/>
+                      <a:ext cx="4762500" cy="2143125"/>
+                    </a:xfrm>
+                    <a:prstGeom prst="rect">
+                      <a:avLst/>
+                    </a:prstGeom>
+                  </pic:spPr>
+                </pic:pic>
+              </a:graphicData>
+            </a:graphic>
+          </wp:inline>
+        </w:drawing>
+      </w:r>
+    </w:p>
+    <w:p>
+      <w:pPr>
+        <w:spacing w:after="130" w:before="100" w:line="300"/>
+        <w:jc w:val="both"/>
+      </w:pPr>
+      <w:r>
+        <w:rPr>
+          <w:rFonts w:ascii="Times New Roman" w:cs="Times New Roman" w:eastAsia="Times New Roman" w:hAnsi="Times New Roman"/>
+          <w:b w:val="false"/>
+          <w:bCs w:val="false"/>
+          <w:i/>
+          <w:iCs/>
+          <w:color w:val="000000"/>
+          <w:sz w:val="24"/>
+          <w:szCs w:val="24"/>
+          <w:u w:val="single"/>
+        </w:rPr>
+        <w:t xml:space="preserve">Exemple :</w:t>
+      </w:r>
+      <w:r>
+        <w:rPr>
+          <w:rFonts w:ascii="Times New Roman" w:cs="Times New Roman" w:eastAsia="Times New Roman" w:hAnsi="Times New Roman"/>
+          <w:b w:val="false"/>
+          <w:bCs w:val="false"/>
+          <w:i w:val="false"/>
+          <w:iCs w:val="false"/>
+          <w:color w:val="000000"/>
+          <w:sz w:val="24"/>
+          <w:szCs w:val="24"/>
+        </w:rPr>
+        <w:t xml:space="preserve"> Ventes : lundi 12, mardi 9, mercredi 15 → le meilleur jour est mercredi ; écart avec mardi : 15 − 9 = 6 ; total 36.</w:t>
+      </w:r>
+    </w:p>
+    <w:p>
+      <w:pPr>
+        <w:spacing w:after="55" w:line="300"/>
+        <w:ind w:left="260"/>
+        <w:jc w:val="both"/>
+      </w:pPr>
+      <w:r>
+        <w:rPr>
+          <w:rFonts w:ascii="Times New Roman" w:cs="Times New Roman" w:eastAsia="Times New Roman" w:hAnsi="Times New Roman"/>
+          <w:b w:val="false"/>
+          <w:bCs w:val="false"/>
+          <w:i w:val="false"/>
+          <w:iCs w:val="false"/>
+          <w:color w:val="000000"/>
+          <w:sz w:val="24"/>
+          <w:szCs w:val="24"/>
+        </w:rPr>
+        <w:t xml:space="preserve">1. Lire les valeurs demandées directement sur le tableau ou les barres.</w:t>
+      </w:r>
+    </w:p>
+    <w:p>
+      <w:pPr>
+        <w:spacing w:after="55" w:line="300"/>
+        <w:ind w:left="260"/>
+        <w:jc w:val="both"/>
+      </w:pPr>
+      <w:r>
+        <w:rPr>
+          <w:rFonts w:ascii="Times New Roman" w:cs="Times New Roman" w:eastAsia="Times New Roman" w:hAnsi="Times New Roman"/>
+          <w:b w:val="false"/>
+          <w:bCs w:val="false"/>
+          <w:i w:val="false"/>
+          <w:iCs w:val="false"/>
+          <w:color w:val="000000"/>
+          <w:sz w:val="24"/>
+          <w:szCs w:val="24"/>
+        </w:rPr>
+        <w:t xml:space="preserve">2. Comparer : plus grand, plus petit, écarts, et calculer le total.</w:t>
+      </w:r>
+    </w:p>
+    <w:p>
+      <w:pPr>
+        <w:spacing w:after="55" w:line="300"/>
+        <w:ind w:left="260"/>
+        <w:jc w:val="both"/>
+      </w:pPr>
+      <w:r>
+        <w:rPr>
+          <w:rFonts w:ascii="Times New Roman" w:cs="Times New Roman" w:eastAsia="Times New Roman" w:hAnsi="Times New Roman"/>
+          <w:b w:val="false"/>
+          <w:bCs w:val="false"/>
+          <w:i w:val="false"/>
+          <w:iCs w:val="false"/>
+          <w:color w:val="000000"/>
+          <w:sz w:val="24"/>
+          <w:szCs w:val="24"/>
+        </w:rPr>
+        <w:t xml:space="preserve">3. Conclure : répondre à la question d’enquête et juger l’hypothèse — après avoir vérifié que le diagramme est honnête.</w:t>
+      </w:r>
+    </w:p>
+    <w:p>
+      <w:pPr>
+        <w:shd w:fill="E8F5E9" w:val="clear"/>
+        <w:spacing w:after="110" w:line="300"/>
+        <w:jc w:val="both"/>
+      </w:pPr>
+      <w:r>
+        <w:rPr>
+          <w:rFonts w:ascii="Times New Roman" w:cs="Times New Roman" w:eastAsia="Times New Roman" w:hAnsi="Times New Roman"/>
+          <w:b/>
+          <w:bCs/>
+          <w:i w:val="false"/>
+          <w:iCs w:val="false"/>
+          <w:color w:val="000000"/>
+          <w:sz w:val="24"/>
+          <w:szCs w:val="24"/>
+        </w:rPr>
+        <w:t xml:space="preserve">quatre gestes : lire une valeur, comparer (écarts), totaliser, conclure sur l’hypothèse ; et l’œil critique vérifie axe, largeurs, légende avant de croire l’image.</w:t>
+      </w:r>
+    </w:p>
+    <w:p>
+      <w:pPr>
+        <w:shd w:fill="E3F2FD" w:val="clear"/>
+        <w:spacing w:after="110" w:line="300"/>
+        <w:jc w:val="both"/>
+      </w:pPr>
+      <w:r>
+        <w:rPr>
+          <w:rFonts w:ascii="Times New Roman" w:cs="Times New Roman" w:eastAsia="Times New Roman" w:hAnsi="Times New Roman"/>
+          <w:b w:val="false"/>
+          <w:bCs w:val="false"/>
+          <w:i w:val="false"/>
+          <w:iCs w:val="false"/>
+          <w:color w:val="1F4E79"/>
+          <w:sz w:val="24"/>
+          <w:szCs w:val="24"/>
+        </w:rPr>
+        <w:t xml:space="preserve">Le savais-tu ? Les prévisions météo que tu entends à la radio sont de l’interprétation de données géante : des millions de mesures de température, de vent et de pression, collectées par des stations et des satellites, sont comparées aux situations passées pour conclure « demain, pluie sur les hautes terres ».</w:t>
+      </w:r>
+    </w:p>
+    <w:p>
+      <w:pPr>
+        <w:shd w:fill="FFF8E1" w:val="clear"/>
+        <w:spacing w:after="110" w:line="300"/>
+        <w:jc w:val="both"/>
+      </w:pPr>
+      <w:r>
+        <w:rPr>
+          <w:rFonts w:ascii="Times New Roman" w:cs="Times New Roman" w:eastAsia="Times New Roman" w:hAnsi="Times New Roman"/>
+          <w:b w:val="false"/>
+          <w:bCs w:val="false"/>
+          <w:i w:val="false"/>
+          <w:iCs w:val="false"/>
+          <w:color w:val="000000"/>
+          <w:sz w:val="24"/>
+          <w:szCs w:val="24"/>
+        </w:rPr>
+        <w:t xml:space="preserve">Attention : Confondre « voir » et « conclure » : annoncer « la banane a perdu » sans citer les nombres. Une interprétation s’appuie toujours sur des valeurs lues et des calculs — sinon ce n’est qu’une opinion de plus.</w:t>
+      </w:r>
+    </w:p>
+    <w:p>
+      <w:pPr>
+        <w:spacing w:after="150" w:before="200"/>
+        <w:jc w:val="left"/>
+      </w:pPr>
+      <w:r>
+        <w:rPr>
+          <w:rFonts w:ascii="Times New Roman" w:cs="Times New Roman" w:eastAsia="Times New Roman" w:hAnsi="Times New Roman"/>
+          <w:b/>
+          <w:bCs/>
+          <w:i w:val="false"/>
+          <w:iCs w:val="false"/>
+          <w:color w:val="2E7D32"/>
+          <w:sz w:val="28"/>
+          <w:szCs w:val="28"/>
+        </w:rPr>
+        <w:t xml:space="preserve">EXERCICE</w:t>
+      </w:r>
+    </w:p>
+    <w:p>
+      <w:pPr>
+        <w:spacing w:after="110" w:line="300"/>
+        <w:jc w:val="both"/>
+      </w:pPr>
+      <w:r>
+        <w:rPr>
+          <w:rFonts w:ascii="Times New Roman" w:cs="Times New Roman" w:eastAsia="Times New Roman" w:hAnsi="Times New Roman"/>
+          <w:b w:val="false"/>
+          <w:bCs w:val="false"/>
+          <w:i w:val="false"/>
+          <w:iCs w:val="false"/>
+          <w:color w:val="000000"/>
+          <w:sz w:val="24"/>
+          <w:szCs w:val="24"/>
+        </w:rPr>
+        <w:t xml:space="preserve">1. Sacs de riz vendus : lundi 12, mardi 9, mercredi 15, jeudi 9, vendredi 18. a) Quel est le meilleur jour ? b) Quels jours sont à égalité ? d) Combien de sacs dans la semaine ? e) Quel est l’écart entre le meilleur et le moins bon jour ?</w:t>
+      </w:r>
+    </w:p>
+    <w:p>
+      <w:pPr>
+        <w:spacing w:after="110" w:line="300"/>
+        <w:jc w:val="both"/>
+      </w:pPr>
+      <w:r>
+        <w:rPr>
+          <w:rFonts w:ascii="Times New Roman" w:cs="Times New Roman" w:eastAsia="Times New Roman" w:hAnsi="Times New Roman"/>
+          <w:b w:val="false"/>
+          <w:bCs w:val="false"/>
+          <w:i w:val="false"/>
+          <w:iCs w:val="false"/>
+          <w:color w:val="000000"/>
+          <w:sz w:val="24"/>
+          <w:szCs w:val="24"/>
+        </w:rPr>
+        <w:t xml:space="preserve">2. Retour sur l’enquête des fruits (mangue 8, banane 6, letchi 7, ananas 3). L’hypothèse de Soa était « la banane sera première ». a) Qui est premier d’après les données ? b) L’hypothèse était-elle bonne ? d) Combien d’élèves ont choisi les deux fruits les moins populaires ? e) Quelle décision prendre pour la fête ?</w:t>
+      </w:r>
+    </w:p>
+    <w:p>
+      <w:pPr>
+        <w:spacing w:after="110" w:line="300"/>
+        <w:jc w:val="both"/>
+      </w:pPr>
+      <w:r>
+        <w:rPr>
+          <w:rFonts w:ascii="Times New Roman" w:cs="Times New Roman" w:eastAsia="Times New Roman" w:hAnsi="Times New Roman"/>
+          <w:b w:val="false"/>
+          <w:bCs w:val="false"/>
+          <w:i w:val="false"/>
+          <w:iCs w:val="false"/>
+          <w:color w:val="000000"/>
+          <w:sz w:val="24"/>
+          <w:szCs w:val="24"/>
+        </w:rPr>
+        <w:t xml:space="preserve">3. Esprit critique. Un vendeur affiche un diagramme dont l’axe commence à 9 : sa barre de 12 paraît immense face à celle de 10. a) Que faut-il toujours vérifier sur l’axe ? b) Que doivent avoir en commun toutes les barres ? d) Quel est l’écart réel entre 12 et 10 ? e) Pourquoi dit-on que la pensée critique protège le lecteur ?</w:t>
+      </w:r>
+    </w:p>
+    <w:p>
+      <w:pPr>
+        <w:spacing w:after="110" w:line="300"/>
+        <w:jc w:val="both"/>
+      </w:pPr>
+      <w:r>
+        <w:rPr>
+          <w:rFonts w:ascii="Times New Roman" w:cs="Times New Roman" w:eastAsia="Times New Roman" w:hAnsi="Times New Roman"/>
+          <w:b w:val="false"/>
+          <w:bCs w:val="false"/>
+          <w:i w:val="false"/>
+          <w:iCs w:val="false"/>
+          <w:color w:val="000000"/>
+          <w:sz w:val="24"/>
+          <w:szCs w:val="24"/>
+        </w:rPr>
+        <w:t xml:space="preserve">4. Un diagramme donne le temps de lecture quotidien de 25 élèves : de 0 à 20 min : 5 élèves ; de 20 à 40 min : 4 ; de 40 à 60 min : 2 ; de 60 à 80 min : 9 ; de 80 à 100 min : 4 ; de 100 à 120 min : 1. a) Combien d’élèves lisent de 20 à 40 min ? b) Combien lisent plus d’une heure ? d) Vérifie que le total fait bien 25. e) Peut-on affirmer que certains élèves lisent plus de deux heures ?</w:t>
+      </w:r>
+    </w:p>
+    <w:p>
+      <w:pPr>
+        <w:spacing w:after="110" w:line="300"/>
+        <w:jc w:val="both"/>
+      </w:pPr>
+      <w:r>
+        <w:rPr>
+          <w:rFonts w:ascii="Times New Roman" w:cs="Times New Roman" w:eastAsia="Times New Roman" w:hAnsi="Times New Roman"/>
+          <w:b w:val="false"/>
+          <w:bCs w:val="false"/>
+          <w:i w:val="false"/>
+          <w:iCs w:val="false"/>
+          <w:color w:val="000000"/>
+          <w:sz w:val="24"/>
+          <w:szCs w:val="24"/>
+        </w:rPr>
+        <w:t xml:space="preserve">5. Bols de soupe vendus par une gargote : lundi 30 ; mardi 25 ; mercredi 35 ; jeudi 20 ; vendredi 40 ; samedi 60 ; dimanche 55. a) Quel est le meilleur jour ? b) Le moins bon ? d) Quel est le total de la semaine ? e) Combien de bols de plus le samedi que le jeudi ?</w:t>
+      </w:r>
+    </w:p>
+    <w:p>
+      <w:pPr>
+        <w:spacing w:after="110" w:line="300"/>
+        <w:jc w:val="both"/>
+      </w:pPr>
+      <w:r>
+        <w:rPr>
+          <w:rFonts w:ascii="Times New Roman" w:cs="Times New Roman" w:eastAsia="Times New Roman" w:hAnsi="Times New Roman"/>
+          <w:b w:val="false"/>
+          <w:bCs w:val="false"/>
+          <w:i w:val="false"/>
+          <w:iCs w:val="false"/>
+          <w:color w:val="000000"/>
+          <w:sz w:val="24"/>
+          <w:szCs w:val="24"/>
+        </w:rPr>
+        <w:t xml:space="preserve">6. Défi CEPE — Pluies relevées à Mahajanga (en mm) : janvier 450 ; février 400 ; mars 200 ; juin 5 ; juillet 2 ; décembre 380. a) Quel est le mois le plus arrosé ? b) Quels mois du tableau appartiennent à la saison sèche ? d) Compare les pluies de janvier et de mars. e) Quelle conclusion tires-tu sur le climat de la ville ?</w:t>
+      </w:r>
+    </w:p>
+    <w:p>
+      <w:pPr>
+        <w:spacing w:after="150" w:before="200"/>
+        <w:jc w:val="left"/>
+      </w:pPr>
+      <w:r>
+        <w:rPr>
+          <w:rFonts w:ascii="Times New Roman" w:cs="Times New Roman" w:eastAsia="Times New Roman" w:hAnsi="Times New Roman"/>
+          <w:b/>
+          <w:bCs/>
+          <w:i w:val="false"/>
+          <w:iCs w:val="false"/>
+          <w:color w:val="2E7D32"/>
+          <w:sz w:val="28"/>
+          <w:szCs w:val="28"/>
+        </w:rPr>
+        <w:t xml:space="preserve">Correction</w:t>
+      </w:r>
+    </w:p>
+    <w:p>
+      <w:pPr>
+        <w:spacing w:after="80"/>
+      </w:pPr>
+      <w:r>
+        <w:rPr>
+          <w:rFonts w:ascii="Times New Roman" w:cs="Times New Roman" w:eastAsia="Times New Roman" w:hAnsi="Times New Roman"/>
+          <w:b/>
+          <w:bCs/>
+          <w:i w:val="false"/>
+          <w:iCs w:val="false"/>
+          <w:color w:val="C2185B"/>
+          <w:sz w:val="24"/>
+          <w:szCs w:val="24"/>
+        </w:rPr>
+        <w:t xml:space="preserve">1. </w:t>
+      </w:r>
+      <w:r>
+        <w:rPr>
+          <w:rFonts w:ascii="Times New Roman" w:cs="Times New Roman" w:eastAsia="Times New Roman" w:hAnsi="Times New Roman"/>
+          <w:b w:val="false"/>
+          <w:bCs w:val="false"/>
+          <w:i w:val="false"/>
+          <w:iCs w:val="false"/>
+          <w:color w:val="000000"/>
+          <w:sz w:val="24"/>
+          <w:szCs w:val="24"/>
+        </w:rPr>
+        <w:t xml:space="preserve">a) vendredi (18) ; b) mardi et jeudi (9) ; d) 12 + 9 + 15 + 9 + 18 = 63 sacs ; e) 18 − 9 = 9 sacs.</w:t>
+      </w:r>
+    </w:p>
+    <w:p>
+      <w:pPr>
+        <w:spacing w:after="80"/>
+      </w:pPr>
+      <w:r>
+        <w:rPr>
+          <w:rFonts w:ascii="Times New Roman" w:cs="Times New Roman" w:eastAsia="Times New Roman" w:hAnsi="Times New Roman"/>
+          <w:b/>
+          <w:bCs/>
+          <w:i w:val="false"/>
+          <w:iCs w:val="false"/>
+          <w:color w:val="C2185B"/>
+          <w:sz w:val="24"/>
+          <w:szCs w:val="24"/>
+        </w:rPr>
+        <w:t xml:space="preserve">2. </w:t>
+      </w:r>
+      <w:r>
+        <w:rPr>
+          <w:rFonts w:ascii="Times New Roman" w:cs="Times New Roman" w:eastAsia="Times New Roman" w:hAnsi="Times New Roman"/>
+          <w:b w:val="false"/>
+          <w:bCs w:val="false"/>
+          <w:i w:val="false"/>
+          <w:iCs w:val="false"/>
+          <w:color w:val="000000"/>
+          <w:sz w:val="24"/>
+          <w:szCs w:val="24"/>
+        </w:rPr>
+        <w:t xml:space="preserve">a) la mangue (8) ; b) non : la banane est troisième (6) ; d) ananas 3 + banane 6 = 9 élèves ; e) acheter surtout des mangues — les données décident.</w:t>
+      </w:r>
+    </w:p>
+    <w:p>
+      <w:pPr>
+        <w:spacing w:after="80"/>
+      </w:pPr>
+      <w:r>
+        <w:rPr>
+          <w:rFonts w:ascii="Times New Roman" w:cs="Times New Roman" w:eastAsia="Times New Roman" w:hAnsi="Times New Roman"/>
+          <w:b/>
+          <w:bCs/>
+          <w:i w:val="false"/>
+          <w:iCs w:val="false"/>
+          <w:color w:val="C2185B"/>
+          <w:sz w:val="24"/>
+          <w:szCs w:val="24"/>
+        </w:rPr>
+        <w:t xml:space="preserve">3. </w:t>
+      </w:r>
+      <w:r>
+        <w:rPr>
+          <w:rFonts w:ascii="Times New Roman" w:cs="Times New Roman" w:eastAsia="Times New Roman" w:hAnsi="Times New Roman"/>
+          <w:b w:val="false"/>
+          <w:bCs w:val="false"/>
+          <w:i w:val="false"/>
+          <w:iCs w:val="false"/>
+          <w:color w:val="000000"/>
+          <w:sz w:val="24"/>
+          <w:szCs w:val="24"/>
+        </w:rPr>
+        <w:t xml:space="preserve">a) qu’il part de zéro ; b) la même largeur ; d) 12 − 10 = 2 seulement ; e) parce qu’elle fait vérifier l’image avant d’y croire : axe, largeurs, légende.</w:t>
+      </w:r>
+    </w:p>
+    <w:p>
+      <w:pPr>
+        <w:spacing w:after="80"/>
+      </w:pPr>
+      <w:r>
+        <w:rPr>
+          <w:rFonts w:ascii="Times New Roman" w:cs="Times New Roman" w:eastAsia="Times New Roman" w:hAnsi="Times New Roman"/>
+          <w:b/>
+          <w:bCs/>
+          <w:i w:val="false"/>
+          <w:iCs w:val="false"/>
+          <w:color w:val="C2185B"/>
+          <w:sz w:val="24"/>
+          <w:szCs w:val="24"/>
+        </w:rPr>
+        <w:t xml:space="preserve">4. </w:t>
+      </w:r>
+      <w:r>
+        <w:rPr>
+          <w:rFonts w:ascii="Times New Roman" w:cs="Times New Roman" w:eastAsia="Times New Roman" w:hAnsi="Times New Roman"/>
+          <w:b w:val="false"/>
+          <w:bCs w:val="false"/>
+          <w:i w:val="false"/>
+          <w:iCs w:val="false"/>
+          <w:color w:val="000000"/>
+          <w:sz w:val="24"/>
+          <w:szCs w:val="24"/>
+        </w:rPr>
+        <w:t xml:space="preserve">a) 4 élèves ; b) 9 + 4 + 1 = 14 élèves ; d) 5 + 4 + 2 + 9 + 4 + 1 = 25 : c’est juste ; e) non : le diagramme s’arrête à 120 min, il ne donne aucune information au-delà.</w:t>
+      </w:r>
+    </w:p>
+    <w:p>
+      <w:pPr>
+        <w:spacing w:after="80"/>
+      </w:pPr>
+      <w:r>
+        <w:rPr>
+          <w:rFonts w:ascii="Times New Roman" w:cs="Times New Roman" w:eastAsia="Times New Roman" w:hAnsi="Times New Roman"/>
+          <w:b/>
+          <w:bCs/>
+          <w:i w:val="false"/>
+          <w:iCs w:val="false"/>
+          <w:color w:val="C2185B"/>
+          <w:sz w:val="24"/>
+          <w:szCs w:val="24"/>
+        </w:rPr>
+        <w:t xml:space="preserve">5. </w:t>
+      </w:r>
+      <w:r>
+        <w:rPr>
+          <w:rFonts w:ascii="Times New Roman" w:cs="Times New Roman" w:eastAsia="Times New Roman" w:hAnsi="Times New Roman"/>
+          <w:b w:val="false"/>
+          <w:bCs w:val="false"/>
+          <w:i w:val="false"/>
+          <w:iCs w:val="false"/>
+          <w:color w:val="000000"/>
+          <w:sz w:val="24"/>
+          <w:szCs w:val="24"/>
+        </w:rPr>
+        <w:t xml:space="preserve">a) samedi (60 bols) ; b) jeudi (20 bols) ; d) 30 + 25 + 35 + 20 + 40 + 60 + 55 = 265 bols ; e) 60 − 20 = 40 bols.</w:t>
+      </w:r>
+    </w:p>
+    <w:p>
+      <w:pPr>
+        <w:spacing w:after="80"/>
+      </w:pPr>
+      <w:r>
+        <w:rPr>
+          <w:rFonts w:ascii="Times New Roman" w:cs="Times New Roman" w:eastAsia="Times New Roman" w:hAnsi="Times New Roman"/>
+          <w:b/>
+          <w:bCs/>
+          <w:i w:val="false"/>
+          <w:iCs w:val="false"/>
+          <w:color w:val="C2185B"/>
+          <w:sz w:val="24"/>
+          <w:szCs w:val="24"/>
+        </w:rPr>
+        <w:t xml:space="preserve">6. </w:t>
+      </w:r>
+      <w:r>
+        <w:rPr>
+          <w:rFonts w:ascii="Times New Roman" w:cs="Times New Roman" w:eastAsia="Times New Roman" w:hAnsi="Times New Roman"/>
+          <w:b w:val="false"/>
+          <w:bCs w:val="false"/>
+          <w:i w:val="false"/>
+          <w:iCs w:val="false"/>
+          <w:color w:val="000000"/>
+          <w:sz w:val="24"/>
+          <w:szCs w:val="24"/>
+        </w:rPr>
+        <w:t xml:space="preserve">a) janvier (450 mm) ; b) juin et juillet ; d) 450 mm contre 200 mm : plus du double ; e) il pleut beaucoup pendant l’été (décembre à mars) et presque pas en hiver : saison des pluies et saison sèche bien marquées.</w:t>
+      </w:r>
+    </w:p>
+    <w:p>
+      <w:r>
+        <w:br w:type="page"/>
+      </w:r>
+    </w:p>
+    <w:p>
+      <w:pPr>
+        <w:spacing w:after="150" w:before="200"/>
+        <w:jc w:val="center"/>
+      </w:pPr>
+      <w:bookmarkStart w:name="u6_l5" w:id="6"/>
+      <w:r>
+        <w:rPr>
+          <w:rFonts w:ascii="Times New Roman" w:cs="Times New Roman" w:eastAsia="Times New Roman" w:hAnsi="Times New Roman"/>
+          <w:b/>
+          <w:bCs/>
+          <w:i w:val="false"/>
+          <w:iCs w:val="false"/>
+          <w:color w:val="C00000"/>
+          <w:sz w:val="32"/>
+          <w:szCs w:val="32"/>
+        </w:rPr>
+        <w:t xml:space="preserve">EXPÉRIENCES ALÉATOIRES ET TABLEAUX DE DÉNOMBREMENT</w:t>
+      </w:r>
+      <w:bookmarkEnd w:id="6"/>
+    </w:p>
+    <w:p>
+      <w:pPr>
+        <w:spacing w:after="120" w:before="100"/>
+        <w:jc w:val="center"/>
+      </w:pPr>
+      <w:r>
+        <w:drawing>
+          <wp:inline distT="0" distB="0" distL="0" distR="0">
+            <wp:extent cx="4476750" cy="2438400"/>
+            <wp:effectExtent t="0" r="0" b="0" l="0"/>
+            <wp:docPr id="9" name=""/>
+            <wp:cNvGraphicFramePr>
+              <a:graphicFrameLocks xmlns:a="http://schemas.openxmlformats.org/drawingml/2006/main" noChangeAspect="1"/>
+            </wp:cNvGraphicFramePr>
+            <a:graphic xmlns:a="http://schemas.openxmlformats.org/drawingml/2006/main">
+              <a:graphicData uri="http://schemas.openxmlformats.org/drawingml/2006/picture">
+                <pic:pic xmlns:pic="http://schemas.openxmlformats.org/drawingml/2006/picture">
+                  <pic:nvPicPr>
+                    <pic:cNvPr id="0" name="" descr=""/>
+                    <pic:cNvPicPr>
+                      <a:picLocks noChangeAspect="1" noChangeArrowheads="1"/>
+                    </pic:cNvPicPr>
+                  </pic:nvPicPr>
+                  <pic:blipFill>
+                    <a:blip r:embed="rId17" cstate="none"/>
+                    <a:srcRect/>
+                    <a:stretch>
+                      <a:fillRect/>
+                    </a:stretch>
+                  </pic:blipFill>
+                  <pic:spPr bwMode="auto">
+                    <a:xfrm>
+                      <a:off x="0" y="0"/>
+                      <a:ext cx="4476750" cy="2438400"/>
+                    </a:xfrm>
+                    <a:prstGeom prst="rect">
+                      <a:avLst/>
+                    </a:prstGeom>
+                  </pic:spPr>
+                </pic:pic>
+              </a:graphicData>
+            </a:graphic>
+          </wp:inline>
+        </w:drawing>
+      </w:r>
+    </w:p>
+    <w:p>
+      <w:pPr>
+        <w:spacing w:after="150" w:before="200"/>
+        <w:jc w:val="left"/>
+      </w:pPr>
+      <w:r>
+        <w:rPr>
+          <w:rFonts w:ascii="Times New Roman" w:cs="Times New Roman" w:eastAsia="Times New Roman" w:hAnsi="Times New Roman"/>
+          <w:b/>
+          <w:bCs/>
+          <w:i w:val="false"/>
+          <w:iCs w:val="false"/>
+          <w:color w:val="2E7D32"/>
+          <w:sz w:val="28"/>
+          <w:szCs w:val="28"/>
+        </w:rPr>
+        <w:t xml:space="preserve">Expériences aléatoires : dés, pièces, jetons</w:t>
+      </w:r>
+    </w:p>
+    <w:p>
+      <w:pPr>
+        <w:spacing w:after="110" w:line="300"/>
+        <w:jc w:val="both"/>
+      </w:pPr>
+      <w:r>
+        <w:rPr>
+          <w:rFonts w:ascii="Times New Roman" w:cs="Times New Roman" w:eastAsia="Times New Roman" w:hAnsi="Times New Roman"/>
+          <w:b w:val="false"/>
+          <w:bCs w:val="false"/>
+          <w:i w:val="false"/>
+          <w:iCs w:val="false"/>
+          <w:color w:val="000000"/>
+          <w:sz w:val="24"/>
+          <w:szCs w:val="24"/>
+        </w:rPr>
+        <w:t xml:space="preserve">Une expérience aléatoire est une expérience dont le résultat ne peut pas être prévu à l’avance, même si l’on connaît la liste de tous les résultats possibles. Le tableau de dénombrement enregistre, par des bâtons puis des effectifs, le nombre de fois où chaque résultat est apparu.</w:t>
+      </w:r>
+    </w:p>
+    <w:p>
+      <w:pPr>
+        <w:spacing w:after="110" w:line="300"/>
+        <w:jc w:val="both"/>
+      </w:pPr>
+      <w:r>
+        <w:rPr>
+          <w:rFonts w:ascii="Times New Roman" w:cs="Times New Roman" w:eastAsia="Times New Roman" w:hAnsi="Times New Roman"/>
+          <w:b w:val="false"/>
+          <w:bCs w:val="false"/>
+          <w:i/>
+          <w:iCs/>
+          <w:color w:val="1F4E79"/>
+          <w:sz w:val="24"/>
+          <w:szCs w:val="24"/>
+        </w:rPr>
+        <w:t xml:space="preserve">on ne sait jamais CE QUI va sortir, mais on sait tout ce qui PEUT sortir — et on compte fidèlement ce qui EST sorti.</w:t>
+      </w:r>
+    </w:p>
+    <w:p>
+      <w:pPr>
+        <w:spacing w:after="120" w:before="120"/>
+        <w:jc w:val="center"/>
+      </w:pPr>
+      <w:r>
+        <w:drawing>
+          <wp:inline distT="0" distB="0" distL="0" distR="0">
+            <wp:extent cx="4762500" cy="1819275"/>
+            <wp:effectExtent t="0" r="0" b="0" l="0"/>
+            <wp:docPr id="10" name=""/>
+            <wp:cNvGraphicFramePr>
+              <a:graphicFrameLocks xmlns:a="http://schemas.openxmlformats.org/drawingml/2006/main" noChangeAspect="1"/>
+            </wp:cNvGraphicFramePr>
+            <a:graphic xmlns:a="http://schemas.openxmlformats.org/drawingml/2006/main">
+              <a:graphicData uri="http://schemas.openxmlformats.org/drawingml/2006/picture">
+                <pic:pic xmlns:pic="http://schemas.openxmlformats.org/drawingml/2006/picture">
+                  <pic:nvPicPr>
+                    <pic:cNvPr id="0" name="" descr=""/>
+                    <pic:cNvPicPr>
+                      <a:picLocks noChangeAspect="1" noChangeArrowheads="1"/>
+                    </pic:cNvPicPr>
+                  </pic:nvPicPr>
+                  <pic:blipFill>
+                    <a:blip r:embed="rId18" cstate="none"/>
+                    <a:srcRect/>
+                    <a:stretch>
+                      <a:fillRect/>
+                    </a:stretch>
+                  </pic:blipFill>
+                  <pic:spPr bwMode="auto">
+                    <a:xfrm>
+                      <a:off x="0" y="0"/>
+                      <a:ext cx="4762500" cy="1819275"/>
+                    </a:xfrm>
+                    <a:prstGeom prst="rect">
+                      <a:avLst/>
+                    </a:prstGeom>
+                  </pic:spPr>
+                </pic:pic>
+              </a:graphicData>
+            </a:graphic>
+          </wp:inline>
+        </w:drawing>
+      </w:r>
+    </w:p>
+    <w:p>
+      <w:pPr>
+        <w:spacing w:after="130" w:before="100" w:line="300"/>
+        <w:jc w:val="both"/>
+      </w:pPr>
+      <w:r>
+        <w:rPr>
+          <w:rFonts w:ascii="Times New Roman" w:cs="Times New Roman" w:eastAsia="Times New Roman" w:hAnsi="Times New Roman"/>
+          <w:b w:val="false"/>
+          <w:bCs w:val="false"/>
+          <w:i/>
+          <w:iCs/>
+          <w:color w:val="000000"/>
+          <w:sz w:val="24"/>
+          <w:szCs w:val="24"/>
+          <w:u w:val="single"/>
+        </w:rPr>
+        <w:t xml:space="preserve">Exemple :</w:t>
+      </w:r>
+      <w:r>
+        <w:rPr>
+          <w:rFonts w:ascii="Times New Roman" w:cs="Times New Roman" w:eastAsia="Times New Roman" w:hAnsi="Times New Roman"/>
+          <w:b w:val="false"/>
+          <w:bCs w:val="false"/>
+          <w:i w:val="false"/>
+          <w:iCs w:val="false"/>
+          <w:color w:val="000000"/>
+          <w:sz w:val="24"/>
+          <w:szCs w:val="24"/>
+        </w:rPr>
+        <w:t xml:space="preserve"> Pièce lancée 20 fois : pile IIII IIII I (11), face IIII IIII (9) ; contrôle 11 + 9 = 20 ✓.</w:t>
+      </w:r>
+    </w:p>
+    <w:p>
+      <w:pPr>
+        <w:spacing w:after="55" w:line="300"/>
+        <w:ind w:left="260"/>
+        <w:jc w:val="both"/>
+      </w:pPr>
+      <w:r>
+        <w:rPr>
+          <w:rFonts w:ascii="Times New Roman" w:cs="Times New Roman" w:eastAsia="Times New Roman" w:hAnsi="Times New Roman"/>
+          <w:b w:val="false"/>
+          <w:bCs w:val="false"/>
+          <w:i w:val="false"/>
+          <w:iCs w:val="false"/>
+          <w:color w:val="000000"/>
+          <w:sz w:val="24"/>
+          <w:szCs w:val="24"/>
+        </w:rPr>
+        <w:t xml:space="preserve">1. Lister tous les résultats possibles : une ligne de tableau chacun.</w:t>
+      </w:r>
+    </w:p>
+    <w:p>
+      <w:pPr>
+        <w:spacing w:after="55" w:line="300"/>
+        <w:ind w:left="260"/>
+        <w:jc w:val="both"/>
+      </w:pPr>
+      <w:r>
+        <w:rPr>
+          <w:rFonts w:ascii="Times New Roman" w:cs="Times New Roman" w:eastAsia="Times New Roman" w:hAnsi="Times New Roman"/>
+          <w:b w:val="false"/>
+          <w:bCs w:val="false"/>
+          <w:i w:val="false"/>
+          <w:iCs w:val="false"/>
+          <w:color w:val="000000"/>
+          <w:sz w:val="24"/>
+          <w:szCs w:val="24"/>
+        </w:rPr>
+        <w:t xml:space="preserve">2. Réaliser les essais et marquer un bâton par résultat, au fur et à mesure.</w:t>
+      </w:r>
+    </w:p>
+    <w:p>
+      <w:pPr>
+        <w:spacing w:after="55" w:line="300"/>
+        <w:ind w:left="260"/>
+        <w:jc w:val="both"/>
+      </w:pPr>
+      <w:r>
+        <w:rPr>
+          <w:rFonts w:ascii="Times New Roman" w:cs="Times New Roman" w:eastAsia="Times New Roman" w:hAnsi="Times New Roman"/>
+          <w:b w:val="false"/>
+          <w:bCs w:val="false"/>
+          <w:i w:val="false"/>
+          <w:iCs w:val="false"/>
+          <w:color w:val="000000"/>
+          <w:sz w:val="24"/>
+          <w:szCs w:val="24"/>
+        </w:rPr>
+        <w:t xml:space="preserve">3. Écrire les effectifs et contrôler : leur somme = le nombre d’essais.</w:t>
+      </w:r>
+    </w:p>
+    <w:p>
+      <w:pPr>
+        <w:shd w:fill="E8F5E9" w:val="clear"/>
+        <w:spacing w:after="110" w:line="300"/>
+        <w:jc w:val="both"/>
+      </w:pPr>
+      <w:r>
+        <w:rPr>
+          <w:rFonts w:ascii="Times New Roman" w:cs="Times New Roman" w:eastAsia="Times New Roman" w:hAnsi="Times New Roman"/>
+          <w:b/>
+          <w:bCs/>
+          <w:i w:val="false"/>
+          <w:iCs w:val="false"/>
+          <w:color w:val="000000"/>
+          <w:sz w:val="24"/>
+          <w:szCs w:val="24"/>
+        </w:rPr>
+        <w:t xml:space="preserve">aléatoire = résultat imprévisible, possibles connus ; dé (6), pièce (2), jetons (couleurs) ; tableau de dénombrement + contrôle : somme des effectifs = nombre d’essais.</w:t>
+      </w:r>
+    </w:p>
+    <w:p>
+      <w:pPr>
+        <w:shd w:fill="E3F2FD" w:val="clear"/>
+        <w:spacing w:after="110" w:line="300"/>
+        <w:jc w:val="both"/>
+      </w:pPr>
+      <w:r>
+        <w:rPr>
+          <w:rFonts w:ascii="Times New Roman" w:cs="Times New Roman" w:eastAsia="Times New Roman" w:hAnsi="Times New Roman"/>
+          <w:b w:val="false"/>
+          <w:bCs w:val="false"/>
+          <w:i w:val="false"/>
+          <w:iCs w:val="false"/>
+          <w:color w:val="1F4E79"/>
+          <w:sz w:val="24"/>
+          <w:szCs w:val="24"/>
+        </w:rPr>
+        <w:t xml:space="preserve">Le savais-tu ? Les dés sont parmi les plus vieux jouets de l’humanité : on en a retrouvé en Mésopotamie et en Égypte vieux de 5 000 ans, souvent taillés dans des osselets de zébu ou de mouton — l’astragale.</w:t>
+      </w:r>
+    </w:p>
+    <w:p>
+      <w:pPr>
+        <w:shd w:fill="FFF8E1" w:val="clear"/>
+        <w:spacing w:after="110" w:line="300"/>
+        <w:jc w:val="both"/>
+      </w:pPr>
+      <w:r>
+        <w:rPr>
+          <w:rFonts w:ascii="Times New Roman" w:cs="Times New Roman" w:eastAsia="Times New Roman" w:hAnsi="Times New Roman"/>
+          <w:b w:val="false"/>
+          <w:bCs w:val="false"/>
+          <w:i w:val="false"/>
+          <w:iCs w:val="false"/>
+          <w:color w:val="000000"/>
+          <w:sz w:val="24"/>
+          <w:szCs w:val="24"/>
+        </w:rPr>
+        <w:t xml:space="preserve">Attention : Croire que le hasard a de la mémoire : « le 6 n’est pas sorti depuis longtemps, il va forcément sortir ». Faux ! Le dé ne se souvient de rien : chaque lancer repart de zéro.</w:t>
+      </w:r>
+    </w:p>
+    <w:p>
+      <w:pPr>
+        <w:spacing w:after="150" w:before="200"/>
+        <w:jc w:val="left"/>
+      </w:pPr>
+      <w:r>
+        <w:rPr>
+          <w:rFonts w:ascii="Times New Roman" w:cs="Times New Roman" w:eastAsia="Times New Roman" w:hAnsi="Times New Roman"/>
+          <w:b/>
+          <w:bCs/>
+          <w:i w:val="false"/>
+          <w:iCs w:val="false"/>
+          <w:color w:val="2E7D32"/>
+          <w:sz w:val="28"/>
+          <w:szCs w:val="28"/>
+        </w:rPr>
+        <w:t xml:space="preserve">EXERCICE</w:t>
+      </w:r>
+    </w:p>
+    <w:p>
+      <w:pPr>
+        <w:spacing w:after="110" w:line="300"/>
+        <w:jc w:val="both"/>
+      </w:pPr>
+      <w:r>
+        <w:rPr>
+          <w:rFonts w:ascii="Times New Roman" w:cs="Times New Roman" w:eastAsia="Times New Roman" w:hAnsi="Times New Roman"/>
+          <w:b w:val="false"/>
+          <w:bCs w:val="false"/>
+          <w:i w:val="false"/>
+          <w:iCs w:val="false"/>
+          <w:color w:val="000000"/>
+          <w:sz w:val="24"/>
+          <w:szCs w:val="24"/>
+        </w:rPr>
+        <w:t xml:space="preserve">1. Expérience aléatoire ou non ? Justifie. a) Lancer un dé. b) Mesurer la longueur de la table avec une règle. d) Tirer un jeton d’un sac sans regarder. e) Se demander si le soleil se lèvera demain.</w:t>
+      </w:r>
+    </w:p>
+    <w:p>
+      <w:pPr>
+        <w:spacing w:after="110" w:line="300"/>
+        <w:jc w:val="both"/>
+      </w:pPr>
+      <w:r>
+        <w:rPr>
+          <w:rFonts w:ascii="Times New Roman" w:cs="Times New Roman" w:eastAsia="Times New Roman" w:hAnsi="Times New Roman"/>
+          <w:b w:val="false"/>
+          <w:bCs w:val="false"/>
+          <w:i w:val="false"/>
+          <w:iCs w:val="false"/>
+          <w:color w:val="000000"/>
+          <w:sz w:val="24"/>
+          <w:szCs w:val="24"/>
+        </w:rPr>
+        <w:t xml:space="preserve">2. Dé lancé 30 fois : face 1 → 4 fois, face 2 → 6, face 3 → 5, face 4 → 7, face 5 → 3, face 6 → 5. a) Quelle face est la plus sortie ? b) La moins sortie ? d) Calcule la somme des effectifs. e) À quoi cette somme doit-elle être égale ?</w:t>
+      </w:r>
+    </w:p>
+    <w:p>
+      <w:pPr>
+        <w:spacing w:after="110" w:line="300"/>
+        <w:jc w:val="both"/>
+      </w:pPr>
+      <w:r>
+        <w:rPr>
+          <w:rFonts w:ascii="Times New Roman" w:cs="Times New Roman" w:eastAsia="Times New Roman" w:hAnsi="Times New Roman"/>
+          <w:b w:val="false"/>
+          <w:bCs w:val="false"/>
+          <w:i w:val="false"/>
+          <w:iCs w:val="false"/>
+          <w:color w:val="000000"/>
+          <w:sz w:val="24"/>
+          <w:szCs w:val="24"/>
+        </w:rPr>
+        <w:t xml:space="preserve">3. Pièce lancée 50 fois : pile 27 fois, face 23 fois. a) Quel est l’effectif de pile ? b) Celui de face ? d) Vérifie le contrôle du tableau. e) Les deux résultats sortent-ils à peu près aussi souvent ?</w:t>
+      </w:r>
+    </w:p>
+    <w:p>
+      <w:pPr>
+        <w:spacing w:after="110" w:line="300"/>
+        <w:jc w:val="both"/>
+      </w:pPr>
+      <w:r>
+        <w:rPr>
+          <w:rFonts w:ascii="Times New Roman" w:cs="Times New Roman" w:eastAsia="Times New Roman" w:hAnsi="Times New Roman"/>
+          <w:b w:val="false"/>
+          <w:bCs w:val="false"/>
+          <w:i w:val="false"/>
+          <w:iCs w:val="false"/>
+          <w:color w:val="000000"/>
+          <w:sz w:val="24"/>
+          <w:szCs w:val="24"/>
+        </w:rPr>
+        <w:t xml:space="preserve">4. On lance un dé à six faces. a) Cite toutes les issues possibles. b) Combien y en a-t-il ? d) L’issue « 7 » est-elle possible ? e) Toutes les issues ont-elles la même chance de sortir ?</w:t>
+      </w:r>
+    </w:p>
+    <w:p>
+      <w:pPr>
+        <w:spacing w:after="110" w:line="300"/>
+        <w:jc w:val="both"/>
+      </w:pPr>
+      <w:r>
+        <w:rPr>
+          <w:rFonts w:ascii="Times New Roman" w:cs="Times New Roman" w:eastAsia="Times New Roman" w:hAnsi="Times New Roman"/>
+          <w:b w:val="false"/>
+          <w:bCs w:val="false"/>
+          <w:i w:val="false"/>
+          <w:iCs w:val="false"/>
+          <w:color w:val="000000"/>
+          <w:sz w:val="24"/>
+          <w:szCs w:val="24"/>
+        </w:rPr>
+        <w:t xml:space="preserve">5. Un sac contient 3 boules rouges, 2 boules bleues et 1 boule jaune ; on tire une boule au hasard. a) Quelles sont les issues possibles ? b) Combien de boules en tout ? d) Quelle couleur a le plus de chances de sortir ? e) Dresse le tableau de dénombrement des boules.</w:t>
+      </w:r>
+    </w:p>
+    <w:p>
+      <w:pPr>
+        <w:spacing w:after="110" w:line="300"/>
+        <w:jc w:val="both"/>
+      </w:pPr>
+      <w:r>
+        <w:rPr>
+          <w:rFonts w:ascii="Times New Roman" w:cs="Times New Roman" w:eastAsia="Times New Roman" w:hAnsi="Times New Roman"/>
+          <w:b w:val="false"/>
+          <w:bCs w:val="false"/>
+          <w:i w:val="false"/>
+          <w:iCs w:val="false"/>
+          <w:color w:val="000000"/>
+          <w:sz w:val="24"/>
+          <w:szCs w:val="24"/>
+        </w:rPr>
+        <w:t xml:space="preserve">6. Défi CEPE — On lance deux pièces de monnaie en même temps (P pour pile, F pour face). a) Liste toutes les issues possibles. b) Combien y en a-t-il ? d) Combien d’issues donnent exactement un pile ? e) « Deux piles » et « deux faces » ont-ils la même chance ?</w:t>
+      </w:r>
+    </w:p>
+    <w:p>
+      <w:pPr>
+        <w:spacing w:after="150" w:before="200"/>
+        <w:jc w:val="left"/>
+      </w:pPr>
+      <w:r>
+        <w:rPr>
+          <w:rFonts w:ascii="Times New Roman" w:cs="Times New Roman" w:eastAsia="Times New Roman" w:hAnsi="Times New Roman"/>
+          <w:b/>
+          <w:bCs/>
+          <w:i w:val="false"/>
+          <w:iCs w:val="false"/>
+          <w:color w:val="2E7D32"/>
+          <w:sz w:val="28"/>
+          <w:szCs w:val="28"/>
+        </w:rPr>
+        <w:t xml:space="preserve">Correction</w:t>
+      </w:r>
+    </w:p>
+    <w:p>
+      <w:pPr>
+        <w:spacing w:after="80"/>
+      </w:pPr>
+      <w:r>
+        <w:rPr>
+          <w:rFonts w:ascii="Times New Roman" w:cs="Times New Roman" w:eastAsia="Times New Roman" w:hAnsi="Times New Roman"/>
+          <w:b/>
+          <w:bCs/>
+          <w:i w:val="false"/>
+          <w:iCs w:val="false"/>
+          <w:color w:val="C2185B"/>
+          <w:sz w:val="24"/>
+          <w:szCs w:val="24"/>
+        </w:rPr>
+        <w:t xml:space="preserve">1. </w:t>
+      </w:r>
+      <w:r>
+        <w:rPr>
+          <w:rFonts w:ascii="Times New Roman" w:cs="Times New Roman" w:eastAsia="Times New Roman" w:hAnsi="Times New Roman"/>
+          <w:b w:val="false"/>
+          <w:bCs w:val="false"/>
+          <w:i w:val="false"/>
+          <w:iCs w:val="false"/>
+          <w:color w:val="000000"/>
+          <w:sz w:val="24"/>
+          <w:szCs w:val="24"/>
+        </w:rPr>
+        <w:t xml:space="preserve">a) oui : résultat imprévisible parmi six possibles ; b) non : le résultat se mesure, il n’y a pas de hasard ; d) oui : couleur imprévisible parmi les couleurs du sac ; e) non : le résultat est certain.</w:t>
+      </w:r>
+    </w:p>
+    <w:p>
+      <w:pPr>
+        <w:spacing w:after="80"/>
+      </w:pPr>
+      <w:r>
+        <w:rPr>
+          <w:rFonts w:ascii="Times New Roman" w:cs="Times New Roman" w:eastAsia="Times New Roman" w:hAnsi="Times New Roman"/>
+          <w:b/>
+          <w:bCs/>
+          <w:i w:val="false"/>
+          <w:iCs w:val="false"/>
+          <w:color w:val="C2185B"/>
+          <w:sz w:val="24"/>
+          <w:szCs w:val="24"/>
+        </w:rPr>
+        <w:t xml:space="preserve">2. </w:t>
+      </w:r>
+      <w:r>
+        <w:rPr>
+          <w:rFonts w:ascii="Times New Roman" w:cs="Times New Roman" w:eastAsia="Times New Roman" w:hAnsi="Times New Roman"/>
+          <w:b w:val="false"/>
+          <w:bCs w:val="false"/>
+          <w:i w:val="false"/>
+          <w:iCs w:val="false"/>
+          <w:color w:val="000000"/>
+          <w:sz w:val="24"/>
+          <w:szCs w:val="24"/>
+        </w:rPr>
+        <w:t xml:space="preserve">a) la face 4 (7 fois) ; b) la face 5 (3 fois) ; d) 4 + 6 + 5 + 7 + 3 + 5 = 30 ; e) au nombre de lancers : 30 ✓.</w:t>
+      </w:r>
+    </w:p>
+    <w:p>
+      <w:pPr>
+        <w:spacing w:after="80"/>
+      </w:pPr>
+      <w:r>
+        <w:rPr>
+          <w:rFonts w:ascii="Times New Roman" w:cs="Times New Roman" w:eastAsia="Times New Roman" w:hAnsi="Times New Roman"/>
+          <w:b/>
+          <w:bCs/>
+          <w:i w:val="false"/>
+          <w:iCs w:val="false"/>
+          <w:color w:val="C2185B"/>
+          <w:sz w:val="24"/>
+          <w:szCs w:val="24"/>
+        </w:rPr>
+        <w:t xml:space="preserve">3. </w:t>
+      </w:r>
+      <w:r>
+        <w:rPr>
+          <w:rFonts w:ascii="Times New Roman" w:cs="Times New Roman" w:eastAsia="Times New Roman" w:hAnsi="Times New Roman"/>
+          <w:b w:val="false"/>
+          <w:bCs w:val="false"/>
+          <w:i w:val="false"/>
+          <w:iCs w:val="false"/>
+          <w:color w:val="000000"/>
+          <w:sz w:val="24"/>
+          <w:szCs w:val="24"/>
+        </w:rPr>
+        <w:t xml:space="preserve">a) 27 ; b) 23 ; d) 27 + 23 = 50 ✓ ; e) oui : presque moitié-moitié, 27 contre 23.</w:t>
+      </w:r>
+    </w:p>
+    <w:p>
+      <w:pPr>
+        <w:spacing w:after="80"/>
+      </w:pPr>
+      <w:r>
+        <w:rPr>
+          <w:rFonts w:ascii="Times New Roman" w:cs="Times New Roman" w:eastAsia="Times New Roman" w:hAnsi="Times New Roman"/>
+          <w:b/>
+          <w:bCs/>
+          <w:i w:val="false"/>
+          <w:iCs w:val="false"/>
+          <w:color w:val="C2185B"/>
+          <w:sz w:val="24"/>
+          <w:szCs w:val="24"/>
+        </w:rPr>
+        <w:t xml:space="preserve">4. </w:t>
+      </w:r>
+      <w:r>
+        <w:rPr>
+          <w:rFonts w:ascii="Times New Roman" w:cs="Times New Roman" w:eastAsia="Times New Roman" w:hAnsi="Times New Roman"/>
+          <w:b w:val="false"/>
+          <w:bCs w:val="false"/>
+          <w:i w:val="false"/>
+          <w:iCs w:val="false"/>
+          <w:color w:val="000000"/>
+          <w:sz w:val="24"/>
+          <w:szCs w:val="24"/>
+        </w:rPr>
+        <w:t xml:space="preserve">a) 1, 2, 3, 4, 5 et 6 ; b) 6 issues ; d) non : elle n’existe pas sur le dé ; e) oui, si le dé est équilibré : c’est l’équiprobabilité.</w:t>
+      </w:r>
+    </w:p>
+    <w:p>
+      <w:pPr>
+        <w:spacing w:after="80"/>
+      </w:pPr>
+      <w:r>
+        <w:rPr>
+          <w:rFonts w:ascii="Times New Roman" w:cs="Times New Roman" w:eastAsia="Times New Roman" w:hAnsi="Times New Roman"/>
+          <w:b/>
+          <w:bCs/>
+          <w:i w:val="false"/>
+          <w:iCs w:val="false"/>
+          <w:color w:val="C2185B"/>
+          <w:sz w:val="24"/>
+          <w:szCs w:val="24"/>
+        </w:rPr>
+        <w:t xml:space="preserve">5. </w:t>
+      </w:r>
+      <w:r>
+        <w:rPr>
+          <w:rFonts w:ascii="Times New Roman" w:cs="Times New Roman" w:eastAsia="Times New Roman" w:hAnsi="Times New Roman"/>
+          <w:b w:val="false"/>
+          <w:bCs w:val="false"/>
+          <w:i w:val="false"/>
+          <w:iCs w:val="false"/>
+          <w:color w:val="000000"/>
+          <w:sz w:val="24"/>
+          <w:szCs w:val="24"/>
+        </w:rPr>
+        <w:t xml:space="preserve">a) rouge, bleu, jaune ; b) 3 + 2 + 1 = 6 boules ; d) le rouge : 3 boules sur 6 ; e) tableau : rouge 3 ; bleu 2 ; jaune 1.</w:t>
+      </w:r>
+    </w:p>
+    <w:p>
+      <w:pPr>
+        <w:spacing w:after="80"/>
+      </w:pPr>
+      <w:r>
+        <w:rPr>
+          <w:rFonts w:ascii="Times New Roman" w:cs="Times New Roman" w:eastAsia="Times New Roman" w:hAnsi="Times New Roman"/>
+          <w:b/>
+          <w:bCs/>
+          <w:i w:val="false"/>
+          <w:iCs w:val="false"/>
+          <w:color w:val="C2185B"/>
+          <w:sz w:val="24"/>
+          <w:szCs w:val="24"/>
+        </w:rPr>
+        <w:t xml:space="preserve">6. </w:t>
+      </w:r>
+      <w:r>
+        <w:rPr>
+          <w:rFonts w:ascii="Times New Roman" w:cs="Times New Roman" w:eastAsia="Times New Roman" w:hAnsi="Times New Roman"/>
+          <w:b w:val="false"/>
+          <w:bCs w:val="false"/>
+          <w:i w:val="false"/>
+          <w:iCs w:val="false"/>
+          <w:color w:val="000000"/>
+          <w:sz w:val="24"/>
+          <w:szCs w:val="24"/>
+        </w:rPr>
+        <w:t xml:space="preserve">a) PP, PF, FP, FF ; b) 4 issues ; d) 2 issues : PF et FP ; e) oui : une chance sur quatre chacune.</w:t>
+      </w:r>
+    </w:p>
+    <w:p>
+      <w:r>
+        <w:br w:type="page"/>
+      </w:r>
+    </w:p>
+    <w:p>
+      <w:pPr>
+        <w:spacing w:after="150" w:before="200"/>
+        <w:jc w:val="center"/>
+      </w:pPr>
+      <w:bookmarkStart w:name="u6_l6" w:id="7"/>
+      <w:r>
+        <w:rPr>
+          <w:rFonts w:ascii="Times New Roman" w:cs="Times New Roman" w:eastAsia="Times New Roman" w:hAnsi="Times New Roman"/>
+          <w:b/>
+          <w:bCs/>
+          <w:i w:val="false"/>
+          <w:iCs w:val="false"/>
+          <w:color w:val="C00000"/>
+          <w:sz w:val="32"/>
+          <w:szCs w:val="32"/>
+        </w:rPr>
+        <w:t xml:space="preserve">LA PROBABILITÉ EXPÉRIMENTALE</w:t>
+      </w:r>
+      <w:bookmarkEnd w:id="7"/>
+    </w:p>
+    <w:p>
+      <w:pPr>
+        <w:spacing w:after="120" w:before="100"/>
+        <w:jc w:val="center"/>
+      </w:pPr>
+      <w:r>
+        <w:drawing>
+          <wp:inline distT="0" distB="0" distL="0" distR="0">
+            <wp:extent cx="4476750" cy="2438400"/>
+            <wp:effectExtent t="0" r="0" b="0" l="0"/>
+            <wp:docPr id="11" name=""/>
+            <wp:cNvGraphicFramePr>
+              <a:graphicFrameLocks xmlns:a="http://schemas.openxmlformats.org/drawingml/2006/main" noChangeAspect="1"/>
+            </wp:cNvGraphicFramePr>
+            <a:graphic xmlns:a="http://schemas.openxmlformats.org/drawingml/2006/main">
+              <a:graphicData uri="http://schemas.openxmlformats.org/drawingml/2006/picture">
+                <pic:pic xmlns:pic="http://schemas.openxmlformats.org/drawingml/2006/picture">
+                  <pic:nvPicPr>
+                    <pic:cNvPr id="0" name="" descr=""/>
+                    <pic:cNvPicPr>
+                      <a:picLocks noChangeAspect="1" noChangeArrowheads="1"/>
+                    </pic:cNvPicPr>
+                  </pic:nvPicPr>
+                  <pic:blipFill>
+                    <a:blip r:embed="rId19" cstate="none"/>
+                    <a:srcRect/>
+                    <a:stretch>
+                      <a:fillRect/>
+                    </a:stretch>
+                  </pic:blipFill>
+                  <pic:spPr bwMode="auto">
+                    <a:xfrm>
+                      <a:off x="0" y="0"/>
+                      <a:ext cx="4476750" cy="2438400"/>
+                    </a:xfrm>
+                    <a:prstGeom prst="rect">
+                      <a:avLst/>
+                    </a:prstGeom>
+                  </pic:spPr>
+                </pic:pic>
+              </a:graphicData>
+            </a:graphic>
+          </wp:inline>
+        </w:drawing>
+      </w:r>
+    </w:p>
+    <w:p>
+      <w:pPr>
+        <w:spacing w:after="150" w:before="200"/>
+        <w:jc w:val="left"/>
+      </w:pPr>
+      <w:r>
+        <w:rPr>
+          <w:rFonts w:ascii="Times New Roman" w:cs="Times New Roman" w:eastAsia="Times New Roman" w:hAnsi="Times New Roman"/>
+          <w:b/>
+          <w:bCs/>
+          <w:i w:val="false"/>
+          <w:iCs w:val="false"/>
+          <w:color w:val="2E7D32"/>
+          <w:sz w:val="28"/>
+          <w:szCs w:val="28"/>
+        </w:rPr>
+        <w:t xml:space="preserve">Fréquences et probabilité expérimentale</w:t>
+      </w:r>
+    </w:p>
+    <w:p>
+      <w:pPr>
+        <w:spacing w:after="110" w:line="300"/>
+        <w:jc w:val="both"/>
+      </w:pPr>
+      <w:r>
+        <w:rPr>
+          <w:rFonts w:ascii="Times New Roman" w:cs="Times New Roman" w:eastAsia="Times New Roman" w:hAnsi="Times New Roman"/>
+          <w:b w:val="false"/>
+          <w:bCs w:val="false"/>
+          <w:i w:val="false"/>
+          <w:iCs w:val="false"/>
+          <w:color w:val="000000"/>
+          <w:sz w:val="24"/>
+          <w:szCs w:val="24"/>
+        </w:rPr>
+        <w:t xml:space="preserve">La fréquence d’un résultat est le quotient de son effectif par le nombre total d’essais. La probabilité expérimentale d’un résultat est sa fréquence observée sur un grand nombre d’essais : elle estime la chance que ce résultat se produise.</w:t>
+      </w:r>
+    </w:p>
+    <w:p>
+      <w:pPr>
+        <w:spacing w:after="110" w:line="300"/>
+        <w:jc w:val="both"/>
+      </w:pPr>
+      <w:r>
+        <w:rPr>
+          <w:rFonts w:ascii="Times New Roman" w:cs="Times New Roman" w:eastAsia="Times New Roman" w:hAnsi="Times New Roman"/>
+          <w:b w:val="false"/>
+          <w:bCs w:val="false"/>
+          <w:i/>
+          <w:iCs/>
+          <w:color w:val="1F4E79"/>
+          <w:sz w:val="24"/>
+          <w:szCs w:val="24"/>
+        </w:rPr>
+        <w:t xml:space="preserve">la fréquence répond à « quelle part des essais a donné ce résultat ? » — et cette part, mesurée longtemps, devient la meilleure prédiction du futur.</w:t>
+      </w:r>
+    </w:p>
+    <w:p>
+      <w:pPr>
+        <w:spacing w:after="120" w:before="120"/>
+        <w:jc w:val="center"/>
+      </w:pPr>
+      <w:r>
+        <w:drawing>
+          <wp:inline distT="0" distB="0" distL="0" distR="0">
+            <wp:extent cx="4762500" cy="2476500"/>
+            <wp:effectExtent t="0" r="0" b="0" l="0"/>
+            <wp:docPr id="12" name=""/>
+            <wp:cNvGraphicFramePr>
+              <a:graphicFrameLocks xmlns:a="http://schemas.openxmlformats.org/drawingml/2006/main" noChangeAspect="1"/>
+            </wp:cNvGraphicFramePr>
+            <a:graphic xmlns:a="http://schemas.openxmlformats.org/drawingml/2006/main">
+              <a:graphicData uri="http://schemas.openxmlformats.org/drawingml/2006/picture">
+                <pic:pic xmlns:pic="http://schemas.openxmlformats.org/drawingml/2006/picture">
+                  <pic:nvPicPr>
+                    <pic:cNvPr id="0" name="" descr=""/>
+                    <pic:cNvPicPr>
+                      <a:picLocks noChangeAspect="1" noChangeArrowheads="1"/>
+                    </pic:cNvPicPr>
+                  </pic:nvPicPr>
+                  <pic:blipFill>
+                    <a:blip r:embed="rId20" cstate="none"/>
                     <a:srcRect/>
                     <a:stretch>
                       <a:fillRect/>

</xml_diff>